<commit_message>
Change summary and dates
</commit_message>
<xml_diff>
--- a/assets/MalihehMoradi_resume.docx
+++ b/assets/MalihehMoradi_resume.docx
@@ -10,15 +10,614 @@
         <mc:AlternateContent>
           <mc:Choice Requires="wps">
             <w:drawing>
+              <wp:anchor distT="0" distB="0" distL="114300" distR="114300" simplePos="0" relativeHeight="251711488" behindDoc="0" locked="0" layoutInCell="1" allowOverlap="1" wp14:anchorId="2B9662D6" wp14:editId="435A885B">
+                <wp:simplePos x="0" y="0"/>
+                <wp:positionH relativeFrom="column">
+                  <wp:posOffset>-437663</wp:posOffset>
+                </wp:positionH>
+                <wp:positionV relativeFrom="paragraph">
+                  <wp:posOffset>6189785</wp:posOffset>
+                </wp:positionV>
+                <wp:extent cx="4155929" cy="502920"/>
+                <wp:effectExtent l="0" t="0" r="0" b="0"/>
+                <wp:wrapNone/>
+                <wp:docPr id="733860881" name="Text Box 2"/>
+                <wp:cNvGraphicFramePr>
+                  <a:graphicFrameLocks xmlns:a="http://schemas.openxmlformats.org/drawingml/2006/main"/>
+                </wp:cNvGraphicFramePr>
+                <a:graphic xmlns:a="http://schemas.openxmlformats.org/drawingml/2006/main">
+                  <a:graphicData uri="http://schemas.microsoft.com/office/word/2010/wordprocessingShape">
+                    <wps:wsp>
+                      <wps:cNvSpPr txBox="1">
+                        <a:spLocks noChangeArrowheads="1"/>
+                      </wps:cNvSpPr>
+                      <wps:spPr bwMode="auto">
+                        <a:xfrm>
+                          <a:off x="0" y="0"/>
+                          <a:ext cx="4155929" cy="502920"/>
+                        </a:xfrm>
+                        <a:prstGeom prst="rect">
+                          <a:avLst/>
+                        </a:prstGeom>
+                        <a:noFill/>
+                        <a:ln w="9525">
+                          <a:noFill/>
+                          <a:miter lim="800000"/>
+                          <a:headEnd/>
+                          <a:tailEnd/>
+                        </a:ln>
+                      </wps:spPr>
+                      <wps:txbx>
+                        <w:txbxContent>
+                          <w:p>
+                            <w:pPr>
+                              <w:pStyle w:val="BasicParagraph"/>
+                              <w:rPr>
+                                <w:rFonts w:ascii="Roboto Medium" w:hAnsi="Roboto Medium" w:cs="Roboto Medium"/>
+                                <w:i/>
+                                <w:iCs/>
+                                <w:sz w:val="16"/>
+                                <w:szCs w:val="16"/>
+                              </w:rPr>
+                            </w:pPr>
+                            <w:r>
+                              <w:rPr>
+                                <w:rFonts w:ascii="Roboto" w:hAnsi="Roboto" w:cs="Roboto"/>
+                                <w:b/>
+                                <w:bCs/>
+                                <w:spacing w:val="12"/>
+                                <w:sz w:val="16"/>
+                                <w:szCs w:val="16"/>
+                              </w:rPr>
+                              <w:t xml:space="preserve">MIDLEVEL ANDROID DEVELOPER | </w:t>
+                            </w:r>
+                            <w:r>
+                              <w:rPr>
+                                <w:rStyle w:val="Years"/>
+                                <w:spacing w:val="12"/>
+                              </w:rPr>
+                              <w:t>APR 20</w:t>
+                            </w:r>
+                            <w:r>
+                              <w:rPr>
+                                <w:rStyle w:val="Years"/>
+                                <w:spacing w:val="12"/>
+                              </w:rPr>
+                              <w:t>17</w:t>
+                            </w:r>
+                            <w:r>
+                              <w:rPr>
+                                <w:rStyle w:val="Years"/>
+                                <w:spacing w:val="12"/>
+                              </w:rPr>
+                              <w:t xml:space="preserve"> </w:t>
+                            </w:r>
+                            <w:r>
+                              <w:rPr>
+                                <w:rStyle w:val="Years"/>
+                                <w:spacing w:val="12"/>
+                              </w:rPr>
+                              <w:t>–</w:t>
+                            </w:r>
+                            <w:r>
+                              <w:rPr>
+                                <w:rStyle w:val="Years"/>
+                                <w:spacing w:val="12"/>
+                              </w:rPr>
+                              <w:t xml:space="preserve"> </w:t>
+                            </w:r>
+                            <w:r>
+                              <w:rPr>
+                                <w:rStyle w:val="Years"/>
+                                <w:spacing w:val="12"/>
+                              </w:rPr>
+                              <w:t>JULY 2018</w:t>
+                            </w:r>
+                            <w:r>
+                              <w:rPr>
+                                <w:rStyle w:val="Years"/>
+                                <w:spacing w:val="12"/>
+                              </w:rPr>
+                              <w:t xml:space="preserve">   </w:t>
+                            </w:r>
+                            <w:r>
+                              <w:rPr>
+                                <w:rStyle w:val="Years"/>
+                                <w:i/>
+                                <w:iCs/>
+                                <w:color w:val="AEAAAA" w:themeColor="background2" w:themeShade="BF"/>
+                                <w:spacing w:val="12"/>
+                              </w:rPr>
+                              <w:t>1yr</w:t>
+                            </w:r>
+                            <w:r>
+                              <w:rPr>
+                                <w:rStyle w:val="Years"/>
+                                <w:i/>
+                                <w:iCs/>
+                                <w:color w:val="AEAAAA" w:themeColor="background2" w:themeShade="BF"/>
+                                <w:spacing w:val="12"/>
+                              </w:rPr>
+                              <w:t xml:space="preserve"> </w:t>
+                            </w:r>
+                            <w:r>
+                              <w:rPr>
+                                <w:rStyle w:val="Years"/>
+                                <w:i/>
+                                <w:iCs/>
+                                <w:color w:val="AEAAAA" w:themeColor="background2" w:themeShade="BF"/>
+                                <w:spacing w:val="12"/>
+                              </w:rPr>
+                              <w:t>4</w:t>
+                            </w:r>
+                            <w:r>
+                              <w:rPr>
+                                <w:rStyle w:val="Years"/>
+                                <w:i/>
+                                <w:iCs/>
+                                <w:color w:val="AEAAAA" w:themeColor="background2" w:themeShade="BF"/>
+                                <w:spacing w:val="12"/>
+                              </w:rPr>
+                              <w:t>mos</w:t>
+                            </w:r>
+                            <w:r>
+                              <w:rPr>
+                                <w:rFonts w:ascii="Roboto Medium" w:hAnsi="Roboto Medium" w:cs="Roboto Medium"/>
+                                <w:spacing w:val="16"/>
+                                <w:sz w:val="16"/>
+                                <w:szCs w:val="16"/>
+                              </w:rPr>
+                              <w:br/>
+                            </w:r>
+                            <w:r>
+                              <w:rPr>
+                                <w:rFonts w:ascii="Roboto Medium" w:hAnsi="Roboto Medium" w:cs="Roboto Medium"/>
+                                <w:i/>
+                                <w:iCs/>
+                                <w:sz w:val="16"/>
+                                <w:szCs w:val="16"/>
+                              </w:rPr>
+                              <w:t>Aria Smart</w:t>
+                            </w:r>
+                            <w:r>
+                              <w:rPr>
+                                <w:rFonts w:ascii="Roboto Medium" w:hAnsi="Roboto Medium" w:cs="Roboto Medium"/>
+                                <w:i/>
+                                <w:iCs/>
+                                <w:sz w:val="16"/>
+                                <w:szCs w:val="16"/>
+                              </w:rPr>
+                              <w:t xml:space="preserve"> Company, Shiraz, Iran</w:t>
+                            </w:r>
+                          </w:p>
+                          <w:p>
+                            <w:pPr>
+                              <w:pStyle w:val="NormalWeb"/>
+                              <w:kinsoku w:val="0"/>
+                              <w:overflowPunct w:val="0"/>
+                              <w:spacing w:before="0" w:beforeAutospacing="0" w:after="0" w:afterAutospacing="0"/>
+                              <w:textAlignment w:val="baseline"/>
+                              <w:rPr>
+                                <w:rFonts w:ascii="Inter" w:hAnsi="Inter" w:cs="Arial"/>
+                                <w:color w:val="767171"/>
+                                <w:kern w:val="24"/>
+                                <w:sz w:val="18"/>
+                                <w:szCs w:val="18"/>
+                                <w:lang w:val="fr-FR"/>
+                              </w:rPr>
+                            </w:pPr>
+                            <w:r>
+                              <w:rPr>
+                                <w:rFonts w:ascii="Inter" w:hAnsi="Inter" w:cs="Arial"/>
+                                <w:color w:val="767171"/>
+                                <w:kern w:val="24"/>
+                                <w:sz w:val="18"/>
+                                <w:szCs w:val="18"/>
+                                <w:lang w:val="fr-FR"/>
+                              </w:rPr>
+                              <w:t>Skills</w:t>
+                            </w:r>
+                            <w:r>
+                              <w:rPr>
+                                <w:rFonts w:ascii="Inter" w:hAnsi="Inter" w:cs="Arial" w:hint="cs"/>
+                                <w:color w:val="767171"/>
+                                <w:kern w:val="24"/>
+                                <w:sz w:val="18"/>
+                                <w:szCs w:val="18"/>
+                                <w:rtl/>
+                                <w:lang w:val="fr-FR"/>
+                              </w:rPr>
+                              <w:t xml:space="preserve"> </w:t>
+                            </w:r>
+                            <w:r>
+                              <w:rPr>
+                                <w:rFonts w:ascii="Inter" w:hAnsi="Inter" w:cs="Arial"/>
+                                <w:color w:val="767171"/>
+                                <w:kern w:val="24"/>
+                                <w:sz w:val="18"/>
+                                <w:szCs w:val="18"/>
+                                <w:lang w:val="fr-FR"/>
+                              </w:rPr>
+                              <w:t xml:space="preserve">: </w:t>
+                            </w:r>
+                            <w:r>
+                              <w:rPr>
+                                <w:rFonts w:ascii="Inter" w:hAnsi="Inter" w:cs="Arial"/>
+                                <w:color w:val="767171"/>
+                                <w:kern w:val="24"/>
+                                <w:sz w:val="18"/>
+                                <w:szCs w:val="18"/>
+                                <w:lang w:val="fr-FR"/>
+                              </w:rPr>
+                              <w:t>Git, Firebase, QR Scanner</w:t>
+                            </w:r>
+                          </w:p>
+                          <w:p>
+                            <w:pPr>
+                              <w:pStyle w:val="NormalWeb"/>
+                              <w:kinsoku w:val="0"/>
+                              <w:overflowPunct w:val="0"/>
+                              <w:spacing w:before="0" w:beforeAutospacing="0" w:after="0" w:afterAutospacing="0"/>
+                              <w:textAlignment w:val="baseline"/>
+                              <w:rPr>
+                                <w:rFonts w:ascii="Inter" w:hAnsi="Inter" w:cs="Arial"/>
+                                <w:color w:val="767171"/>
+                                <w:kern w:val="24"/>
+                                <w:sz w:val="18"/>
+                                <w:szCs w:val="18"/>
+                                <w:lang w:val="fr-FR"/>
+                              </w:rPr>
+                            </w:pPr>
+                            <w:r>
+                              <w:rPr>
+                                <w:rFonts w:ascii="Inter" w:hAnsi="Inter" w:cs="Arial"/>
+                                <w:color w:val="767171"/>
+                                <w:kern w:val="24"/>
+                                <w:sz w:val="18"/>
+                                <w:szCs w:val="18"/>
+                                <w:lang w:val="fr-FR"/>
+                              </w:rPr>
+                              <w:t>Architecture</w:t>
+                            </w:r>
+                          </w:p>
+                          <w:p>
+                            <w:pPr>
+                              <w:pStyle w:val="NormalWeb"/>
+                              <w:kinsoku w:val="0"/>
+                              <w:overflowPunct w:val="0"/>
+                              <w:spacing w:before="0" w:beforeAutospacing="0" w:after="0" w:afterAutospacing="0"/>
+                              <w:textAlignment w:val="baseline"/>
+                              <w:rPr>
+                                <w:rFonts w:ascii="Inter" w:hAnsi="Inter" w:cs="Arial"/>
+                                <w:color w:val="767171"/>
+                                <w:kern w:val="24"/>
+                                <w:sz w:val="18"/>
+                                <w:szCs w:val="18"/>
+                                <w:lang w:val="fr-FR"/>
+                              </w:rPr>
+                            </w:pPr>
+                          </w:p>
+                          <w:p>
+                            <w:pPr>
+                              <w:pStyle w:val="BasicParagraph"/>
+                              <w:rPr>
+                                <w:rFonts w:ascii="Roboto Medium" w:hAnsi="Roboto Medium" w:cs="Roboto Medium"/>
+                                <w:i/>
+                                <w:iCs/>
+                                <w:sz w:val="16"/>
+                                <w:szCs w:val="16"/>
+                              </w:rPr>
+                            </w:pPr>
+                          </w:p>
+                        </w:txbxContent>
+                      </wps:txbx>
+                      <wps:bodyPr rot="0" vert="horz" wrap="square" lIns="91440" tIns="45720" rIns="91440" bIns="45720" anchor="t" anchorCtr="0">
+                        <a:noAutofit/>
+                      </wps:bodyPr>
+                    </wps:wsp>
+                  </a:graphicData>
+                </a:graphic>
+                <wp14:sizeRelH relativeFrom="margin">
+                  <wp14:pctWidth>0</wp14:pctWidth>
+                </wp14:sizeRelH>
+                <wp14:sizeRelV relativeFrom="margin">
+                  <wp14:pctHeight>0</wp14:pctHeight>
+                </wp14:sizeRelV>
+              </wp:anchor>
+            </w:drawing>
+          </mc:Choice>
+          <mc:Fallback>
+            <w:pict>
+              <v:shapetype w14:anchorId="2B9662D6" id="_x0000_t202" coordsize="21600,21600" o:spt="202" path="m,l,21600r21600,l21600,xe">
+                <v:stroke joinstyle="miter"/>
+                <v:path gradientshapeok="t" o:connecttype="rect"/>
+              </v:shapetype>
+              <v:shape id="Text Box 2" o:spid="_x0000_s1026" type="#_x0000_t202" style="position:absolute;margin-left:-34.45pt;margin-top:487.4pt;width:327.25pt;height:39.6pt;z-index:251711488;visibility:visible;mso-wrap-style:square;mso-width-percent:0;mso-height-percent:0;mso-wrap-distance-left:9pt;mso-wrap-distance-top:0;mso-wrap-distance-right:9pt;mso-wrap-distance-bottom:0;mso-position-horizontal:absolute;mso-position-horizontal-relative:text;mso-position-vertical:absolute;mso-position-vertical-relative:text;mso-width-percent:0;mso-height-percent:0;mso-width-relative:margin;mso-height-relative:margin;v-text-anchor:top" o:gfxdata="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" filled="f" stroked="f">
+                <v:textbox>
+                  <w:txbxContent>
+                    <w:p>
+                      <w:pPr>
+                        <w:pStyle w:val="BasicParagraph"/>
+                        <w:rPr>
+                          <w:rFonts w:ascii="Roboto Medium" w:hAnsi="Roboto Medium" w:cs="Roboto Medium"/>
+                          <w:i/>
+                          <w:iCs/>
+                          <w:sz w:val="16"/>
+                          <w:szCs w:val="16"/>
+                        </w:rPr>
+                      </w:pPr>
+                      <w:r>
+                        <w:rPr>
+                          <w:rFonts w:ascii="Roboto" w:hAnsi="Roboto" w:cs="Roboto"/>
+                          <w:b/>
+                          <w:bCs/>
+                          <w:spacing w:val="12"/>
+                          <w:sz w:val="16"/>
+                          <w:szCs w:val="16"/>
+                        </w:rPr>
+                        <w:t xml:space="preserve">MIDLEVEL ANDROID DEVELOPER | </w:t>
+                      </w:r>
+                      <w:r>
+                        <w:rPr>
+                          <w:rStyle w:val="Years"/>
+                          <w:spacing w:val="12"/>
+                        </w:rPr>
+                        <w:t>APR 20</w:t>
+                      </w:r>
+                      <w:r>
+                        <w:rPr>
+                          <w:rStyle w:val="Years"/>
+                          <w:spacing w:val="12"/>
+                        </w:rPr>
+                        <w:t>17</w:t>
+                      </w:r>
+                      <w:r>
+                        <w:rPr>
+                          <w:rStyle w:val="Years"/>
+                          <w:spacing w:val="12"/>
+                        </w:rPr>
+                        <w:t xml:space="preserve"> </w:t>
+                      </w:r>
+                      <w:r>
+                        <w:rPr>
+                          <w:rStyle w:val="Years"/>
+                          <w:spacing w:val="12"/>
+                        </w:rPr>
+                        <w:t>–</w:t>
+                      </w:r>
+                      <w:r>
+                        <w:rPr>
+                          <w:rStyle w:val="Years"/>
+                          <w:spacing w:val="12"/>
+                        </w:rPr>
+                        <w:t xml:space="preserve"> </w:t>
+                      </w:r>
+                      <w:r>
+                        <w:rPr>
+                          <w:rStyle w:val="Years"/>
+                          <w:spacing w:val="12"/>
+                        </w:rPr>
+                        <w:t>JULY 2018</w:t>
+                      </w:r>
+                      <w:r>
+                        <w:rPr>
+                          <w:rStyle w:val="Years"/>
+                          <w:spacing w:val="12"/>
+                        </w:rPr>
+                        <w:t xml:space="preserve">   </w:t>
+                      </w:r>
+                      <w:r>
+                        <w:rPr>
+                          <w:rStyle w:val="Years"/>
+                          <w:i/>
+                          <w:iCs/>
+                          <w:color w:val="AEAAAA" w:themeColor="background2" w:themeShade="BF"/>
+                          <w:spacing w:val="12"/>
+                        </w:rPr>
+                        <w:t>1yr</w:t>
+                      </w:r>
+                      <w:r>
+                        <w:rPr>
+                          <w:rStyle w:val="Years"/>
+                          <w:i/>
+                          <w:iCs/>
+                          <w:color w:val="AEAAAA" w:themeColor="background2" w:themeShade="BF"/>
+                          <w:spacing w:val="12"/>
+                        </w:rPr>
+                        <w:t xml:space="preserve"> </w:t>
+                      </w:r>
+                      <w:r>
+                        <w:rPr>
+                          <w:rStyle w:val="Years"/>
+                          <w:i/>
+                          <w:iCs/>
+                          <w:color w:val="AEAAAA" w:themeColor="background2" w:themeShade="BF"/>
+                          <w:spacing w:val="12"/>
+                        </w:rPr>
+                        <w:t>4</w:t>
+                      </w:r>
+                      <w:r>
+                        <w:rPr>
+                          <w:rStyle w:val="Years"/>
+                          <w:i/>
+                          <w:iCs/>
+                          <w:color w:val="AEAAAA" w:themeColor="background2" w:themeShade="BF"/>
+                          <w:spacing w:val="12"/>
+                        </w:rPr>
+                        <w:t>mos</w:t>
+                      </w:r>
+                      <w:r>
+                        <w:rPr>
+                          <w:rFonts w:ascii="Roboto Medium" w:hAnsi="Roboto Medium" w:cs="Roboto Medium"/>
+                          <w:spacing w:val="16"/>
+                          <w:sz w:val="16"/>
+                          <w:szCs w:val="16"/>
+                        </w:rPr>
+                        <w:br/>
+                      </w:r>
+                      <w:r>
+                        <w:rPr>
+                          <w:rFonts w:ascii="Roboto Medium" w:hAnsi="Roboto Medium" w:cs="Roboto Medium"/>
+                          <w:i/>
+                          <w:iCs/>
+                          <w:sz w:val="16"/>
+                          <w:szCs w:val="16"/>
+                        </w:rPr>
+                        <w:t>Aria Smart</w:t>
+                      </w:r>
+                      <w:r>
+                        <w:rPr>
+                          <w:rFonts w:ascii="Roboto Medium" w:hAnsi="Roboto Medium" w:cs="Roboto Medium"/>
+                          <w:i/>
+                          <w:iCs/>
+                          <w:sz w:val="16"/>
+                          <w:szCs w:val="16"/>
+                        </w:rPr>
+                        <w:t xml:space="preserve"> Company, Shiraz, Iran</w:t>
+                      </w:r>
+                    </w:p>
+                    <w:p>
+                      <w:pPr>
+                        <w:pStyle w:val="NormalWeb"/>
+                        <w:kinsoku w:val="0"/>
+                        <w:overflowPunct w:val="0"/>
+                        <w:spacing w:before="0" w:beforeAutospacing="0" w:after="0" w:afterAutospacing="0"/>
+                        <w:textAlignment w:val="baseline"/>
+                        <w:rPr>
+                          <w:rFonts w:ascii="Inter" w:hAnsi="Inter" w:cs="Arial"/>
+                          <w:color w:val="767171"/>
+                          <w:kern w:val="24"/>
+                          <w:sz w:val="18"/>
+                          <w:szCs w:val="18"/>
+                          <w:lang w:val="fr-FR"/>
+                        </w:rPr>
+                      </w:pPr>
+                      <w:r>
+                        <w:rPr>
+                          <w:rFonts w:ascii="Inter" w:hAnsi="Inter" w:cs="Arial"/>
+                          <w:color w:val="767171"/>
+                          <w:kern w:val="24"/>
+                          <w:sz w:val="18"/>
+                          <w:szCs w:val="18"/>
+                          <w:lang w:val="fr-FR"/>
+                        </w:rPr>
+                        <w:t>Skills</w:t>
+                      </w:r>
+                      <w:r>
+                        <w:rPr>
+                          <w:rFonts w:ascii="Inter" w:hAnsi="Inter" w:cs="Arial" w:hint="cs"/>
+                          <w:color w:val="767171"/>
+                          <w:kern w:val="24"/>
+                          <w:sz w:val="18"/>
+                          <w:szCs w:val="18"/>
+                          <w:rtl/>
+                          <w:lang w:val="fr-FR"/>
+                        </w:rPr>
+                        <w:t xml:space="preserve"> </w:t>
+                      </w:r>
+                      <w:r>
+                        <w:rPr>
+                          <w:rFonts w:ascii="Inter" w:hAnsi="Inter" w:cs="Arial"/>
+                          <w:color w:val="767171"/>
+                          <w:kern w:val="24"/>
+                          <w:sz w:val="18"/>
+                          <w:szCs w:val="18"/>
+                          <w:lang w:val="fr-FR"/>
+                        </w:rPr>
+                        <w:t xml:space="preserve">: </w:t>
+                      </w:r>
+                      <w:r>
+                        <w:rPr>
+                          <w:rFonts w:ascii="Inter" w:hAnsi="Inter" w:cs="Arial"/>
+                          <w:color w:val="767171"/>
+                          <w:kern w:val="24"/>
+                          <w:sz w:val="18"/>
+                          <w:szCs w:val="18"/>
+                          <w:lang w:val="fr-FR"/>
+                        </w:rPr>
+                        <w:t>Git, Firebase, QR Scanner</w:t>
+                      </w:r>
+                    </w:p>
+                    <w:p>
+                      <w:pPr>
+                        <w:pStyle w:val="NormalWeb"/>
+                        <w:kinsoku w:val="0"/>
+                        <w:overflowPunct w:val="0"/>
+                        <w:spacing w:before="0" w:beforeAutospacing="0" w:after="0" w:afterAutospacing="0"/>
+                        <w:textAlignment w:val="baseline"/>
+                        <w:rPr>
+                          <w:rFonts w:ascii="Inter" w:hAnsi="Inter" w:cs="Arial"/>
+                          <w:color w:val="767171"/>
+                          <w:kern w:val="24"/>
+                          <w:sz w:val="18"/>
+                          <w:szCs w:val="18"/>
+                          <w:lang w:val="fr-FR"/>
+                        </w:rPr>
+                      </w:pPr>
+                      <w:r>
+                        <w:rPr>
+                          <w:rFonts w:ascii="Inter" w:hAnsi="Inter" w:cs="Arial"/>
+                          <w:color w:val="767171"/>
+                          <w:kern w:val="24"/>
+                          <w:sz w:val="18"/>
+                          <w:szCs w:val="18"/>
+                          <w:lang w:val="fr-FR"/>
+                        </w:rPr>
+                        <w:t>Architecture</w:t>
+                      </w:r>
+                    </w:p>
+                    <w:p>
+                      <w:pPr>
+                        <w:pStyle w:val="NormalWeb"/>
+                        <w:kinsoku w:val="0"/>
+                        <w:overflowPunct w:val="0"/>
+                        <w:spacing w:before="0" w:beforeAutospacing="0" w:after="0" w:afterAutospacing="0"/>
+                        <w:textAlignment w:val="baseline"/>
+                        <w:rPr>
+                          <w:rFonts w:ascii="Inter" w:hAnsi="Inter" w:cs="Arial"/>
+                          <w:color w:val="767171"/>
+                          <w:kern w:val="24"/>
+                          <w:sz w:val="18"/>
+                          <w:szCs w:val="18"/>
+                          <w:lang w:val="fr-FR"/>
+                        </w:rPr>
+                      </w:pPr>
+                    </w:p>
+                    <w:p>
+                      <w:pPr>
+                        <w:pStyle w:val="BasicParagraph"/>
+                        <w:rPr>
+                          <w:rFonts w:ascii="Roboto Medium" w:hAnsi="Roboto Medium" w:cs="Roboto Medium"/>
+                          <w:i/>
+                          <w:iCs/>
+                          <w:sz w:val="16"/>
+                          <w:szCs w:val="16"/>
+                        </w:rPr>
+                      </w:pPr>
+                    </w:p>
+                  </w:txbxContent>
+                </v:textbox>
+              </v:shape>
+            </w:pict>
+          </mc:Fallback>
+        </mc:AlternateContent>
+      </w:r>
+      <w:r>
+        <w:rPr>
+          <w:noProof/>
+        </w:rPr>
+        <mc:AlternateContent>
+          <mc:Choice Requires="wps">
+            <w:drawing>
               <wp:anchor distT="45720" distB="45720" distL="114300" distR="114300" simplePos="0" relativeHeight="251663360" behindDoc="0" locked="0" layoutInCell="1" allowOverlap="1" wp14:anchorId="3B3FD692" wp14:editId="1B17616E">
                 <wp:simplePos x="0" y="0"/>
                 <wp:positionH relativeFrom="column">
-                  <wp:posOffset>-434975</wp:posOffset>
+                  <wp:posOffset>-436880</wp:posOffset>
                 </wp:positionH>
                 <wp:positionV relativeFrom="paragraph">
-                  <wp:posOffset>956422</wp:posOffset>
+                  <wp:posOffset>1018279</wp:posOffset>
                 </wp:positionV>
-                <wp:extent cx="6559550" cy="1190172"/>
+                <wp:extent cx="6559550" cy="732865"/>
                 <wp:effectExtent l="0" t="0" r="0" b="0"/>
                 <wp:wrapNone/>
                 <wp:docPr id="12" name="Text Box 2"/>
@@ -34,7 +633,7 @@
                       <wps:spPr bwMode="auto">
                         <a:xfrm>
                           <a:off x="0" y="0"/>
-                          <a:ext cx="6559550" cy="1190172"/>
+                          <a:ext cx="6559550" cy="732865"/>
                         </a:xfrm>
                         <a:prstGeom prst="rect">
                           <a:avLst/>
@@ -81,7 +680,7 @@
                                 <w:noProof/>
                                 <w:kern w:val="24"/>
                               </w:rPr>
-                              <w:t>Android Developer with 7+ years of experience focused on designing, building, and launching successful apps with the concern and efforts to improve the performance of the app and publishing in different Android markets. Passionate about staying on top of Android best practices. Known for clear communication, collaboration, and project leadership abilities. Experienced mentoring junior developers and guiding technical decisions. Excited to bring strong technical skills, attention to detail, and commitment to quality to a leading software engineering role focused on building world-class mobile user experiences.</w:t>
+                              <w:t>Android Developer with 7+ years of experience designing, building, and launching successful mobile apps from start to finish. Known for clear communication, collaboration, project leadership, and mentoring junior developers. Passionate about staying current on Android best practices and trends.</w:t>
                             </w:r>
                             <w:r>
                               <w:rPr>
@@ -142,11 +741,7 @@
           </mc:Choice>
           <mc:Fallback>
             <w:pict>
-              <v:shapetype w14:anchorId="3B3FD692" id="_x0000_t202" coordsize="21600,21600" o:spt="202" path="m,l,21600r21600,l21600,xe">
-                <v:stroke joinstyle="miter"/>
-                <v:path gradientshapeok="t" o:connecttype="rect"/>
-              </v:shapetype>
-              <v:shape id="Text Box 2" o:spid="_x0000_s1026" type="#_x0000_t202" style="position:absolute;margin-left:-34.25pt;margin-top:75.3pt;width:516.5pt;height:93.7pt;z-index:251663360;visibility:visible;mso-wrap-style:square;mso-width-percent:0;mso-height-percent:0;mso-wrap-distance-left:9pt;mso-wrap-distance-top:3.6pt;mso-wrap-distance-right:9pt;mso-wrap-distance-bottom:3.6pt;mso-position-horizontal:absolute;mso-position-horizontal-relative:text;mso-position-vertical:absolute;mso-position-vertical-relative:text;mso-width-percent:0;mso-height-percent:0;mso-width-relative:margin;mso-height-relative:margin;v-text-anchor:top" o:gfxdata="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" filled="f" stroked="f">
+              <v:shape w14:anchorId="3B3FD692" id="_x0000_s1027" type="#_x0000_t202" style="position:absolute;margin-left:-34.4pt;margin-top:80.2pt;width:516.5pt;height:57.7pt;z-index:251663360;visibility:visible;mso-wrap-style:square;mso-width-percent:0;mso-height-percent:0;mso-wrap-distance-left:9pt;mso-wrap-distance-top:3.6pt;mso-wrap-distance-right:9pt;mso-wrap-distance-bottom:3.6pt;mso-position-horizontal:absolute;mso-position-horizontal-relative:text;mso-position-vertical:absolute;mso-position-vertical-relative:text;mso-width-percent:0;mso-height-percent:0;mso-width-relative:margin;mso-height-relative:margin;v-text-anchor:top" o:gfxdata="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" filled="f" stroked="f">
                 <v:textbox>
                   <w:txbxContent>
                     <w:p>
@@ -181,7 +776,7 @@
                           <w:noProof/>
                           <w:kern w:val="24"/>
                         </w:rPr>
-                        <w:t>Android Developer with 7+ years of experience focused on designing, building, and launching successful apps with the concern and efforts to improve the performance of the app and publishing in different Android markets. Passionate about staying on top of Android best practices. Known for clear communication, collaboration, and project leadership abilities. Experienced mentoring junior developers and guiding technical decisions. Excited to bring strong technical skills, attention to detail, and commitment to quality to a leading software engineering role focused on building world-class mobile user experiences.</w:t>
+                        <w:t>Android Developer with 7+ years of experience designing, building, and launching successful mobile apps from start to finish. Known for clear communication, collaboration, project leadership, and mentoring junior developers. Passionate about staying current on Android best practices and trends.</w:t>
                       </w:r>
                       <w:r>
                         <w:rPr>
@@ -541,10 +1136,7 @@
                               </w:numPr>
                             </w:pPr>
                             <w:r>
-                              <w:t>Developed Batab, a real estate advisory</w:t>
-                            </w:r>
-                            <w:r>
-                              <w:t xml:space="preserve"> app with an aesthetically designed UI per specifications.</w:t>
+                              <w:t>Developed Batab, a real estate advisory app with an aesthetically designed UI per specifications.</w:t>
                             </w:r>
                           </w:p>
                           <w:p>
@@ -781,7 +1373,63 @@
                                 <w:rStyle w:val="Years"/>
                                 <w:spacing w:val="12"/>
                               </w:rPr>
-                              <w:t xml:space="preserve">APR 2022 - Present   </w:t>
+                              <w:t>A</w:t>
+                            </w:r>
+                            <w:r>
+                              <w:rPr>
+                                <w:rStyle w:val="Years"/>
+                                <w:spacing w:val="12"/>
+                              </w:rPr>
+                              <w:t>UG</w:t>
+                            </w:r>
+                            <w:r>
+                              <w:rPr>
+                                <w:rStyle w:val="Years"/>
+                                <w:spacing w:val="12"/>
+                              </w:rPr>
+                              <w:t xml:space="preserve"> 20</w:t>
+                            </w:r>
+                            <w:r>
+                              <w:rPr>
+                                <w:rStyle w:val="Years"/>
+                                <w:spacing w:val="12"/>
+                              </w:rPr>
+                              <w:t>18</w:t>
+                            </w:r>
+                            <w:r>
+                              <w:rPr>
+                                <w:rStyle w:val="Years"/>
+                                <w:spacing w:val="12"/>
+                              </w:rPr>
+                              <w:t xml:space="preserve"> </w:t>
+                            </w:r>
+                            <w:r>
+                              <w:rPr>
+                                <w:rStyle w:val="Years"/>
+                                <w:spacing w:val="12"/>
+                              </w:rPr>
+                              <w:t>–</w:t>
+                            </w:r>
+                            <w:r>
+                              <w:rPr>
+                                <w:rStyle w:val="Years"/>
+                                <w:spacing w:val="12"/>
+                              </w:rPr>
+                              <w:t xml:space="preserve"> </w:t>
+                            </w:r>
+                            <w:r>
+                              <w:rPr>
+                                <w:rStyle w:val="Years"/>
+                                <w:spacing w:val="12"/>
+                              </w:rPr>
+                              <w:t>MAY 2019</w:t>
+                            </w:r>
+                            <w:r>
+                              <w:rPr>
+                                <w:rStyle w:val="Years"/>
+                                <w:spacing w:val="12"/>
+                              </w:rPr>
+                              <w:t xml:space="preserve">   </w:t>
                             </w:r>
                             <w:r>
                               <w:rPr>
@@ -791,7 +1439,7 @@
                                 <w:color w:val="AEAAAA" w:themeColor="background2" w:themeShade="BF"/>
                                 <w:spacing w:val="12"/>
                               </w:rPr>
-                              <w:t>~1yr</w:t>
+                              <w:t>1yr</w:t>
                             </w:r>
                             <w:r>
                               <w:rPr>
@@ -812,6 +1460,7 @@
                               </w:rPr>
                               <w:br/>
                             </w:r>
+                            <w:proofErr w:type="spellStart"/>
                             <w:r>
                               <w:rPr>
                                 <w:rFonts w:ascii="Roboto Medium" w:hAnsi="Roboto Medium" w:cs="Roboto Medium"/>
@@ -822,6 +1471,7 @@
                               </w:rPr>
                               <w:t>HivaTech</w:t>
                             </w:r>
+                            <w:proofErr w:type="spellEnd"/>
                             <w:r>
                               <w:rPr>
                                 <w:rFonts w:ascii="Roboto Medium" w:hAnsi="Roboto Medium" w:cs="Roboto Medium"/>
@@ -997,7 +1647,7 @@
           </mc:Choice>
           <mc:Fallback>
             <w:pict>
-              <v:shape w14:anchorId="6E23D815" id="_x0000_s1030" type="#_x0000_t202" style="position:absolute;margin-left:-34.3pt;margin-top:354.95pt;width:303.4pt;height:39.85pt;z-index:251670528;visibility:visible;mso-wrap-style:square;mso-width-percent:0;mso-height-percent:0;mso-wrap-distance-left:9pt;mso-wrap-distance-top:0;mso-wrap-distance-right:9pt;mso-wrap-distance-bottom:0;mso-position-horizontal:absolute;mso-position-horizontal-relative:text;mso-position-vertical:absolute;mso-position-vertical-relative:text;mso-width-percent:0;mso-height-percent:0;mso-width-relative:margin;mso-height-relative:margin;v-text-anchor:top" o:gfxdata="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" filled="f" stroked="f">
+              <v:shape w14:anchorId="6E23D815" id="_x0000_s1031" type="#_x0000_t202" style="position:absolute;margin-left:-34.3pt;margin-top:354.95pt;width:303.4pt;height:39.85pt;z-index:251670528;visibility:visible;mso-wrap-style:square;mso-width-percent:0;mso-height-percent:0;mso-wrap-distance-left:9pt;mso-wrap-distance-top:0;mso-wrap-distance-right:9pt;mso-wrap-distance-bottom:0;mso-position-horizontal:absolute;mso-position-horizontal-relative:text;mso-position-vertical:absolute;mso-position-vertical-relative:text;mso-width-percent:0;mso-height-percent:0;mso-width-relative:margin;mso-height-relative:margin;v-text-anchor:top" o:gfxdata="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" filled="f" stroked="f">
                 <v:textbox>
                   <w:txbxContent>
                     <w:p>
@@ -1060,7 +1710,63 @@
                           <w:rStyle w:val="Years"/>
                           <w:spacing w:val="12"/>
                         </w:rPr>
-                        <w:t xml:space="preserve">APR 2022 - Present   </w:t>
+                        <w:t>A</w:t>
+                      </w:r>
+                      <w:r>
+                        <w:rPr>
+                          <w:rStyle w:val="Years"/>
+                          <w:spacing w:val="12"/>
+                        </w:rPr>
+                        <w:t>UG</w:t>
+                      </w:r>
+                      <w:r>
+                        <w:rPr>
+                          <w:rStyle w:val="Years"/>
+                          <w:spacing w:val="12"/>
+                        </w:rPr>
+                        <w:t xml:space="preserve"> 20</w:t>
+                      </w:r>
+                      <w:r>
+                        <w:rPr>
+                          <w:rStyle w:val="Years"/>
+                          <w:spacing w:val="12"/>
+                        </w:rPr>
+                        <w:t>18</w:t>
+                      </w:r>
+                      <w:r>
+                        <w:rPr>
+                          <w:rStyle w:val="Years"/>
+                          <w:spacing w:val="12"/>
+                        </w:rPr>
+                        <w:t xml:space="preserve"> </w:t>
+                      </w:r>
+                      <w:r>
+                        <w:rPr>
+                          <w:rStyle w:val="Years"/>
+                          <w:spacing w:val="12"/>
+                        </w:rPr>
+                        <w:t>–</w:t>
+                      </w:r>
+                      <w:r>
+                        <w:rPr>
+                          <w:rStyle w:val="Years"/>
+                          <w:spacing w:val="12"/>
+                        </w:rPr>
+                        <w:t xml:space="preserve"> </w:t>
+                      </w:r>
+                      <w:r>
+                        <w:rPr>
+                          <w:rStyle w:val="Years"/>
+                          <w:spacing w:val="12"/>
+                        </w:rPr>
+                        <w:t>MAY 2019</w:t>
+                      </w:r>
+                      <w:r>
+                        <w:rPr>
+                          <w:rStyle w:val="Years"/>
+                          <w:spacing w:val="12"/>
+                        </w:rPr>
+                        <w:t xml:space="preserve">   </w:t>
                       </w:r>
                       <w:r>
                         <w:rPr>
@@ -1070,7 +1776,7 @@
                           <w:color w:val="AEAAAA" w:themeColor="background2" w:themeShade="BF"/>
                           <w:spacing w:val="12"/>
                         </w:rPr>
-                        <w:t>~1yr</w:t>
+                        <w:t>1yr</w:t>
                       </w:r>
                       <w:r>
                         <w:rPr>
@@ -1091,6 +1797,7 @@
                         </w:rPr>
                         <w:br/>
                       </w:r>
+                      <w:proofErr w:type="spellStart"/>
                       <w:r>
                         <w:rPr>
                           <w:rFonts w:ascii="Roboto Medium" w:hAnsi="Roboto Medium" w:cs="Roboto Medium"/>
@@ -1101,6 +1808,7 @@
                         </w:rPr>
                         <w:t>HivaTech</w:t>
                       </w:r>
+                      <w:proofErr w:type="spellEnd"/>
                       <w:r>
                         <w:rPr>
                           <w:rFonts w:ascii="Roboto Medium" w:hAnsi="Roboto Medium" w:cs="Roboto Medium"/>
@@ -1226,653 +1934,6 @@
                           <w:lang w:val="fr-FR"/>
                         </w:rPr>
                         <w:t xml:space="preserve"> Map, Android Architecture</w:t>
-                      </w:r>
-                    </w:p>
-                    <w:p>
-                      <w:pPr>
-                        <w:pStyle w:val="NormalWeb"/>
-                        <w:kinsoku w:val="0"/>
-                        <w:overflowPunct w:val="0"/>
-                        <w:spacing w:before="0" w:beforeAutospacing="0" w:after="0" w:afterAutospacing="0"/>
-                        <w:textAlignment w:val="baseline"/>
-                        <w:rPr>
-                          <w:rFonts w:ascii="Inter" w:hAnsi="Inter" w:cs="Arial"/>
-                          <w:color w:val="767171"/>
-                          <w:kern w:val="24"/>
-                          <w:sz w:val="18"/>
-                          <w:szCs w:val="18"/>
-                          <w:lang w:val="fr-FR"/>
-                        </w:rPr>
-                      </w:pPr>
-                    </w:p>
-                    <w:p>
-                      <w:pPr>
-                        <w:pStyle w:val="BasicParagraph"/>
-                        <w:rPr>
-                          <w:rFonts w:ascii="Roboto Medium" w:hAnsi="Roboto Medium" w:cs="Roboto Medium"/>
-                          <w:i/>
-                          <w:iCs/>
-                          <w:sz w:val="16"/>
-                          <w:szCs w:val="16"/>
-                        </w:rPr>
-                      </w:pPr>
-                    </w:p>
-                  </w:txbxContent>
-                </v:textbox>
-              </v:shape>
-            </w:pict>
-          </mc:Fallback>
-        </mc:AlternateContent>
-      </w:r>
-      <w:r>
-        <w:rPr>
-          <w:noProof/>
-        </w:rPr>
-        <mc:AlternateContent>
-          <mc:Choice Requires="wps">
-            <w:drawing>
-              <wp:anchor distT="0" distB="0" distL="114300" distR="114300" simplePos="0" relativeHeight="251711488" behindDoc="0" locked="0" layoutInCell="1" allowOverlap="1" wp14:anchorId="2B9662D6" wp14:editId="435A885B">
-                <wp:simplePos x="0" y="0"/>
-                <wp:positionH relativeFrom="column">
-                  <wp:posOffset>-435610</wp:posOffset>
-                </wp:positionH>
-                <wp:positionV relativeFrom="paragraph">
-                  <wp:posOffset>6188075</wp:posOffset>
-                </wp:positionV>
-                <wp:extent cx="3853180" cy="502920"/>
-                <wp:effectExtent l="0" t="0" r="0" b="0"/>
-                <wp:wrapNone/>
-                <wp:docPr id="733860881" name="Text Box 2"/>
-                <wp:cNvGraphicFramePr>
-                  <a:graphicFrameLocks xmlns:a="http://schemas.openxmlformats.org/drawingml/2006/main"/>
-                </wp:cNvGraphicFramePr>
-                <a:graphic xmlns:a="http://schemas.openxmlformats.org/drawingml/2006/main">
-                  <a:graphicData uri="http://schemas.microsoft.com/office/word/2010/wordprocessingShape">
-                    <wps:wsp>
-                      <wps:cNvSpPr txBox="1">
-                        <a:spLocks noChangeArrowheads="1"/>
-                      </wps:cNvSpPr>
-                      <wps:spPr bwMode="auto">
-                        <a:xfrm>
-                          <a:off x="0" y="0"/>
-                          <a:ext cx="3853180" cy="502920"/>
-                        </a:xfrm>
-                        <a:prstGeom prst="rect">
-                          <a:avLst/>
-                        </a:prstGeom>
-                        <a:noFill/>
-                        <a:ln w="9525">
-                          <a:noFill/>
-                          <a:miter lim="800000"/>
-                          <a:headEnd/>
-                          <a:tailEnd/>
-                        </a:ln>
-                      </wps:spPr>
-                      <wps:txbx>
-                        <w:txbxContent>
-                          <w:p>
-                            <w:pPr>
-                              <w:pStyle w:val="BasicParagraph"/>
-                              <w:rPr>
-                                <w:rFonts w:ascii="Roboto Medium" w:hAnsi="Roboto Medium" w:cs="Roboto Medium"/>
-                                <w:i/>
-                                <w:iCs/>
-                                <w:sz w:val="16"/>
-                                <w:szCs w:val="16"/>
-                              </w:rPr>
-                            </w:pPr>
-                            <w:r>
-                              <w:rPr>
-                                <w:rFonts w:ascii="Roboto" w:hAnsi="Roboto" w:cs="Roboto"/>
-                                <w:b/>
-                                <w:bCs/>
-                                <w:spacing w:val="12"/>
-                                <w:sz w:val="16"/>
-                                <w:szCs w:val="16"/>
-                              </w:rPr>
-                              <w:t xml:space="preserve">MIDLEVEL ANDROID DEVELOPER | </w:t>
-                            </w:r>
-                            <w:r>
-                              <w:rPr>
-                                <w:rStyle w:val="Years"/>
-                                <w:spacing w:val="12"/>
-                              </w:rPr>
-                              <w:t xml:space="preserve">APR 2022 - Present   </w:t>
-                            </w:r>
-                            <w:r>
-                              <w:rPr>
-                                <w:rStyle w:val="Years"/>
-                                <w:i/>
-                                <w:iCs/>
-                                <w:color w:val="AEAAAA" w:themeColor="background2" w:themeShade="BF"/>
-                                <w:spacing w:val="12"/>
-                              </w:rPr>
-                              <w:t>~1yr</w:t>
-                            </w:r>
-                            <w:r>
-                              <w:rPr>
-                                <w:rStyle w:val="Years"/>
-                                <w:i/>
-                                <w:iCs/>
-                                <w:color w:val="AEAAAA" w:themeColor="background2" w:themeShade="BF"/>
-                                <w:spacing w:val="12"/>
-                              </w:rPr>
-                              <w:t xml:space="preserve"> </w:t>
-                            </w:r>
-                            <w:r>
-                              <w:rPr>
-                                <w:rStyle w:val="Years"/>
-                                <w:i/>
-                                <w:iCs/>
-                                <w:color w:val="AEAAAA" w:themeColor="background2" w:themeShade="BF"/>
-                                <w:spacing w:val="12"/>
-                              </w:rPr>
-                              <w:t>4</w:t>
-                            </w:r>
-                            <w:r>
-                              <w:rPr>
-                                <w:rStyle w:val="Years"/>
-                                <w:i/>
-                                <w:iCs/>
-                                <w:color w:val="AEAAAA" w:themeColor="background2" w:themeShade="BF"/>
-                                <w:spacing w:val="12"/>
-                              </w:rPr>
-                              <w:t>mos</w:t>
-                            </w:r>
-                            <w:r>
-                              <w:rPr>
-                                <w:rFonts w:ascii="Roboto Medium" w:hAnsi="Roboto Medium" w:cs="Roboto Medium"/>
-                                <w:spacing w:val="16"/>
-                                <w:sz w:val="16"/>
-                                <w:szCs w:val="16"/>
-                              </w:rPr>
-                              <w:br/>
-                            </w:r>
-                            <w:r>
-                              <w:rPr>
-                                <w:rFonts w:ascii="Roboto Medium" w:hAnsi="Roboto Medium" w:cs="Roboto Medium"/>
-                                <w:i/>
-                                <w:iCs/>
-                                <w:sz w:val="16"/>
-                                <w:szCs w:val="16"/>
-                              </w:rPr>
-                              <w:t>Aria Smart</w:t>
-                            </w:r>
-                            <w:r>
-                              <w:rPr>
-                                <w:rFonts w:ascii="Roboto Medium" w:hAnsi="Roboto Medium" w:cs="Roboto Medium"/>
-                                <w:i/>
-                                <w:iCs/>
-                                <w:sz w:val="16"/>
-                                <w:szCs w:val="16"/>
-                              </w:rPr>
-                              <w:t xml:space="preserve"> Company, Shiraz, Iran</w:t>
-                            </w:r>
-                          </w:p>
-                          <w:p>
-                            <w:pPr>
-                              <w:pStyle w:val="NormalWeb"/>
-                              <w:kinsoku w:val="0"/>
-                              <w:overflowPunct w:val="0"/>
-                              <w:spacing w:before="0" w:beforeAutospacing="0" w:after="0" w:afterAutospacing="0"/>
-                              <w:textAlignment w:val="baseline"/>
-                              <w:rPr>
-                                <w:rFonts w:ascii="Inter" w:hAnsi="Inter" w:cs="Arial"/>
-                                <w:color w:val="767171"/>
-                                <w:kern w:val="24"/>
-                                <w:sz w:val="18"/>
-                                <w:szCs w:val="18"/>
-                                <w:lang w:val="fr-FR"/>
-                              </w:rPr>
-                            </w:pPr>
-                            <w:r>
-                              <w:rPr>
-                                <w:rFonts w:ascii="Inter" w:hAnsi="Inter" w:cs="Arial"/>
-                                <w:color w:val="767171"/>
-                                <w:kern w:val="24"/>
-                                <w:sz w:val="18"/>
-                                <w:szCs w:val="18"/>
-                                <w:lang w:val="fr-FR"/>
-                              </w:rPr>
-                              <w:t>Skills</w:t>
-                            </w:r>
-                            <w:r>
-                              <w:rPr>
-                                <w:rFonts w:ascii="Inter" w:hAnsi="Inter" w:cs="Arial" w:hint="cs"/>
-                                <w:color w:val="767171"/>
-                                <w:kern w:val="24"/>
-                                <w:sz w:val="18"/>
-                                <w:szCs w:val="18"/>
-                                <w:rtl/>
-                                <w:lang w:val="fr-FR"/>
-                              </w:rPr>
-                              <w:t xml:space="preserve"> </w:t>
-                            </w:r>
-                            <w:r>
-                              <w:rPr>
-                                <w:rFonts w:ascii="Inter" w:hAnsi="Inter" w:cs="Arial"/>
-                                <w:color w:val="767171"/>
-                                <w:kern w:val="24"/>
-                                <w:sz w:val="18"/>
-                                <w:szCs w:val="18"/>
-                                <w:lang w:val="fr-FR"/>
-                              </w:rPr>
-                              <w:t xml:space="preserve">: </w:t>
-                            </w:r>
-                            <w:r>
-                              <w:rPr>
-                                <w:rFonts w:ascii="Inter" w:hAnsi="Inter" w:cs="Arial"/>
-                                <w:color w:val="767171"/>
-                                <w:kern w:val="24"/>
-                                <w:sz w:val="18"/>
-                                <w:szCs w:val="18"/>
-                                <w:lang w:val="fr-FR"/>
-                              </w:rPr>
-                              <w:t xml:space="preserve">Git, </w:t>
-                            </w:r>
-                            <w:proofErr w:type="spellStart"/>
-                            <w:r>
-                              <w:rPr>
-                                <w:rFonts w:ascii="Inter" w:hAnsi="Inter" w:cs="Arial"/>
-                                <w:color w:val="767171"/>
-                                <w:kern w:val="24"/>
-                                <w:sz w:val="18"/>
-                                <w:szCs w:val="18"/>
-                                <w:lang w:val="fr-FR"/>
-                              </w:rPr>
-                              <w:t>Fire</w:t>
-                            </w:r>
-                            <w:r>
-                              <w:rPr>
-                                <w:rFonts w:ascii="Inter" w:hAnsi="Inter" w:cs="Arial"/>
-                                <w:color w:val="767171"/>
-                                <w:kern w:val="24"/>
-                                <w:sz w:val="18"/>
-                                <w:szCs w:val="18"/>
-                                <w:lang w:val="fr-FR"/>
-                              </w:rPr>
-                              <w:t>b</w:t>
-                            </w:r>
-                            <w:r>
-                              <w:rPr>
-                                <w:rFonts w:ascii="Inter" w:hAnsi="Inter" w:cs="Arial"/>
-                                <w:color w:val="767171"/>
-                                <w:kern w:val="24"/>
-                                <w:sz w:val="18"/>
-                                <w:szCs w:val="18"/>
-                                <w:lang w:val="fr-FR"/>
-                              </w:rPr>
-                              <w:t>ase</w:t>
-                            </w:r>
-                            <w:proofErr w:type="spellEnd"/>
-                            <w:r>
-                              <w:rPr>
-                                <w:rFonts w:ascii="Inter" w:hAnsi="Inter" w:cs="Arial"/>
-                                <w:color w:val="767171"/>
-                                <w:kern w:val="24"/>
-                                <w:sz w:val="18"/>
-                                <w:szCs w:val="18"/>
-                                <w:lang w:val="fr-FR"/>
-                              </w:rPr>
-                              <w:t>, QR</w:t>
-                            </w:r>
-                            <w:r>
-                              <w:rPr>
-                                <w:rFonts w:ascii="Inter" w:hAnsi="Inter" w:cs="Arial"/>
-                                <w:color w:val="767171"/>
-                                <w:kern w:val="24"/>
-                                <w:sz w:val="18"/>
-                                <w:szCs w:val="18"/>
-                                <w:lang w:val="fr-FR"/>
-                              </w:rPr>
-                              <w:t xml:space="preserve"> </w:t>
-                            </w:r>
-                            <w:r>
-                              <w:rPr>
-                                <w:rFonts w:ascii="Inter" w:hAnsi="Inter" w:cs="Arial"/>
-                                <w:color w:val="767171"/>
-                                <w:kern w:val="24"/>
-                                <w:sz w:val="18"/>
-                                <w:szCs w:val="18"/>
-                                <w:lang w:val="fr-FR"/>
-                              </w:rPr>
-                              <w:t>Scanner</w:t>
-                            </w:r>
-                          </w:p>
-                          <w:p>
-                            <w:pPr>
-                              <w:pStyle w:val="NormalWeb"/>
-                              <w:kinsoku w:val="0"/>
-                              <w:overflowPunct w:val="0"/>
-                              <w:spacing w:before="0" w:beforeAutospacing="0" w:after="0" w:afterAutospacing="0"/>
-                              <w:textAlignment w:val="baseline"/>
-                              <w:rPr>
-                                <w:rFonts w:ascii="Inter" w:hAnsi="Inter" w:cs="Arial"/>
-                                <w:color w:val="767171"/>
-                                <w:kern w:val="24"/>
-                                <w:sz w:val="18"/>
-                                <w:szCs w:val="18"/>
-                                <w:lang w:val="fr-FR"/>
-                              </w:rPr>
-                            </w:pPr>
-                            <w:r>
-                              <w:rPr>
-                                <w:rFonts w:ascii="Inter" w:hAnsi="Inter" w:cs="Arial"/>
-                                <w:color w:val="767171"/>
-                                <w:kern w:val="24"/>
-                                <w:sz w:val="18"/>
-                                <w:szCs w:val="18"/>
-                                <w:lang w:val="fr-FR"/>
-                              </w:rPr>
-                              <w:t>Architecture</w:t>
-                            </w:r>
-                          </w:p>
-                          <w:p>
-                            <w:pPr>
-                              <w:pStyle w:val="NormalWeb"/>
-                              <w:kinsoku w:val="0"/>
-                              <w:overflowPunct w:val="0"/>
-                              <w:spacing w:before="0" w:beforeAutospacing="0" w:after="0" w:afterAutospacing="0"/>
-                              <w:textAlignment w:val="baseline"/>
-                              <w:rPr>
-                                <w:rFonts w:ascii="Inter" w:hAnsi="Inter" w:cs="Arial"/>
-                                <w:color w:val="767171"/>
-                                <w:kern w:val="24"/>
-                                <w:sz w:val="18"/>
-                                <w:szCs w:val="18"/>
-                                <w:lang w:val="fr-FR"/>
-                              </w:rPr>
-                            </w:pPr>
-                          </w:p>
-                          <w:p>
-                            <w:pPr>
-                              <w:pStyle w:val="BasicParagraph"/>
-                              <w:rPr>
-                                <w:rFonts w:ascii="Roboto Medium" w:hAnsi="Roboto Medium" w:cs="Roboto Medium"/>
-                                <w:i/>
-                                <w:iCs/>
-                                <w:sz w:val="16"/>
-                                <w:szCs w:val="16"/>
-                              </w:rPr>
-                            </w:pPr>
-                          </w:p>
-                        </w:txbxContent>
-                      </wps:txbx>
-                      <wps:bodyPr rot="0" vert="horz" wrap="square" lIns="91440" tIns="45720" rIns="91440" bIns="45720" anchor="t" anchorCtr="0">
-                        <a:noAutofit/>
-                      </wps:bodyPr>
-                    </wps:wsp>
-                  </a:graphicData>
-                </a:graphic>
-                <wp14:sizeRelH relativeFrom="margin">
-                  <wp14:pctWidth>0</wp14:pctWidth>
-                </wp14:sizeRelH>
-                <wp14:sizeRelV relativeFrom="margin">
-                  <wp14:pctHeight>0</wp14:pctHeight>
-                </wp14:sizeRelV>
-              </wp:anchor>
-            </w:drawing>
-          </mc:Choice>
-          <mc:Fallback>
-            <w:pict>
-              <v:shape w14:anchorId="2B9662D6" id="_x0000_s1031" type="#_x0000_t202" style="position:absolute;margin-left:-34.3pt;margin-top:487.25pt;width:303.4pt;height:39.6pt;z-index:251711488;visibility:visible;mso-wrap-style:square;mso-width-percent:0;mso-height-percent:0;mso-wrap-distance-left:9pt;mso-wrap-distance-top:0;mso-wrap-distance-right:9pt;mso-wrap-distance-bottom:0;mso-position-horizontal:absolute;mso-position-horizontal-relative:text;mso-position-vertical:absolute;mso-position-vertical-relative:text;mso-width-percent:0;mso-height-percent:0;mso-width-relative:margin;mso-height-relative:margin;v-text-anchor:top" o:gfxdata="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" filled="f" stroked="f">
-                <v:textbox>
-                  <w:txbxContent>
-                    <w:p>
-                      <w:pPr>
-                        <w:pStyle w:val="BasicParagraph"/>
-                        <w:rPr>
-                          <w:rFonts w:ascii="Roboto Medium" w:hAnsi="Roboto Medium" w:cs="Roboto Medium"/>
-                          <w:i/>
-                          <w:iCs/>
-                          <w:sz w:val="16"/>
-                          <w:szCs w:val="16"/>
-                        </w:rPr>
-                      </w:pPr>
-                      <w:r>
-                        <w:rPr>
-                          <w:rFonts w:ascii="Roboto" w:hAnsi="Roboto" w:cs="Roboto"/>
-                          <w:b/>
-                          <w:bCs/>
-                          <w:spacing w:val="12"/>
-                          <w:sz w:val="16"/>
-                          <w:szCs w:val="16"/>
-                        </w:rPr>
-                        <w:t xml:space="preserve">MIDLEVEL ANDROID DEVELOPER | </w:t>
-                      </w:r>
-                      <w:r>
-                        <w:rPr>
-                          <w:rStyle w:val="Years"/>
-                          <w:spacing w:val="12"/>
-                        </w:rPr>
-                        <w:t xml:space="preserve">APR 2022 - Present   </w:t>
-                      </w:r>
-                      <w:r>
-                        <w:rPr>
-                          <w:rStyle w:val="Years"/>
-                          <w:i/>
-                          <w:iCs/>
-                          <w:color w:val="AEAAAA" w:themeColor="background2" w:themeShade="BF"/>
-                          <w:spacing w:val="12"/>
-                        </w:rPr>
-                        <w:t>~1yr</w:t>
-                      </w:r>
-                      <w:r>
-                        <w:rPr>
-                          <w:rStyle w:val="Years"/>
-                          <w:i/>
-                          <w:iCs/>
-                          <w:color w:val="AEAAAA" w:themeColor="background2" w:themeShade="BF"/>
-                          <w:spacing w:val="12"/>
-                        </w:rPr>
-                        <w:t xml:space="preserve"> </w:t>
-                      </w:r>
-                      <w:r>
-                        <w:rPr>
-                          <w:rStyle w:val="Years"/>
-                          <w:i/>
-                          <w:iCs/>
-                          <w:color w:val="AEAAAA" w:themeColor="background2" w:themeShade="BF"/>
-                          <w:spacing w:val="12"/>
-                        </w:rPr>
-                        <w:t>4</w:t>
-                      </w:r>
-                      <w:r>
-                        <w:rPr>
-                          <w:rStyle w:val="Years"/>
-                          <w:i/>
-                          <w:iCs/>
-                          <w:color w:val="AEAAAA" w:themeColor="background2" w:themeShade="BF"/>
-                          <w:spacing w:val="12"/>
-                        </w:rPr>
-                        <w:t>mos</w:t>
-                      </w:r>
-                      <w:r>
-                        <w:rPr>
-                          <w:rFonts w:ascii="Roboto Medium" w:hAnsi="Roboto Medium" w:cs="Roboto Medium"/>
-                          <w:spacing w:val="16"/>
-                          <w:sz w:val="16"/>
-                          <w:szCs w:val="16"/>
-                        </w:rPr>
-                        <w:br/>
-                      </w:r>
-                      <w:r>
-                        <w:rPr>
-                          <w:rFonts w:ascii="Roboto Medium" w:hAnsi="Roboto Medium" w:cs="Roboto Medium"/>
-                          <w:i/>
-                          <w:iCs/>
-                          <w:sz w:val="16"/>
-                          <w:szCs w:val="16"/>
-                        </w:rPr>
-                        <w:t>Aria Smart</w:t>
-                      </w:r>
-                      <w:r>
-                        <w:rPr>
-                          <w:rFonts w:ascii="Roboto Medium" w:hAnsi="Roboto Medium" w:cs="Roboto Medium"/>
-                          <w:i/>
-                          <w:iCs/>
-                          <w:sz w:val="16"/>
-                          <w:szCs w:val="16"/>
-                        </w:rPr>
-                        <w:t xml:space="preserve"> Company, Shiraz, Iran</w:t>
-                      </w:r>
-                    </w:p>
-                    <w:p>
-                      <w:pPr>
-                        <w:pStyle w:val="NormalWeb"/>
-                        <w:kinsoku w:val="0"/>
-                        <w:overflowPunct w:val="0"/>
-                        <w:spacing w:before="0" w:beforeAutospacing="0" w:after="0" w:afterAutospacing="0"/>
-                        <w:textAlignment w:val="baseline"/>
-                        <w:rPr>
-                          <w:rFonts w:ascii="Inter" w:hAnsi="Inter" w:cs="Arial"/>
-                          <w:color w:val="767171"/>
-                          <w:kern w:val="24"/>
-                          <w:sz w:val="18"/>
-                          <w:szCs w:val="18"/>
-                          <w:lang w:val="fr-FR"/>
-                        </w:rPr>
-                      </w:pPr>
-                      <w:r>
-                        <w:rPr>
-                          <w:rFonts w:ascii="Inter" w:hAnsi="Inter" w:cs="Arial"/>
-                          <w:color w:val="767171"/>
-                          <w:kern w:val="24"/>
-                          <w:sz w:val="18"/>
-                          <w:szCs w:val="18"/>
-                          <w:lang w:val="fr-FR"/>
-                        </w:rPr>
-                        <w:t>Skills</w:t>
-                      </w:r>
-                      <w:r>
-                        <w:rPr>
-                          <w:rFonts w:ascii="Inter" w:hAnsi="Inter" w:cs="Arial" w:hint="cs"/>
-                          <w:color w:val="767171"/>
-                          <w:kern w:val="24"/>
-                          <w:sz w:val="18"/>
-                          <w:szCs w:val="18"/>
-                          <w:rtl/>
-                          <w:lang w:val="fr-FR"/>
-                        </w:rPr>
-                        <w:t xml:space="preserve"> </w:t>
-                      </w:r>
-                      <w:r>
-                        <w:rPr>
-                          <w:rFonts w:ascii="Inter" w:hAnsi="Inter" w:cs="Arial"/>
-                          <w:color w:val="767171"/>
-                          <w:kern w:val="24"/>
-                          <w:sz w:val="18"/>
-                          <w:szCs w:val="18"/>
-                          <w:lang w:val="fr-FR"/>
-                        </w:rPr>
-                        <w:t xml:space="preserve">: </w:t>
-                      </w:r>
-                      <w:r>
-                        <w:rPr>
-                          <w:rFonts w:ascii="Inter" w:hAnsi="Inter" w:cs="Arial"/>
-                          <w:color w:val="767171"/>
-                          <w:kern w:val="24"/>
-                          <w:sz w:val="18"/>
-                          <w:szCs w:val="18"/>
-                          <w:lang w:val="fr-FR"/>
-                        </w:rPr>
-                        <w:t xml:space="preserve">Git, </w:t>
-                      </w:r>
-                      <w:proofErr w:type="spellStart"/>
-                      <w:r>
-                        <w:rPr>
-                          <w:rFonts w:ascii="Inter" w:hAnsi="Inter" w:cs="Arial"/>
-                          <w:color w:val="767171"/>
-                          <w:kern w:val="24"/>
-                          <w:sz w:val="18"/>
-                          <w:szCs w:val="18"/>
-                          <w:lang w:val="fr-FR"/>
-                        </w:rPr>
-                        <w:t>Fire</w:t>
-                      </w:r>
-                      <w:r>
-                        <w:rPr>
-                          <w:rFonts w:ascii="Inter" w:hAnsi="Inter" w:cs="Arial"/>
-                          <w:color w:val="767171"/>
-                          <w:kern w:val="24"/>
-                          <w:sz w:val="18"/>
-                          <w:szCs w:val="18"/>
-                          <w:lang w:val="fr-FR"/>
-                        </w:rPr>
-                        <w:t>b</w:t>
-                      </w:r>
-                      <w:r>
-                        <w:rPr>
-                          <w:rFonts w:ascii="Inter" w:hAnsi="Inter" w:cs="Arial"/>
-                          <w:color w:val="767171"/>
-                          <w:kern w:val="24"/>
-                          <w:sz w:val="18"/>
-                          <w:szCs w:val="18"/>
-                          <w:lang w:val="fr-FR"/>
-                        </w:rPr>
-                        <w:t>ase</w:t>
-                      </w:r>
-                      <w:proofErr w:type="spellEnd"/>
-                      <w:r>
-                        <w:rPr>
-                          <w:rFonts w:ascii="Inter" w:hAnsi="Inter" w:cs="Arial"/>
-                          <w:color w:val="767171"/>
-                          <w:kern w:val="24"/>
-                          <w:sz w:val="18"/>
-                          <w:szCs w:val="18"/>
-                          <w:lang w:val="fr-FR"/>
-                        </w:rPr>
-                        <w:t>, QR</w:t>
-                      </w:r>
-                      <w:r>
-                        <w:rPr>
-                          <w:rFonts w:ascii="Inter" w:hAnsi="Inter" w:cs="Arial"/>
-                          <w:color w:val="767171"/>
-                          <w:kern w:val="24"/>
-                          <w:sz w:val="18"/>
-                          <w:szCs w:val="18"/>
-                          <w:lang w:val="fr-FR"/>
-                        </w:rPr>
-                        <w:t xml:space="preserve"> </w:t>
-                      </w:r>
-                      <w:r>
-                        <w:rPr>
-                          <w:rFonts w:ascii="Inter" w:hAnsi="Inter" w:cs="Arial"/>
-                          <w:color w:val="767171"/>
-                          <w:kern w:val="24"/>
-                          <w:sz w:val="18"/>
-                          <w:szCs w:val="18"/>
-                          <w:lang w:val="fr-FR"/>
-                        </w:rPr>
-                        <w:t>Scanner</w:t>
-                      </w:r>
-                    </w:p>
-                    <w:p>
-                      <w:pPr>
-                        <w:pStyle w:val="NormalWeb"/>
-                        <w:kinsoku w:val="0"/>
-                        <w:overflowPunct w:val="0"/>
-                        <w:spacing w:before="0" w:beforeAutospacing="0" w:after="0" w:afterAutospacing="0"/>
-                        <w:textAlignment w:val="baseline"/>
-                        <w:rPr>
-                          <w:rFonts w:ascii="Inter" w:hAnsi="Inter" w:cs="Arial"/>
-                          <w:color w:val="767171"/>
-                          <w:kern w:val="24"/>
-                          <w:sz w:val="18"/>
-                          <w:szCs w:val="18"/>
-                          <w:lang w:val="fr-FR"/>
-                        </w:rPr>
-                      </w:pPr>
-                      <w:r>
-                        <w:rPr>
-                          <w:rFonts w:ascii="Inter" w:hAnsi="Inter" w:cs="Arial"/>
-                          <w:color w:val="767171"/>
-                          <w:kern w:val="24"/>
-                          <w:sz w:val="18"/>
-                          <w:szCs w:val="18"/>
-                          <w:lang w:val="fr-FR"/>
-                        </w:rPr>
-                        <w:t>Architecture</w:t>
                       </w:r>
                     </w:p>
                     <w:p>
@@ -2172,25 +2233,63 @@
                                 <w:sz w:val="16"/>
                                 <w:szCs w:val="16"/>
                               </w:rPr>
-                              <w:t>Junior</w:t>
-                            </w:r>
-                            <w:r>
-                              <w:rPr>
-                                <w:rFonts w:ascii="Roboto" w:hAnsi="Roboto" w:cs="Roboto"/>
-                                <w:b/>
-                                <w:bCs/>
-                                <w:spacing w:val="12"/>
-                                <w:sz w:val="16"/>
-                                <w:szCs w:val="16"/>
-                              </w:rPr>
-                              <w:t xml:space="preserve"> ANDROID DEVELOPER | </w:t>
+                              <w:t xml:space="preserve">ANDROID DEVELOPER | </w:t>
                             </w:r>
                             <w:r>
                               <w:rPr>
                                 <w:rStyle w:val="Years"/>
                                 <w:spacing w:val="12"/>
                               </w:rPr>
-                              <w:t xml:space="preserve">APR 2022 - Present   </w:t>
+                              <w:t>JUNE</w:t>
+                            </w:r>
+                            <w:r>
+                              <w:rPr>
+                                <w:rStyle w:val="Years"/>
+                                <w:spacing w:val="12"/>
+                              </w:rPr>
+                              <w:t xml:space="preserve"> 20</w:t>
+                            </w:r>
+                            <w:r>
+                              <w:rPr>
+                                <w:rStyle w:val="Years"/>
+                                <w:spacing w:val="12"/>
+                              </w:rPr>
+                              <w:t>16</w:t>
+                            </w:r>
+                            <w:r>
+                              <w:rPr>
+                                <w:rStyle w:val="Years"/>
+                                <w:spacing w:val="12"/>
+                              </w:rPr>
+                              <w:t xml:space="preserve"> </w:t>
+                            </w:r>
+                            <w:r>
+                              <w:rPr>
+                                <w:rStyle w:val="Years"/>
+                                <w:spacing w:val="12"/>
+                              </w:rPr>
+                              <w:t>–</w:t>
+                            </w:r>
+                            <w:r>
+                              <w:rPr>
+                                <w:rStyle w:val="Years"/>
+                                <w:spacing w:val="12"/>
+                              </w:rPr>
+                              <w:t xml:space="preserve"> </w:t>
+                            </w:r>
+                            <w:r>
+                              <w:rPr>
+                                <w:rStyle w:val="Years"/>
+                                <w:spacing w:val="12"/>
+                              </w:rPr>
+                              <w:t>MAY 2017</w:t>
+                            </w:r>
+                            <w:r>
+                              <w:rPr>
+                                <w:rStyle w:val="Years"/>
+                                <w:spacing w:val="12"/>
+                              </w:rPr>
+                              <w:t xml:space="preserve">   </w:t>
                             </w:r>
                             <w:r>
                               <w:rPr>
@@ -2211,6 +2310,7 @@
                               </w:rPr>
                               <w:br/>
                             </w:r>
+                            <w:proofErr w:type="spellStart"/>
                             <w:r>
                               <w:rPr>
                                 <w:rFonts w:ascii="Roboto Medium" w:hAnsi="Roboto Medium" w:cs="Roboto Medium"/>
@@ -2219,7 +2319,18 @@
                                 <w:sz w:val="16"/>
                                 <w:szCs w:val="16"/>
                               </w:rPr>
-                              <w:t>ShirazIT Company</w:t>
+                              <w:t>ShirazIT</w:t>
+                            </w:r>
+                            <w:proofErr w:type="spellEnd"/>
+                            <w:r>
+                              <w:rPr>
+                                <w:rFonts w:ascii="Roboto Medium" w:hAnsi="Roboto Medium" w:cs="Roboto Medium"/>
+                                <w:i/>
+                                <w:iCs/>
+                                <w:sz w:val="16"/>
+                                <w:szCs w:val="16"/>
+                              </w:rPr>
+                              <w:t xml:space="preserve"> Company</w:t>
                             </w:r>
                             <w:r>
                               <w:rPr>
@@ -2292,8 +2403,9 @@
                                 <w:szCs w:val="18"/>
                                 <w:lang w:val="fr-FR"/>
                               </w:rPr>
-                              <w:t>Loop</w:t>
-                            </w:r>
+                              <w:t>Loopj</w:t>
+                            </w:r>
+                            <w:proofErr w:type="spellEnd"/>
                             <w:r>
                               <w:rPr>
                                 <w:rFonts w:ascii="Inter" w:hAnsi="Inter" w:cs="Arial"/>
@@ -2303,9 +2415,9 @@
                                 <w:szCs w:val="18"/>
                                 <w:lang w:val="fr-FR"/>
                               </w:rPr>
-                              <w:t>j</w:t>
-                            </w:r>
-                            <w:proofErr w:type="spellEnd"/>
+                              <w:t xml:space="preserve">, Google </w:t>
+                            </w:r>
+                            <w:proofErr w:type="spellStart"/>
                             <w:r>
                               <w:rPr>
                                 <w:rFonts w:ascii="Inter" w:hAnsi="Inter" w:cs="Arial"/>
@@ -2315,8 +2427,9 @@
                                 <w:szCs w:val="18"/>
                                 <w:lang w:val="fr-FR"/>
                               </w:rPr>
-                              <w:t xml:space="preserve">, Google </w:t>
-                            </w:r>
+                              <w:t>Map</w:t>
+                            </w:r>
+                            <w:proofErr w:type="spellEnd"/>
                             <w:r>
                               <w:rPr>
                                 <w:rFonts w:ascii="Inter" w:hAnsi="Inter" w:cs="Arial"/>
@@ -2326,18 +2439,7 @@
                                 <w:szCs w:val="18"/>
                                 <w:lang w:val="fr-FR"/>
                               </w:rPr>
-                              <w:t>M</w:t>
-                            </w:r>
-                            <w:r>
-                              <w:rPr>
-                                <w:rFonts w:ascii="Inter" w:hAnsi="Inter" w:cs="Arial"/>
-                                <w:color w:val="767171"/>
-                                <w:kern w:val="24"/>
-                                <w:sz w:val="18"/>
-                                <w:szCs w:val="18"/>
-                                <w:lang w:val="fr-FR"/>
-                              </w:rPr>
-                              <w:t>ap, FCM, ION, Picasso, Glide</w:t>
+                              <w:t>, FCM, ION, Picasso, Glide</w:t>
                             </w:r>
                           </w:p>
                           <w:p>
@@ -2439,25 +2541,63 @@
                           <w:sz w:val="16"/>
                           <w:szCs w:val="16"/>
                         </w:rPr>
-                        <w:t>Junior</w:t>
-                      </w:r>
-                      <w:r>
-                        <w:rPr>
-                          <w:rFonts w:ascii="Roboto" w:hAnsi="Roboto" w:cs="Roboto"/>
-                          <w:b/>
-                          <w:bCs/>
-                          <w:spacing w:val="12"/>
-                          <w:sz w:val="16"/>
-                          <w:szCs w:val="16"/>
-                        </w:rPr>
-                        <w:t xml:space="preserve"> ANDROID DEVELOPER | </w:t>
+                        <w:t xml:space="preserve">ANDROID DEVELOPER | </w:t>
                       </w:r>
                       <w:r>
                         <w:rPr>
                           <w:rStyle w:val="Years"/>
                           <w:spacing w:val="12"/>
                         </w:rPr>
-                        <w:t xml:space="preserve">APR 2022 - Present   </w:t>
+                        <w:t>JUNE</w:t>
+                      </w:r>
+                      <w:r>
+                        <w:rPr>
+                          <w:rStyle w:val="Years"/>
+                          <w:spacing w:val="12"/>
+                        </w:rPr>
+                        <w:t xml:space="preserve"> 20</w:t>
+                      </w:r>
+                      <w:r>
+                        <w:rPr>
+                          <w:rStyle w:val="Years"/>
+                          <w:spacing w:val="12"/>
+                        </w:rPr>
+                        <w:t>16</w:t>
+                      </w:r>
+                      <w:r>
+                        <w:rPr>
+                          <w:rStyle w:val="Years"/>
+                          <w:spacing w:val="12"/>
+                        </w:rPr>
+                        <w:t xml:space="preserve"> </w:t>
+                      </w:r>
+                      <w:r>
+                        <w:rPr>
+                          <w:rStyle w:val="Years"/>
+                          <w:spacing w:val="12"/>
+                        </w:rPr>
+                        <w:t>–</w:t>
+                      </w:r>
+                      <w:r>
+                        <w:rPr>
+                          <w:rStyle w:val="Years"/>
+                          <w:spacing w:val="12"/>
+                        </w:rPr>
+                        <w:t xml:space="preserve"> </w:t>
+                      </w:r>
+                      <w:r>
+                        <w:rPr>
+                          <w:rStyle w:val="Years"/>
+                          <w:spacing w:val="12"/>
+                        </w:rPr>
+                        <w:t>MAY 2017</w:t>
+                      </w:r>
+                      <w:r>
+                        <w:rPr>
+                          <w:rStyle w:val="Years"/>
+                          <w:spacing w:val="12"/>
+                        </w:rPr>
+                        <w:t xml:space="preserve">   </w:t>
                       </w:r>
                       <w:r>
                         <w:rPr>
@@ -2478,6 +2618,7 @@
                         </w:rPr>
                         <w:br/>
                       </w:r>
+                      <w:proofErr w:type="spellStart"/>
                       <w:r>
                         <w:rPr>
                           <w:rFonts w:ascii="Roboto Medium" w:hAnsi="Roboto Medium" w:cs="Roboto Medium"/>
@@ -2486,7 +2627,18 @@
                           <w:sz w:val="16"/>
                           <w:szCs w:val="16"/>
                         </w:rPr>
-                        <w:t>ShirazIT Company</w:t>
+                        <w:t>ShirazIT</w:t>
+                      </w:r>
+                      <w:proofErr w:type="spellEnd"/>
+                      <w:r>
+                        <w:rPr>
+                          <w:rFonts w:ascii="Roboto Medium" w:hAnsi="Roboto Medium" w:cs="Roboto Medium"/>
+                          <w:i/>
+                          <w:iCs/>
+                          <w:sz w:val="16"/>
+                          <w:szCs w:val="16"/>
+                        </w:rPr>
+                        <w:t xml:space="preserve"> Company</w:t>
                       </w:r>
                       <w:r>
                         <w:rPr>
@@ -2559,8 +2711,9 @@
                           <w:szCs w:val="18"/>
                           <w:lang w:val="fr-FR"/>
                         </w:rPr>
-                        <w:t>Loop</w:t>
-                      </w:r>
+                        <w:t>Loopj</w:t>
+                      </w:r>
+                      <w:proofErr w:type="spellEnd"/>
                       <w:r>
                         <w:rPr>
                           <w:rFonts w:ascii="Inter" w:hAnsi="Inter" w:cs="Arial"/>
@@ -2570,9 +2723,9 @@
                           <w:szCs w:val="18"/>
                           <w:lang w:val="fr-FR"/>
                         </w:rPr>
-                        <w:t>j</w:t>
-                      </w:r>
-                      <w:proofErr w:type="spellEnd"/>
+                        <w:t xml:space="preserve">, Google </w:t>
+                      </w:r>
+                      <w:proofErr w:type="spellStart"/>
                       <w:r>
                         <w:rPr>
                           <w:rFonts w:ascii="Inter" w:hAnsi="Inter" w:cs="Arial"/>
@@ -2582,8 +2735,9 @@
                           <w:szCs w:val="18"/>
                           <w:lang w:val="fr-FR"/>
                         </w:rPr>
-                        <w:t xml:space="preserve">, Google </w:t>
-                      </w:r>
+                        <w:t>Map</w:t>
+                      </w:r>
+                      <w:proofErr w:type="spellEnd"/>
                       <w:r>
                         <w:rPr>
                           <w:rFonts w:ascii="Inter" w:hAnsi="Inter" w:cs="Arial"/>
@@ -2593,18 +2747,7 @@
                           <w:szCs w:val="18"/>
                           <w:lang w:val="fr-FR"/>
                         </w:rPr>
-                        <w:t>M</w:t>
-                      </w:r>
-                      <w:r>
-                        <w:rPr>
-                          <w:rFonts w:ascii="Inter" w:hAnsi="Inter" w:cs="Arial"/>
-                          <w:color w:val="767171"/>
-                          <w:kern w:val="24"/>
-                          <w:sz w:val="18"/>
-                          <w:szCs w:val="18"/>
-                          <w:lang w:val="fr-FR"/>
-                        </w:rPr>
-                        <w:t>ap, FCM, ION, Picasso, Glide</w:t>
+                        <w:t>, FCM, ION, Picasso, Glide</w:t>
                       </w:r>
                     </w:p>
                     <w:p>
@@ -2964,7 +3107,7 @@
                                 <w:szCs w:val="16"/>
                                 <w:lang w:bidi="bn-BD"/>
                               </w:rPr>
-                              <w:t>Refactored Apogram, a web-based app</w:t>
+                              <w:t>Refactored Ap</w:t>
                             </w:r>
                             <w:r>
                               <w:rPr>
@@ -2974,7 +3117,17 @@
                                 <w:szCs w:val="16"/>
                                 <w:lang w:bidi="bn-BD"/>
                               </w:rPr>
-                              <w:t xml:space="preserve"> builder, creating over 40 custom views to enable building enterprise apps.</w:t>
+                              <w:t>p</w:t>
+                            </w:r>
+                            <w:r>
+                              <w:rPr>
+                                <w:rFonts w:ascii="Roboto" w:hAnsi="Roboto" w:cs="Roboto"/>
+                                <w:color w:val="000000"/>
+                                <w:sz w:val="16"/>
+                                <w:szCs w:val="16"/>
+                                <w:lang w:bidi="bn-BD"/>
+                              </w:rPr>
+                              <w:t>ogram, a web-based app builder, creating over 40 custom views to enable building enterprise apps.</w:t>
                             </w:r>
                           </w:p>
                           <w:p>
@@ -3067,9 +3220,8 @@
                                 <w:szCs w:val="16"/>
                                 <w:lang w:bidi="bn-BD"/>
                               </w:rPr>
-                              <w:t xml:space="preserve">Engineered an intuitive UI/UX resulting in a </w:t>
-                            </w:r>
-                            <w:proofErr w:type="gramStart"/>
+                              <w:t>Engineered an intuitive UI/UX resulting in a 4.3</w:t>
+                            </w:r>
                             <w:r>
                               <w:rPr>
                                 <w:rFonts w:ascii="Roboto" w:hAnsi="Roboto" w:cs="Roboto"/>
@@ -3078,9 +3230,8 @@
                                 <w:szCs w:val="16"/>
                                 <w:lang w:bidi="bn-BD"/>
                               </w:rPr>
-                              <w:t>4.3 star</w:t>
-                            </w:r>
-                            <w:proofErr w:type="gramEnd"/>
+                              <w:t xml:space="preserve"> S</w:t>
+                            </w:r>
                             <w:r>
                               <w:rPr>
                                 <w:rFonts w:ascii="Roboto" w:hAnsi="Roboto" w:cs="Roboto"/>
@@ -3089,7 +3240,7 @@
                                 <w:szCs w:val="16"/>
                                 <w:lang w:bidi="bn-BD"/>
                               </w:rPr>
-                              <w:t xml:space="preserve"> app rating from over 50,000 users within 2 months of launch.</w:t>
+                              <w:t>tar app rating from over 50,000 users within 2 months of launch.</w:t>
                             </w:r>
                           </w:p>
                           <w:p>
@@ -3173,7 +3324,7 @@
                           <w:szCs w:val="16"/>
                           <w:lang w:bidi="bn-BD"/>
                         </w:rPr>
-                        <w:t>Refactored Apogram, a web-based app</w:t>
+                        <w:t>Refactored Ap</w:t>
                       </w:r>
                       <w:r>
                         <w:rPr>
@@ -3183,7 +3334,17 @@
                           <w:szCs w:val="16"/>
                           <w:lang w:bidi="bn-BD"/>
                         </w:rPr>
-                        <w:t xml:space="preserve"> builder, creating over 40 custom views to enable building enterprise apps.</w:t>
+                        <w:t>p</w:t>
+                      </w:r>
+                      <w:r>
+                        <w:rPr>
+                          <w:rFonts w:ascii="Roboto" w:hAnsi="Roboto" w:cs="Roboto"/>
+                          <w:color w:val="000000"/>
+                          <w:sz w:val="16"/>
+                          <w:szCs w:val="16"/>
+                          <w:lang w:bidi="bn-BD"/>
+                        </w:rPr>
+                        <w:t>ogram, a web-based app builder, creating over 40 custom views to enable building enterprise apps.</w:t>
                       </w:r>
                     </w:p>
                     <w:p>
@@ -3276,9 +3437,8 @@
                           <w:szCs w:val="16"/>
                           <w:lang w:bidi="bn-BD"/>
                         </w:rPr>
-                        <w:t xml:space="preserve">Engineered an intuitive UI/UX resulting in a </w:t>
-                      </w:r>
-                      <w:proofErr w:type="gramStart"/>
+                        <w:t>Engineered an intuitive UI/UX resulting in a 4.3</w:t>
+                      </w:r>
                       <w:r>
                         <w:rPr>
                           <w:rFonts w:ascii="Roboto" w:hAnsi="Roboto" w:cs="Roboto"/>
@@ -3287,9 +3447,8 @@
                           <w:szCs w:val="16"/>
                           <w:lang w:bidi="bn-BD"/>
                         </w:rPr>
-                        <w:t>4.3 star</w:t>
-                      </w:r>
-                      <w:proofErr w:type="gramEnd"/>
+                        <w:t xml:space="preserve"> S</w:t>
+                      </w:r>
                       <w:r>
                         <w:rPr>
                           <w:rFonts w:ascii="Roboto" w:hAnsi="Roboto" w:cs="Roboto"/>
@@ -3298,7 +3457,7 @@
                           <w:szCs w:val="16"/>
                           <w:lang w:bidi="bn-BD"/>
                         </w:rPr>
-                        <w:t xml:space="preserve"> app rating from over 50,000 users within 2 months of launch.</w:t>
+                        <w:t>tar app rating from over 50,000 users within 2 months of launch.</w:t>
                       </w:r>
                     </w:p>
                     <w:p>
@@ -3496,6 +3655,113 @@
                                 <w:szCs w:val="16"/>
                               </w:rPr>
                             </w:pPr>
+                            <w:r>
+                              <w:fldChar w:fldCharType="begin"/>
+                            </w:r>
+                            <w:r>
+                              <w:instrText>HYPERLINK "https://app.esfahansteel.ir/"</w:instrText>
+                            </w:r>
+                            <w:r>
+                              <w:fldChar w:fldCharType="separate"/>
+                            </w:r>
+                            <w:r>
+                              <w:rPr>
+                                <w:rStyle w:val="Hyperlink"/>
+                                <w:rFonts w:ascii="Roboto Medium" w:eastAsiaTheme="minorHAnsi" w:hAnsi="Roboto Medium" w:cs="Roboto Medium"/>
+                                <w:bCs/>
+                                <w:color w:val="000000" w:themeColor="text1"/>
+                                <w:sz w:val="16"/>
+                                <w:szCs w:val="16"/>
+                                <w14:shadow w14:blurRad="38100" w14:dist="19050" w14:dir="2700000" w14:sx="100000" w14:sy="100000" w14:kx="0" w14:ky="0" w14:algn="tl">
+                                  <w14:schemeClr w14:val="dk1">
+                                    <w14:alpha w14:val="60000"/>
+                                  </w14:schemeClr>
+                                </w14:shadow>
+                                <w14:textOutline w14:w="0" w14:cap="flat" w14:cmpd="sng" w14:algn="ctr">
+                                  <w14:noFill/>
+                                  <w14:prstDash w14:val="solid"/>
+                                  <w14:round/>
+                                </w14:textOutline>
+                              </w:rPr>
+                              <w:t>Aaniro</w:t>
+                            </w:r>
+                            <w:r>
+                              <w:rPr>
+                                <w:rStyle w:val="Hyperlink"/>
+                                <w:rFonts w:ascii="Roboto Medium" w:eastAsiaTheme="minorHAnsi" w:hAnsi="Roboto Medium" w:cs="Roboto Medium"/>
+                                <w:bCs/>
+                                <w:color w:val="000000" w:themeColor="text1"/>
+                                <w:sz w:val="16"/>
+                                <w:szCs w:val="16"/>
+                                <w14:shadow w14:blurRad="38100" w14:dist="19050" w14:dir="2700000" w14:sx="100000" w14:sy="100000" w14:kx="0" w14:ky="0" w14:algn="tl">
+                                  <w14:schemeClr w14:val="dk1">
+                                    <w14:alpha w14:val="60000"/>
+                                  </w14:schemeClr>
+                                </w14:shadow>
+                                <w14:textOutline w14:w="0" w14:cap="flat" w14:cmpd="sng" w14:algn="ctr">
+                                  <w14:noFill/>
+                                  <w14:prstDash w14:val="solid"/>
+                                  <w14:round/>
+                                </w14:textOutline>
+                              </w:rPr>
+                              <w:fldChar w:fldCharType="end"/>
+                            </w:r>
+                            <w:r>
+                              <w:rPr>
+                                <w:rFonts w:ascii="Roboto Medium" w:eastAsiaTheme="minorHAnsi" w:hAnsi="Roboto Medium" w:cs="Roboto Medium"/>
+                                <w:bCs/>
+                                <w:color w:val="000000" w:themeColor="text1"/>
+                                <w:sz w:val="16"/>
+                                <w:szCs w:val="16"/>
+                                <w14:shadow w14:blurRad="38100" w14:dist="19050" w14:dir="2700000" w14:sx="100000" w14:sy="100000" w14:kx="0" w14:ky="0" w14:algn="tl">
+                                  <w14:schemeClr w14:val="dk1">
+                                    <w14:alpha w14:val="60000"/>
+                                  </w14:schemeClr>
+                                </w14:shadow>
+                                <w14:textOutline w14:w="0" w14:cap="flat" w14:cmpd="sng" w14:algn="ctr">
+                                  <w14:noFill/>
+                                  <w14:prstDash w14:val="solid"/>
+                                  <w14:round/>
+                                </w14:textOutline>
+                              </w:rPr>
+                              <w:t xml:space="preserve"> </w:t>
+                            </w:r>
+                            <w:r>
+                              <w:rPr>
+                                <w:rFonts w:ascii="Roboto Medium" w:eastAsiaTheme="minorHAnsi" w:hAnsi="Roboto Medium" w:cs="Roboto Medium"/>
+                                <w:color w:val="000000"/>
+                                <w:sz w:val="16"/>
+                                <w:szCs w:val="16"/>
+                              </w:rPr>
+                              <w:t xml:space="preserve">          </w:t>
+                            </w:r>
+                            <w:r>
+                              <w:rPr>
+                                <w:rFonts w:ascii="Roboto Medium" w:eastAsiaTheme="minorHAnsi" w:hAnsi="Roboto Medium" w:cs="Roboto Medium"/>
+                                <w:color w:val="000000"/>
+                                <w:sz w:val="16"/>
+                                <w:szCs w:val="16"/>
+                              </w:rPr>
+                              <w:t xml:space="preserve">       </w:t>
+                            </w:r>
+                            <w:r>
+                              <w:rPr>
+                                <w:rFonts w:ascii="Roboto Medium" w:eastAsiaTheme="minorHAnsi" w:hAnsi="Roboto Medium" w:cs="Roboto Medium"/>
+                                <w:color w:val="000000"/>
+                                <w:sz w:val="16"/>
+                                <w:szCs w:val="16"/>
+                              </w:rPr>
+                              <w:t>transportation</w:t>
+                            </w:r>
+                            <w:r>
+                              <w:rPr>
+                                <w:rFonts w:ascii="Roboto Medium" w:eastAsiaTheme="minorHAnsi" w:hAnsi="Roboto Medium" w:cs="Roboto Medium"/>
+                                <w:color w:val="000000"/>
+                                <w:sz w:val="16"/>
+                                <w:szCs w:val="16"/>
+                              </w:rPr>
+                              <w:br/>
+                            </w:r>
                             <w:hyperlink r:id="rId5" w:history="1">
                               <w:r>
                                 <w:rPr>
@@ -3516,7 +3782,49 @@
                                     <w14:round/>
                                   </w14:textOutline>
                                 </w:rPr>
-                                <w:t>Appogram</w:t>
+                                <w:t>App</w:t>
+                              </w:r>
+                              <w:r>
+                                <w:rPr>
+                                  <w:rStyle w:val="Hyperlink"/>
+                                  <w:rFonts w:ascii="Roboto Medium" w:eastAsiaTheme="minorHAnsi" w:hAnsi="Roboto Medium" w:cs="Roboto Medium"/>
+                                  <w:bCs/>
+                                  <w:color w:val="000000" w:themeColor="text1"/>
+                                  <w:sz w:val="16"/>
+                                  <w:szCs w:val="16"/>
+                                  <w14:shadow w14:blurRad="38100" w14:dist="19050" w14:dir="2700000" w14:sx="100000" w14:sy="100000" w14:kx="0" w14:ky="0" w14:algn="tl">
+                                    <w14:schemeClr w14:val="dk1">
+                                      <w14:alpha w14:val="60000"/>
+                                    </w14:schemeClr>
+                                  </w14:shadow>
+                                  <w14:textOutline w14:w="0" w14:cap="flat" w14:cmpd="sng" w14:algn="ctr">
+                                    <w14:noFill/>
+                                    <w14:prstDash w14:val="solid"/>
+                                    <w14:round/>
+                                  </w14:textOutline>
+                                </w:rPr>
+                                <w:t>o</w:t>
+                              </w:r>
+                              <w:r>
+                                <w:rPr>
+                                  <w:rStyle w:val="Hyperlink"/>
+                                  <w:rFonts w:ascii="Roboto Medium" w:eastAsiaTheme="minorHAnsi" w:hAnsi="Roboto Medium" w:cs="Roboto Medium"/>
+                                  <w:bCs/>
+                                  <w:color w:val="000000" w:themeColor="text1"/>
+                                  <w:sz w:val="16"/>
+                                  <w:szCs w:val="16"/>
+                                  <w14:shadow w14:blurRad="38100" w14:dist="19050" w14:dir="2700000" w14:sx="100000" w14:sy="100000" w14:kx="0" w14:ky="0" w14:algn="tl">
+                                    <w14:schemeClr w14:val="dk1">
+                                      <w14:alpha w14:val="60000"/>
+                                    </w14:schemeClr>
+                                  </w14:shadow>
+                                  <w14:textOutline w14:w="0" w14:cap="flat" w14:cmpd="sng" w14:algn="ctr">
+                                    <w14:noFill/>
+                                    <w14:prstDash w14:val="solid"/>
+                                    <w14:round/>
+                                  </w14:textOutline>
+                                </w:rPr>
+                                <w:t>gram</w:t>
                               </w:r>
                             </w:hyperlink>
                             <w:r>
@@ -3650,7 +3958,49 @@
                                     <w14:round/>
                                   </w14:textOutline>
                                 </w:rPr>
-                                <w:t>Tirazh</w:t>
+                                <w:t>Tir</w:t>
+                              </w:r>
+                              <w:r>
+                                <w:rPr>
+                                  <w:rStyle w:val="Hyperlink"/>
+                                  <w:rFonts w:ascii="Roboto Medium" w:eastAsiaTheme="minorHAnsi" w:hAnsi="Roboto Medium" w:cs="Roboto Medium"/>
+                                  <w:bCs/>
+                                  <w:color w:val="000000" w:themeColor="text1"/>
+                                  <w:sz w:val="16"/>
+                                  <w:szCs w:val="16"/>
+                                  <w14:shadow w14:blurRad="38100" w14:dist="19050" w14:dir="2700000" w14:sx="100000" w14:sy="100000" w14:kx="0" w14:ky="0" w14:algn="tl">
+                                    <w14:schemeClr w14:val="dk1">
+                                      <w14:alpha w14:val="60000"/>
+                                    </w14:schemeClr>
+                                  </w14:shadow>
+                                  <w14:textOutline w14:w="0" w14:cap="flat" w14:cmpd="sng" w14:algn="ctr">
+                                    <w14:noFill/>
+                                    <w14:prstDash w14:val="solid"/>
+                                    <w14:round/>
+                                  </w14:textOutline>
+                                </w:rPr>
+                                <w:t>a</w:t>
+                              </w:r>
+                              <w:r>
+                                <w:rPr>
+                                  <w:rStyle w:val="Hyperlink"/>
+                                  <w:rFonts w:ascii="Roboto Medium" w:eastAsiaTheme="minorHAnsi" w:hAnsi="Roboto Medium" w:cs="Roboto Medium"/>
+                                  <w:bCs/>
+                                  <w:color w:val="000000" w:themeColor="text1"/>
+                                  <w:sz w:val="16"/>
+                                  <w:szCs w:val="16"/>
+                                  <w14:shadow w14:blurRad="38100" w14:dist="19050" w14:dir="2700000" w14:sx="100000" w14:sy="100000" w14:kx="0" w14:ky="0" w14:algn="tl">
+                                    <w14:schemeClr w14:val="dk1">
+                                      <w14:alpha w14:val="60000"/>
+                                    </w14:schemeClr>
+                                  </w14:shadow>
+                                  <w14:textOutline w14:w="0" w14:cap="flat" w14:cmpd="sng" w14:algn="ctr">
+                                    <w14:noFill/>
+                                    <w14:prstDash w14:val="solid"/>
+                                    <w14:round/>
+                                  </w14:textOutline>
+                                </w:rPr>
+                                <w:t>zh</w:t>
                               </w:r>
                             </w:hyperlink>
                             <w:r>
@@ -3984,6 +4334,113 @@
                           <w:szCs w:val="16"/>
                         </w:rPr>
                       </w:pPr>
+                      <w:r>
+                        <w:fldChar w:fldCharType="begin"/>
+                      </w:r>
+                      <w:r>
+                        <w:instrText>HYPERLINK "https://app.esfahansteel.ir/"</w:instrText>
+                      </w:r>
+                      <w:r>
+                        <w:fldChar w:fldCharType="separate"/>
+                      </w:r>
+                      <w:r>
+                        <w:rPr>
+                          <w:rStyle w:val="Hyperlink"/>
+                          <w:rFonts w:ascii="Roboto Medium" w:eastAsiaTheme="minorHAnsi" w:hAnsi="Roboto Medium" w:cs="Roboto Medium"/>
+                          <w:bCs/>
+                          <w:color w:val="000000" w:themeColor="text1"/>
+                          <w:sz w:val="16"/>
+                          <w:szCs w:val="16"/>
+                          <w14:shadow w14:blurRad="38100" w14:dist="19050" w14:dir="2700000" w14:sx="100000" w14:sy="100000" w14:kx="0" w14:ky="0" w14:algn="tl">
+                            <w14:schemeClr w14:val="dk1">
+                              <w14:alpha w14:val="60000"/>
+                            </w14:schemeClr>
+                          </w14:shadow>
+                          <w14:textOutline w14:w="0" w14:cap="flat" w14:cmpd="sng" w14:algn="ctr">
+                            <w14:noFill/>
+                            <w14:prstDash w14:val="solid"/>
+                            <w14:round/>
+                          </w14:textOutline>
+                        </w:rPr>
+                        <w:t>Aaniro</w:t>
+                      </w:r>
+                      <w:r>
+                        <w:rPr>
+                          <w:rStyle w:val="Hyperlink"/>
+                          <w:rFonts w:ascii="Roboto Medium" w:eastAsiaTheme="minorHAnsi" w:hAnsi="Roboto Medium" w:cs="Roboto Medium"/>
+                          <w:bCs/>
+                          <w:color w:val="000000" w:themeColor="text1"/>
+                          <w:sz w:val="16"/>
+                          <w:szCs w:val="16"/>
+                          <w14:shadow w14:blurRad="38100" w14:dist="19050" w14:dir="2700000" w14:sx="100000" w14:sy="100000" w14:kx="0" w14:ky="0" w14:algn="tl">
+                            <w14:schemeClr w14:val="dk1">
+                              <w14:alpha w14:val="60000"/>
+                            </w14:schemeClr>
+                          </w14:shadow>
+                          <w14:textOutline w14:w="0" w14:cap="flat" w14:cmpd="sng" w14:algn="ctr">
+                            <w14:noFill/>
+                            <w14:prstDash w14:val="solid"/>
+                            <w14:round/>
+                          </w14:textOutline>
+                        </w:rPr>
+                        <w:fldChar w:fldCharType="end"/>
+                      </w:r>
+                      <w:r>
+                        <w:rPr>
+                          <w:rFonts w:ascii="Roboto Medium" w:eastAsiaTheme="minorHAnsi" w:hAnsi="Roboto Medium" w:cs="Roboto Medium"/>
+                          <w:bCs/>
+                          <w:color w:val="000000" w:themeColor="text1"/>
+                          <w:sz w:val="16"/>
+                          <w:szCs w:val="16"/>
+                          <w14:shadow w14:blurRad="38100" w14:dist="19050" w14:dir="2700000" w14:sx="100000" w14:sy="100000" w14:kx="0" w14:ky="0" w14:algn="tl">
+                            <w14:schemeClr w14:val="dk1">
+                              <w14:alpha w14:val="60000"/>
+                            </w14:schemeClr>
+                          </w14:shadow>
+                          <w14:textOutline w14:w="0" w14:cap="flat" w14:cmpd="sng" w14:algn="ctr">
+                            <w14:noFill/>
+                            <w14:prstDash w14:val="solid"/>
+                            <w14:round/>
+                          </w14:textOutline>
+                        </w:rPr>
+                        <w:t xml:space="preserve"> </w:t>
+                      </w:r>
+                      <w:r>
+                        <w:rPr>
+                          <w:rFonts w:ascii="Roboto Medium" w:eastAsiaTheme="minorHAnsi" w:hAnsi="Roboto Medium" w:cs="Roboto Medium"/>
+                          <w:color w:val="000000"/>
+                          <w:sz w:val="16"/>
+                          <w:szCs w:val="16"/>
+                        </w:rPr>
+                        <w:t xml:space="preserve">          </w:t>
+                      </w:r>
+                      <w:r>
+                        <w:rPr>
+                          <w:rFonts w:ascii="Roboto Medium" w:eastAsiaTheme="minorHAnsi" w:hAnsi="Roboto Medium" w:cs="Roboto Medium"/>
+                          <w:color w:val="000000"/>
+                          <w:sz w:val="16"/>
+                          <w:szCs w:val="16"/>
+                        </w:rPr>
+                        <w:t xml:space="preserve">       </w:t>
+                      </w:r>
+                      <w:r>
+                        <w:rPr>
+                          <w:rFonts w:ascii="Roboto Medium" w:eastAsiaTheme="minorHAnsi" w:hAnsi="Roboto Medium" w:cs="Roboto Medium"/>
+                          <w:color w:val="000000"/>
+                          <w:sz w:val="16"/>
+                          <w:szCs w:val="16"/>
+                        </w:rPr>
+                        <w:t>transportation</w:t>
+                      </w:r>
+                      <w:r>
+                        <w:rPr>
+                          <w:rFonts w:ascii="Roboto Medium" w:eastAsiaTheme="minorHAnsi" w:hAnsi="Roboto Medium" w:cs="Roboto Medium"/>
+                          <w:color w:val="000000"/>
+                          <w:sz w:val="16"/>
+                          <w:szCs w:val="16"/>
+                        </w:rPr>
+                        <w:br/>
+                      </w:r>
                       <w:hyperlink r:id="rId10" w:history="1">
                         <w:r>
                           <w:rPr>
@@ -4004,7 +4461,49 @@
                               <w14:round/>
                             </w14:textOutline>
                           </w:rPr>
-                          <w:t>Appogram</w:t>
+                          <w:t>App</w:t>
+                        </w:r>
+                        <w:r>
+                          <w:rPr>
+                            <w:rStyle w:val="Hyperlink"/>
+                            <w:rFonts w:ascii="Roboto Medium" w:eastAsiaTheme="minorHAnsi" w:hAnsi="Roboto Medium" w:cs="Roboto Medium"/>
+                            <w:bCs/>
+                            <w:color w:val="000000" w:themeColor="text1"/>
+                            <w:sz w:val="16"/>
+                            <w:szCs w:val="16"/>
+                            <w14:shadow w14:blurRad="38100" w14:dist="19050" w14:dir="2700000" w14:sx="100000" w14:sy="100000" w14:kx="0" w14:ky="0" w14:algn="tl">
+                              <w14:schemeClr w14:val="dk1">
+                                <w14:alpha w14:val="60000"/>
+                              </w14:schemeClr>
+                            </w14:shadow>
+                            <w14:textOutline w14:w="0" w14:cap="flat" w14:cmpd="sng" w14:algn="ctr">
+                              <w14:noFill/>
+                              <w14:prstDash w14:val="solid"/>
+                              <w14:round/>
+                            </w14:textOutline>
+                          </w:rPr>
+                          <w:t>o</w:t>
+                        </w:r>
+                        <w:r>
+                          <w:rPr>
+                            <w:rStyle w:val="Hyperlink"/>
+                            <w:rFonts w:ascii="Roboto Medium" w:eastAsiaTheme="minorHAnsi" w:hAnsi="Roboto Medium" w:cs="Roboto Medium"/>
+                            <w:bCs/>
+                            <w:color w:val="000000" w:themeColor="text1"/>
+                            <w:sz w:val="16"/>
+                            <w:szCs w:val="16"/>
+                            <w14:shadow w14:blurRad="38100" w14:dist="19050" w14:dir="2700000" w14:sx="100000" w14:sy="100000" w14:kx="0" w14:ky="0" w14:algn="tl">
+                              <w14:schemeClr w14:val="dk1">
+                                <w14:alpha w14:val="60000"/>
+                              </w14:schemeClr>
+                            </w14:shadow>
+                            <w14:textOutline w14:w="0" w14:cap="flat" w14:cmpd="sng" w14:algn="ctr">
+                              <w14:noFill/>
+                              <w14:prstDash w14:val="solid"/>
+                              <w14:round/>
+                            </w14:textOutline>
+                          </w:rPr>
+                          <w:t>gram</w:t>
                         </w:r>
                       </w:hyperlink>
                       <w:r>
@@ -4138,7 +4637,49 @@
                               <w14:round/>
                             </w14:textOutline>
                           </w:rPr>
-                          <w:t>Tirazh</w:t>
+                          <w:t>Tir</w:t>
+                        </w:r>
+                        <w:r>
+                          <w:rPr>
+                            <w:rStyle w:val="Hyperlink"/>
+                            <w:rFonts w:ascii="Roboto Medium" w:eastAsiaTheme="minorHAnsi" w:hAnsi="Roboto Medium" w:cs="Roboto Medium"/>
+                            <w:bCs/>
+                            <w:color w:val="000000" w:themeColor="text1"/>
+                            <w:sz w:val="16"/>
+                            <w:szCs w:val="16"/>
+                            <w14:shadow w14:blurRad="38100" w14:dist="19050" w14:dir="2700000" w14:sx="100000" w14:sy="100000" w14:kx="0" w14:ky="0" w14:algn="tl">
+                              <w14:schemeClr w14:val="dk1">
+                                <w14:alpha w14:val="60000"/>
+                              </w14:schemeClr>
+                            </w14:shadow>
+                            <w14:textOutline w14:w="0" w14:cap="flat" w14:cmpd="sng" w14:algn="ctr">
+                              <w14:noFill/>
+                              <w14:prstDash w14:val="solid"/>
+                              <w14:round/>
+                            </w14:textOutline>
+                          </w:rPr>
+                          <w:t>a</w:t>
+                        </w:r>
+                        <w:r>
+                          <w:rPr>
+                            <w:rStyle w:val="Hyperlink"/>
+                            <w:rFonts w:ascii="Roboto Medium" w:eastAsiaTheme="minorHAnsi" w:hAnsi="Roboto Medium" w:cs="Roboto Medium"/>
+                            <w:bCs/>
+                            <w:color w:val="000000" w:themeColor="text1"/>
+                            <w:sz w:val="16"/>
+                            <w:szCs w:val="16"/>
+                            <w14:shadow w14:blurRad="38100" w14:dist="19050" w14:dir="2700000" w14:sx="100000" w14:sy="100000" w14:kx="0" w14:ky="0" w14:algn="tl">
+                              <w14:schemeClr w14:val="dk1">
+                                <w14:alpha w14:val="60000"/>
+                              </w14:schemeClr>
+                            </w14:shadow>
+                            <w14:textOutline w14:w="0" w14:cap="flat" w14:cmpd="sng" w14:algn="ctr">
+                              <w14:noFill/>
+                              <w14:prstDash w14:val="solid"/>
+                              <w14:round/>
+                            </w14:textOutline>
+                          </w:rPr>
+                          <w:t>zh</w:t>
                         </w:r>
                       </w:hyperlink>
                       <w:r>
@@ -4647,8 +5188,20 @@
                                 <w:szCs w:val="16"/>
                                 <w:lang w:bidi="bn-BD"/>
                               </w:rPr>
-                              <w:t>Technical University of the Enghelab</w:t>
-                            </w:r>
+                              <w:t xml:space="preserve">Technical University of the </w:t>
+                            </w:r>
+                            <w:proofErr w:type="spellStart"/>
+                            <w:r>
+                              <w:rPr>
+                                <w:rFonts w:ascii="Roboto" w:hAnsi="Roboto" w:cs="Roboto"/>
+                                <w:color w:val="000000"/>
+                                <w:sz w:val="16"/>
+                                <w:szCs w:val="16"/>
+                                <w:lang w:bidi="bn-BD"/>
+                              </w:rPr>
+                              <w:t>Enghelab</w:t>
+                            </w:r>
+                            <w:proofErr w:type="spellEnd"/>
                             <w:r>
                               <w:rPr>
                                 <w:rFonts w:ascii="Roboto" w:hAnsi="Roboto" w:cs="Roboto"/>
@@ -4740,8 +5293,20 @@
                           <w:szCs w:val="16"/>
                           <w:lang w:bidi="bn-BD"/>
                         </w:rPr>
-                        <w:t>Technical University of the Enghelab</w:t>
-                      </w:r>
+                        <w:t xml:space="preserve">Technical University of the </w:t>
+                      </w:r>
+                      <w:proofErr w:type="spellStart"/>
+                      <w:r>
+                        <w:rPr>
+                          <w:rFonts w:ascii="Roboto" w:hAnsi="Roboto" w:cs="Roboto"/>
+                          <w:color w:val="000000"/>
+                          <w:sz w:val="16"/>
+                          <w:szCs w:val="16"/>
+                          <w:lang w:bidi="bn-BD"/>
+                        </w:rPr>
+                        <w:t>Enghelab</w:t>
+                      </w:r>
+                      <w:proofErr w:type="spellEnd"/>
                       <w:r>
                         <w:rPr>
                           <w:rFonts w:ascii="Roboto" w:hAnsi="Roboto" w:cs="Roboto"/>
@@ -5515,7 +6080,14 @@
                                 <w:rStyle w:val="Years"/>
                                 <w:spacing w:val="12"/>
                               </w:rPr>
-                              <w:t>022</w:t>
+                              <w:t>0</w:t>
+                            </w:r>
+                            <w:r>
+                              <w:rPr>
+                                <w:rStyle w:val="Years"/>
+                                <w:spacing w:val="12"/>
+                              </w:rPr>
+                              <w:t>19</w:t>
                             </w:r>
                             <w:r>
                               <w:rPr>
@@ -5539,7 +6111,17 @@
                                 <w:color w:val="AEAAAA" w:themeColor="background2" w:themeShade="BF"/>
                                 <w:spacing w:val="12"/>
                               </w:rPr>
-                              <w:t>~3</w:t>
+                              <w:t>~</w:t>
+                            </w:r>
+                            <w:r>
+                              <w:rPr>
+                                <w:rStyle w:val="Years"/>
+                                <w:i/>
+                                <w:iCs/>
+                                <w:color w:val="AEAAAA" w:themeColor="background2" w:themeShade="BF"/>
+                                <w:spacing w:val="12"/>
+                              </w:rPr>
+                              <w:t>4</w:t>
                             </w:r>
                             <w:r>
                               <w:rPr>
@@ -5775,7 +6357,14 @@
                           <w:rStyle w:val="Years"/>
                           <w:spacing w:val="12"/>
                         </w:rPr>
-                        <w:t>022</w:t>
+                        <w:t>0</w:t>
+                      </w:r>
+                      <w:r>
+                        <w:rPr>
+                          <w:rStyle w:val="Years"/>
+                          <w:spacing w:val="12"/>
+                        </w:rPr>
+                        <w:t>19</w:t>
                       </w:r>
                       <w:r>
                         <w:rPr>
@@ -5799,7 +6388,17 @@
                           <w:color w:val="AEAAAA" w:themeColor="background2" w:themeShade="BF"/>
                           <w:spacing w:val="12"/>
                         </w:rPr>
-                        <w:t>~3</w:t>
+                        <w:t>~</w:t>
+                      </w:r>
+                      <w:r>
+                        <w:rPr>
+                          <w:rStyle w:val="Years"/>
+                          <w:i/>
+                          <w:iCs/>
+                          <w:color w:val="AEAAAA" w:themeColor="background2" w:themeShade="BF"/>
+                          <w:spacing w:val="12"/>
+                        </w:rPr>
+                        <w:t>4</w:t>
                       </w:r>
                       <w:r>
                         <w:rPr>
@@ -7641,7 +8240,7 @@
           </mc:Choice>
           <mc:Fallback>
             <w:pict>
-              <v:line w14:anchorId="437EA687" id="Straight Connector 6" o:spid="_x0000_s1026" style="position:absolute;z-index:251646976;visibility:visible;mso-wrap-style:square;mso-width-percent:0;mso-wrap-distance-left:9pt;mso-wrap-distance-top:0;mso-wrap-distance-right:9pt;mso-wrap-distance-bottom:0;mso-position-horizontal:absolute;mso-position-horizontal-relative:text;mso-position-vertical:absolute;mso-position-vertical-relative:text;mso-width-percent:0;mso-width-relative:margin" from="-25.85pt,749.5pt" to="477.15pt,749.5pt" o:gfxdata="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" strokecolor="black [3200]" strokeweight=".5pt">
+              <v:line w14:anchorId="35D7F8EE" id="Straight Connector 6" o:spid="_x0000_s1026" style="position:absolute;z-index:251646976;visibility:visible;mso-wrap-style:square;mso-width-percent:0;mso-wrap-distance-left:9pt;mso-wrap-distance-top:0;mso-wrap-distance-right:9pt;mso-wrap-distance-bottom:0;mso-position-horizontal:absolute;mso-position-horizontal-relative:text;mso-position-vertical:absolute;mso-position-vertical-relative:text;mso-width-percent:0;mso-width-relative:margin" from="-25.85pt,749.5pt" to="477.15pt,749.5pt" o:gfxdata="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" strokecolor="black [3200]" strokeweight=".5pt">
                 <v:stroke joinstyle="miter"/>
               </v:line>
             </w:pict>
@@ -7721,7 +8320,7 @@
           </mc:Choice>
           <mc:Fallback>
             <w:pict>
-              <v:rect w14:anchorId="57F5064E" id="Rectangle 3" o:spid="_x0000_s1026" style="position:absolute;margin-left:-26.35pt;margin-top:-77.5pt;width:7in;height:15pt;z-index:251643904;visibility:visible;mso-wrap-style:square;mso-wrap-distance-left:9pt;mso-wrap-distance-top:0;mso-wrap-distance-right:9pt;mso-wrap-distance-bottom:0;mso-position-horizontal:absolute;mso-position-horizontal-relative:text;mso-position-vertical:absolute;mso-position-vertical-relative:text;v-text-anchor:middle" o:gfxdata="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" fillcolor="#5a5a5a [2109]" stroked="f" strokeweight="1pt"/>
+              <v:rect w14:anchorId="188F9422" id="Rectangle 3" o:spid="_x0000_s1026" style="position:absolute;margin-left:-26.35pt;margin-top:-77.5pt;width:7in;height:15pt;z-index:251643904;visibility:visible;mso-wrap-style:square;mso-wrap-distance-left:9pt;mso-wrap-distance-top:0;mso-wrap-distance-right:9pt;mso-wrap-distance-bottom:0;mso-position-horizontal:absolute;mso-position-horizontal-relative:text;mso-position-vertical:absolute;mso-position-vertical-relative:text;v-text-anchor:middle" o:gfxdata="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" fillcolor="#5a5a5a [2109]" stroked="f" strokeweight="1pt"/>
             </w:pict>
           </mc:Fallback>
         </mc:AlternateContent>

</xml_diff>

<commit_message>
Add the Aaniro project link
</commit_message>
<xml_diff>
--- a/assets/MalihehMoradi_resume.docx
+++ b/assets/MalihehMoradi_resume.docx
@@ -3,6 +3,135 @@
 <w:document xmlns:wpc="http://schemas.microsoft.com/office/word/2010/wordprocessingCanvas" xmlns:cx="http://schemas.microsoft.com/office/drawing/2014/chartex" xmlns:cx1="http://schemas.microsoft.com/office/drawing/2015/9/8/chartex" xmlns:cx2="http://schemas.microsoft.com/office/drawing/2015/10/21/chartex" xmlns:cx3="http://schemas.microsoft.com/office/drawing/2016/5/9/chartex" xmlns:cx4="http://schemas.microsoft.com/office/drawing/2016/5/10/chartex" xmlns:cx5="http://schemas.microsoft.com/office/drawing/2016/5/11/chartex" xmlns:cx6="http://schemas.microsoft.com/office/drawing/2016/5/12/chartex" xmlns:cx7="http://schemas.microsoft.com/office/drawing/2016/5/13/chartex" xmlns:cx8="http://schemas.microsoft.com/office/drawing/2016/5/14/chartex" xmlns:mc="http://schemas.openxmlformats.org/markup-compatibility/2006" xmlns:aink="http://schemas.microsoft.com/office/drawing/2016/ink" xmlns:am3d="http://schemas.microsoft.com/office/drawing/2017/model3d" xmlns:o="urn:schemas-microsoft-com:office:office" xmlns:oel="http://schemas.microsoft.com/office/2019/extlst" xmlns:r="http://schemas.openxmlformats.org/officeDocument/2006/relationships" xmlns:m="http://schemas.openxmlformats.org/officeDocument/2006/math" xmlns:v="urn:schemas-microsoft-com:vml" xmlns:wp14="http://schemas.microsoft.com/office/word/2010/wordprocessingDrawing" xmlns:wp="http://schemas.openxmlformats.org/drawingml/2006/wordprocessingDrawing" xmlns:w10="urn:schemas-microsoft-com:office:word" xmlns:w="http://schemas.openxmlformats.org/wordprocessingml/2006/main" xmlns:w14="http://schemas.microsoft.com/office/word/2010/wordml" xmlns:w15="http://schemas.microsoft.com/office/word/2012/wordml" xmlns:w16cex="http://schemas.microsoft.com/office/word/2018/wordml/cex" xmlns:w16cid="http://schemas.microsoft.com/office/word/2016/wordml/cid" xmlns:w16="http://schemas.microsoft.com/office/word/2018/wordml" xmlns:w16sdtdh="http://schemas.microsoft.com/office/word/2020/wordml/sdtdatahash" xmlns:w16se="http://schemas.microsoft.com/office/word/2015/wordml/symex" xmlns:wpg="http://schemas.microsoft.com/office/word/2010/wordprocessingGroup" xmlns:wpi="http://schemas.microsoft.com/office/word/2010/wordprocessingInk" xmlns:wne="http://schemas.microsoft.com/office/word/2006/wordml" xmlns:wps="http://schemas.microsoft.com/office/word/2010/wordprocessingShape" mc:Ignorable="w14 w15 w16se w16cid w16 w16cex w16sdtdh wp14">
   <w:body>
     <w:p>
+      <w:r>
+        <w:rPr>
+          <w:noProof/>
+        </w:rPr>
+        <mc:AlternateContent>
+          <mc:Choice Requires="wps">
+            <w:drawing>
+              <wp:anchor distT="0" distB="0" distL="114300" distR="114300" simplePos="0" relativeHeight="251719680" behindDoc="0" locked="0" layoutInCell="1" allowOverlap="1" wp14:anchorId="1CFD42C8" wp14:editId="3AF7A349">
+                <wp:simplePos x="0" y="0"/>
+                <wp:positionH relativeFrom="column">
+                  <wp:posOffset>3889948</wp:posOffset>
+                </wp:positionH>
+                <wp:positionV relativeFrom="paragraph">
+                  <wp:posOffset>7172793</wp:posOffset>
+                </wp:positionV>
+                <wp:extent cx="2684145" cy="532151"/>
+                <wp:effectExtent l="0" t="0" r="0" b="0"/>
+                <wp:wrapNone/>
+                <wp:docPr id="1690107712" name="Text Box 2"/>
+                <wp:cNvGraphicFramePr>
+                  <a:graphicFrameLocks xmlns:a="http://schemas.openxmlformats.org/drawingml/2006/main"/>
+                </wp:cNvGraphicFramePr>
+                <a:graphic xmlns:a="http://schemas.openxmlformats.org/drawingml/2006/main">
+                  <a:graphicData uri="http://schemas.microsoft.com/office/word/2010/wordprocessingShape">
+                    <wps:wsp>
+                      <wps:cNvSpPr txBox="1">
+                        <a:spLocks noChangeArrowheads="1"/>
+                      </wps:cNvSpPr>
+                      <wps:spPr bwMode="auto">
+                        <a:xfrm>
+                          <a:off x="0" y="0"/>
+                          <a:ext cx="2684145" cy="532151"/>
+                        </a:xfrm>
+                        <a:prstGeom prst="rect">
+                          <a:avLst/>
+                        </a:prstGeom>
+                        <a:noFill/>
+                        <a:ln w="9525">
+                          <a:noFill/>
+                          <a:miter lim="800000"/>
+                          <a:headEnd/>
+                          <a:tailEnd/>
+                        </a:ln>
+                      </wps:spPr>
+                      <wps:txbx>
+                        <w:txbxContent>
+                          <w:p>
+                            <w:pPr>
+                              <w:pStyle w:val="NormalWeb"/>
+                            </w:pPr>
+                            <w:r>
+                              <w:rPr>
+                                <w:rFonts w:ascii="Roboto" w:hAnsi="Roboto" w:cs="Roboto"/>
+                                <w:color w:val="000000"/>
+                                <w:sz w:val="16"/>
+                                <w:szCs w:val="16"/>
+                              </w:rPr>
+                              <w:t>Mentored over 20 junior Android developers by providing technical guidance and code reviews as they built their own projects from start to finish.</w:t>
+                            </w:r>
+                          </w:p>
+                          <w:p>
+                            <w:pPr>
+                              <w:spacing w:line="240" w:lineRule="auto"/>
+                              <w:rPr>
+                                <w:rFonts w:ascii="Roboto" w:hAnsi="Roboto" w:cs="Roboto"/>
+                                <w:color w:val="000000"/>
+                                <w:sz w:val="16"/>
+                                <w:szCs w:val="16"/>
+                              </w:rPr>
+                            </w:pPr>
+                          </w:p>
+                        </w:txbxContent>
+                      </wps:txbx>
+                      <wps:bodyPr rot="0" vert="horz" wrap="square" lIns="91440" tIns="45720" rIns="91440" bIns="45720" anchor="t" anchorCtr="0">
+                        <a:noAutofit/>
+                      </wps:bodyPr>
+                    </wps:wsp>
+                  </a:graphicData>
+                </a:graphic>
+                <wp14:sizeRelH relativeFrom="margin">
+                  <wp14:pctWidth>0</wp14:pctWidth>
+                </wp14:sizeRelH>
+                <wp14:sizeRelV relativeFrom="margin">
+                  <wp14:pctHeight>0</wp14:pctHeight>
+                </wp14:sizeRelV>
+              </wp:anchor>
+            </w:drawing>
+          </mc:Choice>
+          <mc:Fallback>
+            <w:pict>
+              <v:shapetype w14:anchorId="1CFD42C8" id="_x0000_t202" coordsize="21600,21600" o:spt="202" path="m,l,21600r21600,l21600,xe">
+                <v:stroke joinstyle="miter"/>
+                <v:path gradientshapeok="t" o:connecttype="rect"/>
+              </v:shapetype>
+              <v:shape id="Text Box 2" o:spid="_x0000_s1026" type="#_x0000_t202" style="position:absolute;margin-left:306.3pt;margin-top:564.8pt;width:211.35pt;height:41.9pt;z-index:251719680;visibility:visible;mso-wrap-style:square;mso-width-percent:0;mso-height-percent:0;mso-wrap-distance-left:9pt;mso-wrap-distance-top:0;mso-wrap-distance-right:9pt;mso-wrap-distance-bottom:0;mso-position-horizontal:absolute;mso-position-horizontal-relative:text;mso-position-vertical:absolute;mso-position-vertical-relative:text;mso-width-percent:0;mso-height-percent:0;mso-width-relative:margin;mso-height-relative:margin;v-text-anchor:top" o:gfxdata="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" filled="f" stroked="f">
+                <v:textbox>
+                  <w:txbxContent>
+                    <w:p>
+                      <w:pPr>
+                        <w:pStyle w:val="NormalWeb"/>
+                      </w:pPr>
+                      <w:r>
+                        <w:rPr>
+                          <w:rFonts w:ascii="Roboto" w:hAnsi="Roboto" w:cs="Roboto"/>
+                          <w:color w:val="000000"/>
+                          <w:sz w:val="16"/>
+                          <w:szCs w:val="16"/>
+                        </w:rPr>
+                        <w:t>Mentored over 20 junior Android developers by providing technical guidance and code reviews as they built their own projects from start to finish.</w:t>
+                      </w:r>
+                    </w:p>
+                    <w:p>
+                      <w:pPr>
+                        <w:spacing w:line="240" w:lineRule="auto"/>
+                        <w:rPr>
+                          <w:rFonts w:ascii="Roboto" w:hAnsi="Roboto" w:cs="Roboto"/>
+                          <w:color w:val="000000"/>
+                          <w:sz w:val="16"/>
+                          <w:szCs w:val="16"/>
+                        </w:rPr>
+                      </w:pPr>
+                    </w:p>
+                  </w:txbxContent>
+                </v:textbox>
+              </v:shape>
+            </w:pict>
+          </mc:Fallback>
+        </mc:AlternateContent>
+      </w:r>
       <w:r>
         <w:rPr>
           <w:noProof/>
@@ -82,11 +211,7 @@
           </mc:Choice>
           <mc:Fallback>
             <w:pict>
-              <v:shapetype w14:anchorId="0FCCC887" id="_x0000_t202" coordsize="21600,21600" o:spt="202" path="m,l,21600r21600,l21600,xe">
-                <v:stroke joinstyle="miter"/>
-                <v:path gradientshapeok="t" o:connecttype="rect"/>
-              </v:shapetype>
-              <v:shape id="Text Box 2" o:spid="_x0000_s1026" type="#_x0000_t202" style="position:absolute;margin-left:308.7pt;margin-top:539.9pt;width:115pt;height:28.5pt;z-index:251717632;visibility:visible;mso-wrap-style:square;mso-width-percent:0;mso-height-percent:0;mso-wrap-distance-left:9pt;mso-wrap-distance-top:3.6pt;mso-wrap-distance-right:9pt;mso-wrap-distance-bottom:3.6pt;mso-position-horizontal:absolute;mso-position-horizontal-relative:text;mso-position-vertical:absolute;mso-position-vertical-relative:text;mso-width-percent:0;mso-height-percent:0;mso-width-relative:margin;mso-height-relative:margin;v-text-anchor:top" o:gfxdata="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" filled="f" stroked="f">
+              <v:shape w14:anchorId="0FCCC887" id="_x0000_s1027" type="#_x0000_t202" style="position:absolute;margin-left:308.7pt;margin-top:539.9pt;width:115pt;height:28.5pt;z-index:251717632;visibility:visible;mso-wrap-style:square;mso-width-percent:0;mso-height-percent:0;mso-wrap-distance-left:9pt;mso-wrap-distance-top:3.6pt;mso-wrap-distance-right:9pt;mso-wrap-distance-bottom:3.6pt;mso-position-horizontal:absolute;mso-position-horizontal-relative:text;mso-position-vertical:absolute;mso-position-vertical-relative:text;mso-width-percent:0;mso-height-percent:0;mso-width-relative:margin;mso-height-relative:margin;v-text-anchor:top" o:gfxdata="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" filled="f" stroked="f">
                 <v:textbox>
                   <w:txbxContent>
                     <w:p>
@@ -101,159 +226,6 @@
                           <w:color w:val="7030A0"/>
                         </w:rPr>
                         <w:t>Volunteer</w:t>
-                      </w:r>
-                    </w:p>
-                  </w:txbxContent>
-                </v:textbox>
-              </v:shape>
-            </w:pict>
-          </mc:Fallback>
-        </mc:AlternateContent>
-      </w:r>
-      <w:r>
-        <w:rPr>
-          <w:noProof/>
-        </w:rPr>
-        <mc:AlternateContent>
-          <mc:Choice Requires="wps">
-            <w:drawing>
-              <wp:anchor distT="0" distB="0" distL="114300" distR="114300" simplePos="0" relativeHeight="251719680" behindDoc="0" locked="0" layoutInCell="1" allowOverlap="1" wp14:anchorId="1CFD42C8" wp14:editId="3AF7A349">
-                <wp:simplePos x="0" y="0"/>
-                <wp:positionH relativeFrom="column">
-                  <wp:posOffset>3891280</wp:posOffset>
-                </wp:positionH>
-                <wp:positionV relativeFrom="paragraph">
-                  <wp:posOffset>7170930</wp:posOffset>
-                </wp:positionV>
-                <wp:extent cx="2684145" cy="819150"/>
-                <wp:effectExtent l="0" t="0" r="0" b="0"/>
-                <wp:wrapNone/>
-                <wp:docPr id="1690107712" name="Text Box 2"/>
-                <wp:cNvGraphicFramePr>
-                  <a:graphicFrameLocks xmlns:a="http://schemas.openxmlformats.org/drawingml/2006/main"/>
-                </wp:cNvGraphicFramePr>
-                <a:graphic xmlns:a="http://schemas.openxmlformats.org/drawingml/2006/main">
-                  <a:graphicData uri="http://schemas.microsoft.com/office/word/2010/wordprocessingShape">
-                    <wps:wsp>
-                      <wps:cNvSpPr txBox="1">
-                        <a:spLocks noChangeArrowheads="1"/>
-                      </wps:cNvSpPr>
-                      <wps:spPr bwMode="auto">
-                        <a:xfrm>
-                          <a:off x="0" y="0"/>
-                          <a:ext cx="2684145" cy="819150"/>
-                        </a:xfrm>
-                        <a:prstGeom prst="rect">
-                          <a:avLst/>
-                        </a:prstGeom>
-                        <a:noFill/>
-                        <a:ln w="9525">
-                          <a:noFill/>
-                          <a:miter lim="800000"/>
-                          <a:headEnd/>
-                          <a:tailEnd/>
-                        </a:ln>
-                      </wps:spPr>
-                      <wps:txbx>
-                        <w:txbxContent>
-                          <w:p>
-                            <w:pPr>
-                              <w:spacing w:line="240" w:lineRule="auto"/>
-                              <w:rPr>
-                                <w:rFonts w:ascii="Roboto" w:hAnsi="Roboto" w:cs="Roboto"/>
-                                <w:color w:val="000000"/>
-                                <w:sz w:val="16"/>
-                                <w:szCs w:val="16"/>
-                              </w:rPr>
-                            </w:pPr>
-                            <w:r>
-                              <w:rPr>
-                                <w:rFonts w:ascii="Roboto" w:hAnsi="Roboto" w:cs="Roboto"/>
-                                <w:color w:val="000000"/>
-                                <w:sz w:val="16"/>
-                                <w:szCs w:val="16"/>
-                              </w:rPr>
-                              <w:t>Contributed to front-end development of Apogram web app using ReactJS and implementing responsive layouts.</w:t>
-                            </w:r>
-                            <w:r>
-                              <w:rPr>
-                                <w:rFonts w:ascii="Roboto" w:hAnsi="Roboto" w:cs="Roboto"/>
-                                <w:color w:val="000000"/>
-                                <w:sz w:val="16"/>
-                                <w:szCs w:val="16"/>
-                                <w:rtl/>
-                              </w:rPr>
-                              <w:br/>
-                            </w:r>
-                            <w:r>
-                              <w:rPr>
-                                <w:rFonts w:ascii="Roboto" w:hAnsi="Roboto" w:cs="Roboto"/>
-                                <w:color w:val="000000"/>
-                                <w:sz w:val="16"/>
-                                <w:szCs w:val="16"/>
-                              </w:rPr>
-                              <w:t>Designed clean and intuitive UI/UX for Aaniro mobile app using Figma, optimizing user experience.</w:t>
-                            </w:r>
-                          </w:p>
-                        </w:txbxContent>
-                      </wps:txbx>
-                      <wps:bodyPr rot="0" vert="horz" wrap="square" lIns="91440" tIns="45720" rIns="91440" bIns="45720" anchor="t" anchorCtr="0">
-                        <a:noAutofit/>
-                      </wps:bodyPr>
-                    </wps:wsp>
-                  </a:graphicData>
-                </a:graphic>
-                <wp14:sizeRelH relativeFrom="margin">
-                  <wp14:pctWidth>0</wp14:pctWidth>
-                </wp14:sizeRelH>
-                <wp14:sizeRelV relativeFrom="margin">
-                  <wp14:pctHeight>0</wp14:pctHeight>
-                </wp14:sizeRelV>
-              </wp:anchor>
-            </w:drawing>
-          </mc:Choice>
-          <mc:Fallback>
-            <w:pict>
-              <v:shape w14:anchorId="1CFD42C8" id="_x0000_s1027" type="#_x0000_t202" style="position:absolute;margin-left:306.4pt;margin-top:564.65pt;width:211.35pt;height:64.5pt;z-index:251719680;visibility:visible;mso-wrap-style:square;mso-width-percent:0;mso-height-percent:0;mso-wrap-distance-left:9pt;mso-wrap-distance-top:0;mso-wrap-distance-right:9pt;mso-wrap-distance-bottom:0;mso-position-horizontal:absolute;mso-position-horizontal-relative:text;mso-position-vertical:absolute;mso-position-vertical-relative:text;mso-width-percent:0;mso-height-percent:0;mso-width-relative:margin;mso-height-relative:margin;v-text-anchor:top" o:gfxdata="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" filled="f" stroked="f">
-                <v:textbox>
-                  <w:txbxContent>
-                    <w:p>
-                      <w:pPr>
-                        <w:spacing w:line="240" w:lineRule="auto"/>
-                        <w:rPr>
-                          <w:rFonts w:ascii="Roboto" w:hAnsi="Roboto" w:cs="Roboto"/>
-                          <w:color w:val="000000"/>
-                          <w:sz w:val="16"/>
-                          <w:szCs w:val="16"/>
-                        </w:rPr>
-                      </w:pPr>
-                      <w:r>
-                        <w:rPr>
-                          <w:rFonts w:ascii="Roboto" w:hAnsi="Roboto" w:cs="Roboto"/>
-                          <w:color w:val="000000"/>
-                          <w:sz w:val="16"/>
-                          <w:szCs w:val="16"/>
-                        </w:rPr>
-                        <w:t>Contributed to front-end development of Apogram web app using ReactJS and implementing responsive layouts.</w:t>
-                      </w:r>
-                      <w:r>
-                        <w:rPr>
-                          <w:rFonts w:ascii="Roboto" w:hAnsi="Roboto" w:cs="Roboto"/>
-                          <w:color w:val="000000"/>
-                          <w:sz w:val="16"/>
-                          <w:szCs w:val="16"/>
-                          <w:rtl/>
-                        </w:rPr>
-                        <w:br/>
-                      </w:r>
-                      <w:r>
-                        <w:rPr>
-                          <w:rFonts w:ascii="Roboto" w:hAnsi="Roboto" w:cs="Roboto"/>
-                          <w:color w:val="000000"/>
-                          <w:sz w:val="16"/>
-                          <w:szCs w:val="16"/>
-                        </w:rPr>
-                        <w:t>Designed clean and intuitive UI/UX for Aaniro mobile app using Figma, optimizing user experience.</w:t>
                       </w:r>
                     </w:p>
                   </w:txbxContent>
@@ -557,8 +529,13 @@
                               <w:t>Hub</w:t>
                             </w:r>
                             <w:r>
-                              <w:t>, Gitlab, Gitflow</w:t>
-                            </w:r>
+                              <w:t xml:space="preserve">, Gitlab, </w:t>
+                            </w:r>
+                            <w:proofErr w:type="spellStart"/>
+                            <w:r>
+                              <w:t>Gitflow</w:t>
+                            </w:r>
+                            <w:proofErr w:type="spellEnd"/>
                           </w:p>
                           <w:p>
                             <w:pPr>
@@ -657,8 +634,13 @@
                               <w:t xml:space="preserve">: </w:t>
                             </w:r>
                             <w:r>
-                              <w:t>Coroutine, Flow, LiveData</w:t>
-                            </w:r>
+                              <w:t xml:space="preserve">Coroutine, Flow, </w:t>
+                            </w:r>
+                            <w:proofErr w:type="spellStart"/>
+                            <w:r>
+                              <w:t>LiveData</w:t>
+                            </w:r>
+                            <w:proofErr w:type="spellEnd"/>
                             <w:r>
                               <w:br/>
                             </w:r>
@@ -696,8 +678,9 @@
                                 <w:sz w:val="16"/>
                                 <w:szCs w:val="16"/>
                               </w:rPr>
-                              <w:t>Retrofit, GoogleMap, Fire</w:t>
-                            </w:r>
+                              <w:t xml:space="preserve">Retrofit, </w:t>
+                            </w:r>
+                            <w:proofErr w:type="spellStart"/>
                             <w:r>
                               <w:rPr>
                                 <w:rFonts w:ascii="Roboto" w:eastAsiaTheme="minorHAnsi" w:hAnsi="Roboto" w:cs="Roboto"/>
@@ -705,8 +688,9 @@
                                 <w:sz w:val="16"/>
                                 <w:szCs w:val="16"/>
                               </w:rPr>
-                              <w:t>b</w:t>
-                            </w:r>
+                              <w:t>GoogleMap</w:t>
+                            </w:r>
+                            <w:proofErr w:type="spellEnd"/>
                             <w:r>
                               <w:rPr>
                                 <w:rFonts w:ascii="Roboto" w:eastAsiaTheme="minorHAnsi" w:hAnsi="Roboto" w:cs="Roboto"/>
@@ -714,7 +698,45 @@
                                 <w:sz w:val="16"/>
                                 <w:szCs w:val="16"/>
                               </w:rPr>
-                              <w:t>ase, GoogleAnalytics, Data Binding, View Binding</w:t>
+                              <w:t>, Fire</w:t>
+                            </w:r>
+                            <w:r>
+                              <w:rPr>
+                                <w:rFonts w:ascii="Roboto" w:eastAsiaTheme="minorHAnsi" w:hAnsi="Roboto" w:cs="Roboto"/>
+                                <w:color w:val="000000"/>
+                                <w:sz w:val="16"/>
+                                <w:szCs w:val="16"/>
+                              </w:rPr>
+                              <w:t>b</w:t>
+                            </w:r>
+                            <w:r>
+                              <w:rPr>
+                                <w:rFonts w:ascii="Roboto" w:eastAsiaTheme="minorHAnsi" w:hAnsi="Roboto" w:cs="Roboto"/>
+                                <w:color w:val="000000"/>
+                                <w:sz w:val="16"/>
+                                <w:szCs w:val="16"/>
+                              </w:rPr>
+                              <w:t xml:space="preserve">ase, </w:t>
+                            </w:r>
+                            <w:proofErr w:type="spellStart"/>
+                            <w:r>
+                              <w:rPr>
+                                <w:rFonts w:ascii="Roboto" w:eastAsiaTheme="minorHAnsi" w:hAnsi="Roboto" w:cs="Roboto"/>
+                                <w:color w:val="000000"/>
+                                <w:sz w:val="16"/>
+                                <w:szCs w:val="16"/>
+                              </w:rPr>
+                              <w:t>GoogleAnalytics</w:t>
+                            </w:r>
+                            <w:proofErr w:type="spellEnd"/>
+                            <w:r>
+                              <w:rPr>
+                                <w:rFonts w:ascii="Roboto" w:eastAsiaTheme="minorHAnsi" w:hAnsi="Roboto" w:cs="Roboto"/>
+                                <w:color w:val="000000"/>
+                                <w:sz w:val="16"/>
+                                <w:szCs w:val="16"/>
+                              </w:rPr>
+                              <w:t>, Data Binding, View Binding</w:t>
                             </w:r>
                           </w:p>
                           <w:p>
@@ -1464,8 +1486,20 @@
                                 <w:szCs w:val="16"/>
                                 <w:lang w:bidi="bn-BD"/>
                               </w:rPr>
-                              <w:t>Technical University of the Enghelab</w:t>
-                            </w:r>
+                              <w:t xml:space="preserve">Technical University of the </w:t>
+                            </w:r>
+                            <w:proofErr w:type="spellStart"/>
+                            <w:r>
+                              <w:rPr>
+                                <w:rFonts w:ascii="Roboto" w:hAnsi="Roboto" w:cs="Roboto"/>
+                                <w:color w:val="000000"/>
+                                <w:sz w:val="16"/>
+                                <w:szCs w:val="16"/>
+                                <w:lang w:bidi="bn-BD"/>
+                              </w:rPr>
+                              <w:t>Enghelab</w:t>
+                            </w:r>
+                            <w:proofErr w:type="spellEnd"/>
                             <w:r>
                               <w:rPr>
                                 <w:rFonts w:ascii="Roboto" w:hAnsi="Roboto" w:cs="Roboto"/>
@@ -1877,6 +1911,7 @@
                                 <w:lang w:val="fr-FR"/>
                               </w:rPr>
                             </w:pPr>
+                            <w:proofErr w:type="spellStart"/>
                             <w:r>
                               <w:rPr>
                                 <w:rFonts w:ascii="Inter" w:hAnsi="Inter" w:cs="Arial"/>
@@ -1888,6 +1923,7 @@
                               </w:rPr>
                               <w:t>Skills</w:t>
                             </w:r>
+                            <w:proofErr w:type="spellEnd"/>
                             <w:r>
                               <w:rPr>
                                 <w:rFonts w:ascii="Inter" w:hAnsi="Inter" w:cs="Arial" w:hint="cs"/>
@@ -1920,7 +1956,31 @@
                                 <w:szCs w:val="18"/>
                                 <w:lang w:val="fr-FR"/>
                               </w:rPr>
-                              <w:t>Git, Firebase, QR Scanner</w:t>
+                              <w:t xml:space="preserve">Git, </w:t>
+                            </w:r>
+                            <w:proofErr w:type="spellStart"/>
+                            <w:r>
+                              <w:rPr>
+                                <w:rFonts w:ascii="Inter" w:hAnsi="Inter" w:cs="Arial"/>
+                                <w:color w:val="767171"/>
+                                <w:kern w:val="24"/>
+                                <w:sz w:val="18"/>
+                                <w:szCs w:val="18"/>
+                                <w:lang w:val="fr-FR"/>
+                              </w:rPr>
+                              <w:t>Firebase</w:t>
+                            </w:r>
+                            <w:proofErr w:type="spellEnd"/>
+                            <w:r>
+                              <w:rPr>
+                                <w:rFonts w:ascii="Inter" w:hAnsi="Inter" w:cs="Arial"/>
+                                <w:color w:val="767171"/>
+                                <w:kern w:val="24"/>
+                                <w:sz w:val="18"/>
+                                <w:szCs w:val="18"/>
+                                <w:lang w:val="fr-FR"/>
+                              </w:rPr>
+                              <w:t>, QR Scanner</w:t>
                             </w:r>
                           </w:p>
                           <w:p>
@@ -2549,7 +2609,7 @@
                             <w:r>
                               <w:t xml:space="preserve">Developed </w:t>
                             </w:r>
-                            <w:hyperlink r:id="rId5" w:history="1">
+                            <w:hyperlink r:id="rId7" w:history="1">
                               <w:r>
                                 <w:rPr>
                                   <w:rStyle w:val="Hyperlink"/>
@@ -2637,7 +2697,7 @@
                       <w:r>
                         <w:t xml:space="preserve">Developed </w:t>
                       </w:r>
-                      <w:hyperlink r:id="rId6" w:history="1">
+                      <w:hyperlink r:id="rId8" w:history="1">
                         <w:r>
                           <w:rPr>
                             <w:rStyle w:val="Hyperlink"/>
@@ -2938,6 +2998,7 @@
                                 <w:lang w:val="fr-FR"/>
                               </w:rPr>
                             </w:pPr>
+                            <w:proofErr w:type="spellStart"/>
                             <w:r>
                               <w:rPr>
                                 <w:rFonts w:ascii="Inter" w:hAnsi="Inter" w:cs="Arial"/>
@@ -2949,6 +3010,7 @@
                               </w:rPr>
                               <w:t>Skills</w:t>
                             </w:r>
+                            <w:proofErr w:type="spellEnd"/>
                             <w:r>
                               <w:rPr>
                                 <w:rFonts w:ascii="Inter" w:hAnsi="Inter" w:cs="Arial" w:hint="cs"/>
@@ -2970,8 +3032,9 @@
                                 <w:szCs w:val="18"/>
                                 <w:lang w:val="fr-FR"/>
                               </w:rPr>
-                              <w:t>: Kotlin,</w:t>
-                            </w:r>
+                              <w:t xml:space="preserve">: </w:t>
+                            </w:r>
+                            <w:proofErr w:type="spellStart"/>
                             <w:r>
                               <w:rPr>
                                 <w:rFonts w:ascii="Inter" w:hAnsi="Inter" w:cs="Arial"/>
@@ -2981,8 +3044,9 @@
                                 <w:szCs w:val="18"/>
                                 <w:lang w:val="fr-FR"/>
                               </w:rPr>
-                              <w:t xml:space="preserve"> </w:t>
-                            </w:r>
+                              <w:t>Kotlin</w:t>
+                            </w:r>
+                            <w:proofErr w:type="spellEnd"/>
                             <w:r>
                               <w:rPr>
                                 <w:rFonts w:ascii="Inter" w:hAnsi="Inter" w:cs="Arial"/>
@@ -2992,8 +3056,44 @@
                                 <w:szCs w:val="18"/>
                                 <w:lang w:val="fr-FR"/>
                               </w:rPr>
-                              <w:t xml:space="preserve">MapBox, Design Pattern, Open </w:t>
-                            </w:r>
+                              <w:t>,</w:t>
+                            </w:r>
+                            <w:r>
+                              <w:rPr>
+                                <w:rFonts w:ascii="Inter" w:hAnsi="Inter" w:cs="Arial"/>
+                                <w:color w:val="767171"/>
+                                <w:kern w:val="24"/>
+                                <w:sz w:val="18"/>
+                                <w:szCs w:val="18"/>
+                                <w:lang w:val="fr-FR"/>
+                              </w:rPr>
+                              <w:t xml:space="preserve"> </w:t>
+                            </w:r>
+                            <w:proofErr w:type="spellStart"/>
+                            <w:r>
+                              <w:rPr>
+                                <w:rFonts w:ascii="Inter" w:hAnsi="Inter" w:cs="Arial"/>
+                                <w:color w:val="767171"/>
+                                <w:kern w:val="24"/>
+                                <w:sz w:val="18"/>
+                                <w:szCs w:val="18"/>
+                                <w:lang w:val="fr-FR"/>
+                              </w:rPr>
+                              <w:t>MapBox</w:t>
+                            </w:r>
+                            <w:proofErr w:type="spellEnd"/>
+                            <w:r>
+                              <w:rPr>
+                                <w:rFonts w:ascii="Inter" w:hAnsi="Inter" w:cs="Arial"/>
+                                <w:color w:val="767171"/>
+                                <w:kern w:val="24"/>
+                                <w:sz w:val="18"/>
+                                <w:szCs w:val="18"/>
+                                <w:lang w:val="fr-FR"/>
+                              </w:rPr>
+                              <w:t xml:space="preserve">, Design Pattern, Open </w:t>
+                            </w:r>
+                            <w:proofErr w:type="spellStart"/>
                             <w:r>
                               <w:rPr>
                                 <w:rFonts w:ascii="Inter" w:hAnsi="Inter" w:cs="Arial" w:hint="cs"/>
@@ -3006,6 +3106,7 @@
                               </w:rPr>
                               <w:t>Street</w:t>
                             </w:r>
+                            <w:proofErr w:type="spellEnd"/>
                             <w:r>
                               <w:rPr>
                                 <w:rFonts w:ascii="Inter" w:hAnsi="Inter" w:cs="Arial"/>
@@ -3435,7 +3536,7 @@
                             <w:r>
                               <w:t xml:space="preserve">Designed and developed </w:t>
                             </w:r>
-                            <w:hyperlink r:id="rId7" w:history="1">
+                            <w:hyperlink r:id="rId9" w:history="1">
                               <w:r>
                                 <w:rPr>
                                   <w:rStyle w:val="Hyperlink"/>
@@ -3529,7 +3630,7 @@
                       <w:r>
                         <w:t xml:space="preserve">Designed and developed </w:t>
                       </w:r>
-                      <w:hyperlink r:id="rId8" w:history="1">
+                      <w:hyperlink r:id="rId10" w:history="1">
                         <w:r>
                           <w:rPr>
                             <w:rStyle w:val="Hyperlink"/>
@@ -3777,6 +3878,7 @@
                                 <w:lang w:val="fr-FR"/>
                               </w:rPr>
                             </w:pPr>
+                            <w:proofErr w:type="spellStart"/>
                             <w:r>
                               <w:rPr>
                                 <w:rFonts w:ascii="Inter" w:hAnsi="Inter" w:cs="Arial"/>
@@ -3788,6 +3890,7 @@
                               </w:rPr>
                               <w:t>Skills</w:t>
                             </w:r>
+                            <w:proofErr w:type="spellEnd"/>
                             <w:r>
                               <w:rPr>
                                 <w:rFonts w:ascii="Inter" w:hAnsi="Inter" w:cs="Arial" w:hint="cs"/>
@@ -4253,7 +4356,7 @@
                               </w:rPr>
                               <w:t xml:space="preserve">Created </w:t>
                             </w:r>
-                            <w:hyperlink r:id="rId9" w:history="1">
+                            <w:hyperlink r:id="rId11" w:history="1">
                               <w:r>
                                 <w:rPr>
                                   <w:rStyle w:val="Hyperlink"/>
@@ -4377,7 +4480,7 @@
                         </w:rPr>
                         <w:t xml:space="preserve">Created </w:t>
                       </w:r>
-                      <w:hyperlink r:id="rId10" w:history="1">
+                      <w:hyperlink r:id="rId12" w:history="1">
                         <w:r>
                           <w:rPr>
                             <w:rStyle w:val="Hyperlink"/>
@@ -4549,7 +4652,7 @@
                               </w:rPr>
                               <w:t xml:space="preserve"> </w:t>
                             </w:r>
-                            <w:hyperlink r:id="rId11" w:history="1">
+                            <w:hyperlink r:id="rId13" w:history="1">
                               <w:r>
                                 <w:rPr>
                                   <w:rStyle w:val="Hyperlink"/>
@@ -4642,7 +4745,30 @@
                                 <w:szCs w:val="16"/>
                                 <w:lang w:bidi="bn-BD"/>
                               </w:rPr>
-                              <w:t>Developed Aaniro, a highway toll payment app using Compose and Material 3 libraries for a company with 1M+ active web users.</w:t>
+                              <w:t xml:space="preserve">Developed </w:t>
+                            </w:r>
+                            <w:hyperlink r:id="rId14" w:history="1">
+                              <w:r>
+                                <w:rPr>
+                                  <w:rStyle w:val="Hyperlink"/>
+                                  <w:rFonts w:ascii="Roboto" w:hAnsi="Roboto" w:cs="Roboto"/>
+                                  <w:color w:val="000000" w:themeColor="text1"/>
+                                  <w:sz w:val="16"/>
+                                  <w:szCs w:val="16"/>
+                                  <w:lang w:bidi="bn-BD"/>
+                                </w:rPr>
+                                <w:t>Aaniro</w:t>
+                              </w:r>
+                            </w:hyperlink>
+                            <w:r>
+                              <w:rPr>
+                                <w:rFonts w:ascii="Roboto" w:hAnsi="Roboto" w:cs="Roboto"/>
+                                <w:color w:val="000000"/>
+                                <w:sz w:val="16"/>
+                                <w:szCs w:val="16"/>
+                                <w:lang w:bidi="bn-BD"/>
+                              </w:rPr>
+                              <w:t>, a highway toll payment app using Compose and Material 3 libraries for a company with 1M+ active web users.</w:t>
                             </w:r>
                           </w:p>
                           <w:p>
@@ -4789,7 +4915,7 @@
                         </w:rPr>
                         <w:t xml:space="preserve"> </w:t>
                       </w:r>
-                      <w:hyperlink r:id="rId12" w:history="1">
+                      <w:hyperlink r:id="rId15" w:history="1">
                         <w:r>
                           <w:rPr>
                             <w:rStyle w:val="Hyperlink"/>
@@ -4882,7 +5008,30 @@
                           <w:szCs w:val="16"/>
                           <w:lang w:bidi="bn-BD"/>
                         </w:rPr>
-                        <w:t>Developed Aaniro, a highway toll payment app using Compose and Material 3 libraries for a company with 1M+ active web users.</w:t>
+                        <w:t xml:space="preserve">Developed </w:t>
+                      </w:r>
+                      <w:hyperlink r:id="rId16" w:history="1">
+                        <w:r>
+                          <w:rPr>
+                            <w:rStyle w:val="Hyperlink"/>
+                            <w:rFonts w:ascii="Roboto" w:hAnsi="Roboto" w:cs="Roboto"/>
+                            <w:color w:val="000000" w:themeColor="text1"/>
+                            <w:sz w:val="16"/>
+                            <w:szCs w:val="16"/>
+                            <w:lang w:bidi="bn-BD"/>
+                          </w:rPr>
+                          <w:t>Aaniro</w:t>
+                        </w:r>
+                      </w:hyperlink>
+                      <w:r>
+                        <w:rPr>
+                          <w:rFonts w:ascii="Roboto" w:hAnsi="Roboto" w:cs="Roboto"/>
+                          <w:color w:val="000000"/>
+                          <w:sz w:val="16"/>
+                          <w:szCs w:val="16"/>
+                          <w:lang w:bidi="bn-BD"/>
+                        </w:rPr>
+                        <w:t>, a highway toll payment app using Compose and Material 3 libraries for a company with 1M+ active web users.</w:t>
                       </w:r>
                     </w:p>
                     <w:p>
@@ -5032,7 +5181,7 @@
                                 <w:szCs w:val="22"/>
                               </w:rPr>
                             </w:pPr>
-                            <w:hyperlink r:id="rId13" w:history="1">
+                            <w:hyperlink r:id="rId17" w:history="1">
                               <w:r>
                                 <w:rPr>
                                   <w:rStyle w:val="Hyperlink"/>
@@ -5041,7 +5190,18 @@
                                   <w:sz w:val="22"/>
                                   <w:szCs w:val="22"/>
                                 </w:rPr>
-                                <w:t>linkedin.com/in/malihe</w:t>
+                                <w:t>linkedin.com/in/</w:t>
+                              </w:r>
+                              <w:proofErr w:type="spellStart"/>
+                              <w:r>
+                                <w:rPr>
+                                  <w:rStyle w:val="Hyperlink"/>
+                                  <w:rFonts w:ascii="Inter" w:hAnsi="Inter"/>
+                                  <w:color w:val="000000"/>
+                                  <w:sz w:val="22"/>
+                                  <w:szCs w:val="22"/>
+                                </w:rPr>
+                                <w:t>malihe</w:t>
                               </w:r>
                               <w:r>
                                 <w:rPr>
@@ -5063,6 +5223,7 @@
                                 </w:rPr>
                                 <w:t>moradi</w:t>
                               </w:r>
+                              <w:proofErr w:type="spellEnd"/>
                             </w:hyperlink>
                           </w:p>
                         </w:txbxContent>
@@ -5836,6 +5997,7 @@
                                 <w:lang w:val="fr-FR"/>
                               </w:rPr>
                             </w:pPr>
+                            <w:proofErr w:type="spellStart"/>
                             <w:r>
                               <w:rPr>
                                 <w:rFonts w:ascii="Inter" w:hAnsi="Inter" w:cs="Arial"/>
@@ -5847,6 +6009,7 @@
                               </w:rPr>
                               <w:t>Skills</w:t>
                             </w:r>
+                            <w:proofErr w:type="spellEnd"/>
                             <w:r>
                               <w:rPr>
                                 <w:rFonts w:ascii="Inter" w:hAnsi="Inter" w:cs="Arial" w:hint="cs"/>
@@ -7352,6 +7515,56 @@
     </w:sectPr>
   </w:body>
 </w:document>
+</file>
+
+<file path=word/endnotes.xml><?xml version="1.0" encoding="utf-8"?>
+<w:endnotes xmlns:wpc="http://schemas.microsoft.com/office/word/2010/wordprocessingCanvas" xmlns:cx="http://schemas.microsoft.com/office/drawing/2014/chartex" xmlns:cx1="http://schemas.microsoft.com/office/drawing/2015/9/8/chartex" xmlns:cx2="http://schemas.microsoft.com/office/drawing/2015/10/21/chartex" xmlns:cx3="http://schemas.microsoft.com/office/drawing/2016/5/9/chartex" xmlns:cx4="http://schemas.microsoft.com/office/drawing/2016/5/10/chartex" xmlns:cx5="http://schemas.microsoft.com/office/drawing/2016/5/11/chartex" xmlns:cx6="http://schemas.microsoft.com/office/drawing/2016/5/12/chartex" xmlns:cx7="http://schemas.microsoft.com/office/drawing/2016/5/13/chartex" xmlns:cx8="http://schemas.microsoft.com/office/drawing/2016/5/14/chartex" xmlns:mc="http://schemas.openxmlformats.org/markup-compatibility/2006" xmlns:aink="http://schemas.microsoft.com/office/drawing/2016/ink" xmlns:am3d="http://schemas.microsoft.com/office/drawing/2017/model3d" xmlns:o="urn:schemas-microsoft-com:office:office" xmlns:oel="http://schemas.microsoft.com/office/2019/extlst" xmlns:r="http://schemas.openxmlformats.org/officeDocument/2006/relationships" xmlns:m="http://schemas.openxmlformats.org/officeDocument/2006/math" xmlns:v="urn:schemas-microsoft-com:vml" xmlns:wp14="http://schemas.microsoft.com/office/word/2010/wordprocessingDrawing" xmlns:wp="http://schemas.openxmlformats.org/drawingml/2006/wordprocessingDrawing" xmlns:w10="urn:schemas-microsoft-com:office:word" xmlns:w="http://schemas.openxmlformats.org/wordprocessingml/2006/main" xmlns:w14="http://schemas.microsoft.com/office/word/2010/wordml" xmlns:w15="http://schemas.microsoft.com/office/word/2012/wordml" xmlns:w16cex="http://schemas.microsoft.com/office/word/2018/wordml/cex" xmlns:w16cid="http://schemas.microsoft.com/office/word/2016/wordml/cid" xmlns:w16="http://schemas.microsoft.com/office/word/2018/wordml" xmlns:w16sdtdh="http://schemas.microsoft.com/office/word/2020/wordml/sdtdatahash" xmlns:w16se="http://schemas.microsoft.com/office/word/2015/wordml/symex" xmlns:wpg="http://schemas.microsoft.com/office/word/2010/wordprocessingGroup" xmlns:wpi="http://schemas.microsoft.com/office/word/2010/wordprocessingInk" xmlns:wne="http://schemas.microsoft.com/office/word/2006/wordml" xmlns:wps="http://schemas.microsoft.com/office/word/2010/wordprocessingShape" mc:Ignorable="w14 w15 w16se w16cid w16 w16cex w16sdtdh wp14">
+  <w:endnote w:type="separator" w:id="-1">
+    <w:p>
+      <w:pPr>
+        <w:spacing w:after="0" w:line="240" w:lineRule="auto"/>
+      </w:pPr>
+      <w:r>
+        <w:separator/>
+      </w:r>
+    </w:p>
+  </w:endnote>
+  <w:endnote w:type="continuationSeparator" w:id="0">
+    <w:p>
+      <w:pPr>
+        <w:spacing w:after="0" w:line="240" w:lineRule="auto"/>
+      </w:pPr>
+      <w:r>
+        <w:continuationSeparator/>
+      </w:r>
+    </w:p>
+  </w:endnote>
+</w:endnotes>
+</file>
+
+<file path=word/footnotes.xml><?xml version="1.0" encoding="utf-8"?>
+<w:footnotes xmlns:wpc="http://schemas.microsoft.com/office/word/2010/wordprocessingCanvas" xmlns:cx="http://schemas.microsoft.com/office/drawing/2014/chartex" xmlns:cx1="http://schemas.microsoft.com/office/drawing/2015/9/8/chartex" xmlns:cx2="http://schemas.microsoft.com/office/drawing/2015/10/21/chartex" xmlns:cx3="http://schemas.microsoft.com/office/drawing/2016/5/9/chartex" xmlns:cx4="http://schemas.microsoft.com/office/drawing/2016/5/10/chartex" xmlns:cx5="http://schemas.microsoft.com/office/drawing/2016/5/11/chartex" xmlns:cx6="http://schemas.microsoft.com/office/drawing/2016/5/12/chartex" xmlns:cx7="http://schemas.microsoft.com/office/drawing/2016/5/13/chartex" xmlns:cx8="http://schemas.microsoft.com/office/drawing/2016/5/14/chartex" xmlns:mc="http://schemas.openxmlformats.org/markup-compatibility/2006" xmlns:aink="http://schemas.microsoft.com/office/drawing/2016/ink" xmlns:am3d="http://schemas.microsoft.com/office/drawing/2017/model3d" xmlns:o="urn:schemas-microsoft-com:office:office" xmlns:oel="http://schemas.microsoft.com/office/2019/extlst" xmlns:r="http://schemas.openxmlformats.org/officeDocument/2006/relationships" xmlns:m="http://schemas.openxmlformats.org/officeDocument/2006/math" xmlns:v="urn:schemas-microsoft-com:vml" xmlns:wp14="http://schemas.microsoft.com/office/word/2010/wordprocessingDrawing" xmlns:wp="http://schemas.openxmlformats.org/drawingml/2006/wordprocessingDrawing" xmlns:w10="urn:schemas-microsoft-com:office:word" xmlns:w="http://schemas.openxmlformats.org/wordprocessingml/2006/main" xmlns:w14="http://schemas.microsoft.com/office/word/2010/wordml" xmlns:w15="http://schemas.microsoft.com/office/word/2012/wordml" xmlns:w16cex="http://schemas.microsoft.com/office/word/2018/wordml/cex" xmlns:w16cid="http://schemas.microsoft.com/office/word/2016/wordml/cid" xmlns:w16="http://schemas.microsoft.com/office/word/2018/wordml" xmlns:w16sdtdh="http://schemas.microsoft.com/office/word/2020/wordml/sdtdatahash" xmlns:w16se="http://schemas.microsoft.com/office/word/2015/wordml/symex" xmlns:wpg="http://schemas.microsoft.com/office/word/2010/wordprocessingGroup" xmlns:wpi="http://schemas.microsoft.com/office/word/2010/wordprocessingInk" xmlns:wne="http://schemas.microsoft.com/office/word/2006/wordml" xmlns:wps="http://schemas.microsoft.com/office/word/2010/wordprocessingShape" mc:Ignorable="w14 w15 w16se w16cid w16 w16cex w16sdtdh wp14">
+  <w:footnote w:type="separator" w:id="-1">
+    <w:p>
+      <w:pPr>
+        <w:spacing w:after="0" w:line="240" w:lineRule="auto"/>
+      </w:pPr>
+      <w:r>
+        <w:separator/>
+      </w:r>
+    </w:p>
+  </w:footnote>
+  <w:footnote w:type="continuationSeparator" w:id="0">
+    <w:p>
+      <w:pPr>
+        <w:spacing w:after="0" w:line="240" w:lineRule="auto"/>
+      </w:pPr>
+      <w:r>
+        <w:continuationSeparator/>
+      </w:r>
+    </w:p>
+  </w:footnote>
+</w:footnotes>
 </file>
 
 <file path=word/numbering.xml><?xml version="1.0" encoding="utf-8"?>
@@ -9251,6 +9464,50 @@
       <w:lang w:val="en-TR"/>
     </w:rPr>
   </w:style>
+  <w:style w:type="paragraph" w:styleId="Header">
+    <w:name w:val="header"/>
+    <w:basedOn w:val="Normal"/>
+    <w:link w:val="HeaderChar"/>
+    <w:uiPriority w:val="99"/>
+    <w:unhideWhenUsed/>
+    <w:rsid w:val="003A59B1"/>
+    <w:pPr>
+      <w:tabs>
+        <w:tab w:val="center" w:pos="4680"/>
+        <w:tab w:val="right" w:pos="9360"/>
+      </w:tabs>
+      <w:spacing w:after="0" w:line="240" w:lineRule="auto"/>
+    </w:pPr>
+  </w:style>
+  <w:style w:type="character" w:customStyle="1" w:styleId="HeaderChar">
+    <w:name w:val="Header Char"/>
+    <w:basedOn w:val="DefaultParagraphFont"/>
+    <w:link w:val="Header"/>
+    <w:uiPriority w:val="99"/>
+    <w:rsid w:val="003A59B1"/>
+  </w:style>
+  <w:style w:type="paragraph" w:styleId="Footer">
+    <w:name w:val="footer"/>
+    <w:basedOn w:val="Normal"/>
+    <w:link w:val="FooterChar"/>
+    <w:uiPriority w:val="99"/>
+    <w:unhideWhenUsed/>
+    <w:rsid w:val="003A59B1"/>
+    <w:pPr>
+      <w:tabs>
+        <w:tab w:val="center" w:pos="4680"/>
+        <w:tab w:val="right" w:pos="9360"/>
+      </w:tabs>
+      <w:spacing w:after="0" w:line="240" w:lineRule="auto"/>
+    </w:pPr>
+  </w:style>
+  <w:style w:type="character" w:customStyle="1" w:styleId="FooterChar">
+    <w:name w:val="Footer Char"/>
+    <w:basedOn w:val="DefaultParagraphFont"/>
+    <w:link w:val="Footer"/>
+    <w:uiPriority w:val="99"/>
+    <w:rsid w:val="003A59B1"/>
+  </w:style>
 </w:styles>
 </file>
 

</xml_diff>

<commit_message>
Add the Aaniro project link (#3)
</commit_message>
<xml_diff>
--- a/assets/MalihehMoradi_resume.docx
+++ b/assets/MalihehMoradi_resume.docx
@@ -3,6 +3,135 @@
 <w:document xmlns:wpc="http://schemas.microsoft.com/office/word/2010/wordprocessingCanvas" xmlns:cx="http://schemas.microsoft.com/office/drawing/2014/chartex" xmlns:cx1="http://schemas.microsoft.com/office/drawing/2015/9/8/chartex" xmlns:cx2="http://schemas.microsoft.com/office/drawing/2015/10/21/chartex" xmlns:cx3="http://schemas.microsoft.com/office/drawing/2016/5/9/chartex" xmlns:cx4="http://schemas.microsoft.com/office/drawing/2016/5/10/chartex" xmlns:cx5="http://schemas.microsoft.com/office/drawing/2016/5/11/chartex" xmlns:cx6="http://schemas.microsoft.com/office/drawing/2016/5/12/chartex" xmlns:cx7="http://schemas.microsoft.com/office/drawing/2016/5/13/chartex" xmlns:cx8="http://schemas.microsoft.com/office/drawing/2016/5/14/chartex" xmlns:mc="http://schemas.openxmlformats.org/markup-compatibility/2006" xmlns:aink="http://schemas.microsoft.com/office/drawing/2016/ink" xmlns:am3d="http://schemas.microsoft.com/office/drawing/2017/model3d" xmlns:o="urn:schemas-microsoft-com:office:office" xmlns:oel="http://schemas.microsoft.com/office/2019/extlst" xmlns:r="http://schemas.openxmlformats.org/officeDocument/2006/relationships" xmlns:m="http://schemas.openxmlformats.org/officeDocument/2006/math" xmlns:v="urn:schemas-microsoft-com:vml" xmlns:wp14="http://schemas.microsoft.com/office/word/2010/wordprocessingDrawing" xmlns:wp="http://schemas.openxmlformats.org/drawingml/2006/wordprocessingDrawing" xmlns:w10="urn:schemas-microsoft-com:office:word" xmlns:w="http://schemas.openxmlformats.org/wordprocessingml/2006/main" xmlns:w14="http://schemas.microsoft.com/office/word/2010/wordml" xmlns:w15="http://schemas.microsoft.com/office/word/2012/wordml" xmlns:w16cex="http://schemas.microsoft.com/office/word/2018/wordml/cex" xmlns:w16cid="http://schemas.microsoft.com/office/word/2016/wordml/cid" xmlns:w16="http://schemas.microsoft.com/office/word/2018/wordml" xmlns:w16sdtdh="http://schemas.microsoft.com/office/word/2020/wordml/sdtdatahash" xmlns:w16se="http://schemas.microsoft.com/office/word/2015/wordml/symex" xmlns:wpg="http://schemas.microsoft.com/office/word/2010/wordprocessingGroup" xmlns:wpi="http://schemas.microsoft.com/office/word/2010/wordprocessingInk" xmlns:wne="http://schemas.microsoft.com/office/word/2006/wordml" xmlns:wps="http://schemas.microsoft.com/office/word/2010/wordprocessingShape" mc:Ignorable="w14 w15 w16se w16cid w16 w16cex w16sdtdh wp14">
   <w:body>
     <w:p>
+      <w:r>
+        <w:rPr>
+          <w:noProof/>
+        </w:rPr>
+        <mc:AlternateContent>
+          <mc:Choice Requires="wps">
+            <w:drawing>
+              <wp:anchor distT="0" distB="0" distL="114300" distR="114300" simplePos="0" relativeHeight="251719680" behindDoc="0" locked="0" layoutInCell="1" allowOverlap="1" wp14:anchorId="1CFD42C8" wp14:editId="3AF7A349">
+                <wp:simplePos x="0" y="0"/>
+                <wp:positionH relativeFrom="column">
+                  <wp:posOffset>3889948</wp:posOffset>
+                </wp:positionH>
+                <wp:positionV relativeFrom="paragraph">
+                  <wp:posOffset>7172793</wp:posOffset>
+                </wp:positionV>
+                <wp:extent cx="2684145" cy="532151"/>
+                <wp:effectExtent l="0" t="0" r="0" b="0"/>
+                <wp:wrapNone/>
+                <wp:docPr id="1690107712" name="Text Box 2"/>
+                <wp:cNvGraphicFramePr>
+                  <a:graphicFrameLocks xmlns:a="http://schemas.openxmlformats.org/drawingml/2006/main"/>
+                </wp:cNvGraphicFramePr>
+                <a:graphic xmlns:a="http://schemas.openxmlformats.org/drawingml/2006/main">
+                  <a:graphicData uri="http://schemas.microsoft.com/office/word/2010/wordprocessingShape">
+                    <wps:wsp>
+                      <wps:cNvSpPr txBox="1">
+                        <a:spLocks noChangeArrowheads="1"/>
+                      </wps:cNvSpPr>
+                      <wps:spPr bwMode="auto">
+                        <a:xfrm>
+                          <a:off x="0" y="0"/>
+                          <a:ext cx="2684145" cy="532151"/>
+                        </a:xfrm>
+                        <a:prstGeom prst="rect">
+                          <a:avLst/>
+                        </a:prstGeom>
+                        <a:noFill/>
+                        <a:ln w="9525">
+                          <a:noFill/>
+                          <a:miter lim="800000"/>
+                          <a:headEnd/>
+                          <a:tailEnd/>
+                        </a:ln>
+                      </wps:spPr>
+                      <wps:txbx>
+                        <w:txbxContent>
+                          <w:p>
+                            <w:pPr>
+                              <w:pStyle w:val="NormalWeb"/>
+                            </w:pPr>
+                            <w:r>
+                              <w:rPr>
+                                <w:rFonts w:ascii="Roboto" w:hAnsi="Roboto" w:cs="Roboto"/>
+                                <w:color w:val="000000"/>
+                                <w:sz w:val="16"/>
+                                <w:szCs w:val="16"/>
+                              </w:rPr>
+                              <w:t>Mentored over 20 junior Android developers by providing technical guidance and code reviews as they built their own projects from start to finish.</w:t>
+                            </w:r>
+                          </w:p>
+                          <w:p>
+                            <w:pPr>
+                              <w:spacing w:line="240" w:lineRule="auto"/>
+                              <w:rPr>
+                                <w:rFonts w:ascii="Roboto" w:hAnsi="Roboto" w:cs="Roboto"/>
+                                <w:color w:val="000000"/>
+                                <w:sz w:val="16"/>
+                                <w:szCs w:val="16"/>
+                              </w:rPr>
+                            </w:pPr>
+                          </w:p>
+                        </w:txbxContent>
+                      </wps:txbx>
+                      <wps:bodyPr rot="0" vert="horz" wrap="square" lIns="91440" tIns="45720" rIns="91440" bIns="45720" anchor="t" anchorCtr="0">
+                        <a:noAutofit/>
+                      </wps:bodyPr>
+                    </wps:wsp>
+                  </a:graphicData>
+                </a:graphic>
+                <wp14:sizeRelH relativeFrom="margin">
+                  <wp14:pctWidth>0</wp14:pctWidth>
+                </wp14:sizeRelH>
+                <wp14:sizeRelV relativeFrom="margin">
+                  <wp14:pctHeight>0</wp14:pctHeight>
+                </wp14:sizeRelV>
+              </wp:anchor>
+            </w:drawing>
+          </mc:Choice>
+          <mc:Fallback>
+            <w:pict>
+              <v:shapetype w14:anchorId="1CFD42C8" id="_x0000_t202" coordsize="21600,21600" o:spt="202" path="m,l,21600r21600,l21600,xe">
+                <v:stroke joinstyle="miter"/>
+                <v:path gradientshapeok="t" o:connecttype="rect"/>
+              </v:shapetype>
+              <v:shape id="Text Box 2" o:spid="_x0000_s1026" type="#_x0000_t202" style="position:absolute;margin-left:306.3pt;margin-top:564.8pt;width:211.35pt;height:41.9pt;z-index:251719680;visibility:visible;mso-wrap-style:square;mso-width-percent:0;mso-height-percent:0;mso-wrap-distance-left:9pt;mso-wrap-distance-top:0;mso-wrap-distance-right:9pt;mso-wrap-distance-bottom:0;mso-position-horizontal:absolute;mso-position-horizontal-relative:text;mso-position-vertical:absolute;mso-position-vertical-relative:text;mso-width-percent:0;mso-height-percent:0;mso-width-relative:margin;mso-height-relative:margin;v-text-anchor:top" o:gfxdata="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" filled="f" stroked="f">
+                <v:textbox>
+                  <w:txbxContent>
+                    <w:p>
+                      <w:pPr>
+                        <w:pStyle w:val="NormalWeb"/>
+                      </w:pPr>
+                      <w:r>
+                        <w:rPr>
+                          <w:rFonts w:ascii="Roboto" w:hAnsi="Roboto" w:cs="Roboto"/>
+                          <w:color w:val="000000"/>
+                          <w:sz w:val="16"/>
+                          <w:szCs w:val="16"/>
+                        </w:rPr>
+                        <w:t>Mentored over 20 junior Android developers by providing technical guidance and code reviews as they built their own projects from start to finish.</w:t>
+                      </w:r>
+                    </w:p>
+                    <w:p>
+                      <w:pPr>
+                        <w:spacing w:line="240" w:lineRule="auto"/>
+                        <w:rPr>
+                          <w:rFonts w:ascii="Roboto" w:hAnsi="Roboto" w:cs="Roboto"/>
+                          <w:color w:val="000000"/>
+                          <w:sz w:val="16"/>
+                          <w:szCs w:val="16"/>
+                        </w:rPr>
+                      </w:pPr>
+                    </w:p>
+                  </w:txbxContent>
+                </v:textbox>
+              </v:shape>
+            </w:pict>
+          </mc:Fallback>
+        </mc:AlternateContent>
+      </w:r>
       <w:r>
         <w:rPr>
           <w:noProof/>
@@ -82,11 +211,7 @@
           </mc:Choice>
           <mc:Fallback>
             <w:pict>
-              <v:shapetype w14:anchorId="0FCCC887" id="_x0000_t202" coordsize="21600,21600" o:spt="202" path="m,l,21600r21600,l21600,xe">
-                <v:stroke joinstyle="miter"/>
-                <v:path gradientshapeok="t" o:connecttype="rect"/>
-              </v:shapetype>
-              <v:shape id="Text Box 2" o:spid="_x0000_s1026" type="#_x0000_t202" style="position:absolute;margin-left:308.7pt;margin-top:539.9pt;width:115pt;height:28.5pt;z-index:251717632;visibility:visible;mso-wrap-style:square;mso-width-percent:0;mso-height-percent:0;mso-wrap-distance-left:9pt;mso-wrap-distance-top:3.6pt;mso-wrap-distance-right:9pt;mso-wrap-distance-bottom:3.6pt;mso-position-horizontal:absolute;mso-position-horizontal-relative:text;mso-position-vertical:absolute;mso-position-vertical-relative:text;mso-width-percent:0;mso-height-percent:0;mso-width-relative:margin;mso-height-relative:margin;v-text-anchor:top" o:gfxdata="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" filled="f" stroked="f">
+              <v:shape w14:anchorId="0FCCC887" id="_x0000_s1027" type="#_x0000_t202" style="position:absolute;margin-left:308.7pt;margin-top:539.9pt;width:115pt;height:28.5pt;z-index:251717632;visibility:visible;mso-wrap-style:square;mso-width-percent:0;mso-height-percent:0;mso-wrap-distance-left:9pt;mso-wrap-distance-top:3.6pt;mso-wrap-distance-right:9pt;mso-wrap-distance-bottom:3.6pt;mso-position-horizontal:absolute;mso-position-horizontal-relative:text;mso-position-vertical:absolute;mso-position-vertical-relative:text;mso-width-percent:0;mso-height-percent:0;mso-width-relative:margin;mso-height-relative:margin;v-text-anchor:top" o:gfxdata="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" filled="f" stroked="f">
                 <v:textbox>
                   <w:txbxContent>
                     <w:p>
@@ -101,159 +226,6 @@
                           <w:color w:val="7030A0"/>
                         </w:rPr>
                         <w:t>Volunteer</w:t>
-                      </w:r>
-                    </w:p>
-                  </w:txbxContent>
-                </v:textbox>
-              </v:shape>
-            </w:pict>
-          </mc:Fallback>
-        </mc:AlternateContent>
-      </w:r>
-      <w:r>
-        <w:rPr>
-          <w:noProof/>
-        </w:rPr>
-        <mc:AlternateContent>
-          <mc:Choice Requires="wps">
-            <w:drawing>
-              <wp:anchor distT="0" distB="0" distL="114300" distR="114300" simplePos="0" relativeHeight="251719680" behindDoc="0" locked="0" layoutInCell="1" allowOverlap="1" wp14:anchorId="1CFD42C8" wp14:editId="3AF7A349">
-                <wp:simplePos x="0" y="0"/>
-                <wp:positionH relativeFrom="column">
-                  <wp:posOffset>3891280</wp:posOffset>
-                </wp:positionH>
-                <wp:positionV relativeFrom="paragraph">
-                  <wp:posOffset>7170930</wp:posOffset>
-                </wp:positionV>
-                <wp:extent cx="2684145" cy="819150"/>
-                <wp:effectExtent l="0" t="0" r="0" b="0"/>
-                <wp:wrapNone/>
-                <wp:docPr id="1690107712" name="Text Box 2"/>
-                <wp:cNvGraphicFramePr>
-                  <a:graphicFrameLocks xmlns:a="http://schemas.openxmlformats.org/drawingml/2006/main"/>
-                </wp:cNvGraphicFramePr>
-                <a:graphic xmlns:a="http://schemas.openxmlformats.org/drawingml/2006/main">
-                  <a:graphicData uri="http://schemas.microsoft.com/office/word/2010/wordprocessingShape">
-                    <wps:wsp>
-                      <wps:cNvSpPr txBox="1">
-                        <a:spLocks noChangeArrowheads="1"/>
-                      </wps:cNvSpPr>
-                      <wps:spPr bwMode="auto">
-                        <a:xfrm>
-                          <a:off x="0" y="0"/>
-                          <a:ext cx="2684145" cy="819150"/>
-                        </a:xfrm>
-                        <a:prstGeom prst="rect">
-                          <a:avLst/>
-                        </a:prstGeom>
-                        <a:noFill/>
-                        <a:ln w="9525">
-                          <a:noFill/>
-                          <a:miter lim="800000"/>
-                          <a:headEnd/>
-                          <a:tailEnd/>
-                        </a:ln>
-                      </wps:spPr>
-                      <wps:txbx>
-                        <w:txbxContent>
-                          <w:p>
-                            <w:pPr>
-                              <w:spacing w:line="240" w:lineRule="auto"/>
-                              <w:rPr>
-                                <w:rFonts w:ascii="Roboto" w:hAnsi="Roboto" w:cs="Roboto"/>
-                                <w:color w:val="000000"/>
-                                <w:sz w:val="16"/>
-                                <w:szCs w:val="16"/>
-                              </w:rPr>
-                            </w:pPr>
-                            <w:r>
-                              <w:rPr>
-                                <w:rFonts w:ascii="Roboto" w:hAnsi="Roboto" w:cs="Roboto"/>
-                                <w:color w:val="000000"/>
-                                <w:sz w:val="16"/>
-                                <w:szCs w:val="16"/>
-                              </w:rPr>
-                              <w:t>Contributed to front-end development of Apogram web app using ReactJS and implementing responsive layouts.</w:t>
-                            </w:r>
-                            <w:r>
-                              <w:rPr>
-                                <w:rFonts w:ascii="Roboto" w:hAnsi="Roboto" w:cs="Roboto"/>
-                                <w:color w:val="000000"/>
-                                <w:sz w:val="16"/>
-                                <w:szCs w:val="16"/>
-                                <w:rtl/>
-                              </w:rPr>
-                              <w:br/>
-                            </w:r>
-                            <w:r>
-                              <w:rPr>
-                                <w:rFonts w:ascii="Roboto" w:hAnsi="Roboto" w:cs="Roboto"/>
-                                <w:color w:val="000000"/>
-                                <w:sz w:val="16"/>
-                                <w:szCs w:val="16"/>
-                              </w:rPr>
-                              <w:t>Designed clean and intuitive UI/UX for Aaniro mobile app using Figma, optimizing user experience.</w:t>
-                            </w:r>
-                          </w:p>
-                        </w:txbxContent>
-                      </wps:txbx>
-                      <wps:bodyPr rot="0" vert="horz" wrap="square" lIns="91440" tIns="45720" rIns="91440" bIns="45720" anchor="t" anchorCtr="0">
-                        <a:noAutofit/>
-                      </wps:bodyPr>
-                    </wps:wsp>
-                  </a:graphicData>
-                </a:graphic>
-                <wp14:sizeRelH relativeFrom="margin">
-                  <wp14:pctWidth>0</wp14:pctWidth>
-                </wp14:sizeRelH>
-                <wp14:sizeRelV relativeFrom="margin">
-                  <wp14:pctHeight>0</wp14:pctHeight>
-                </wp14:sizeRelV>
-              </wp:anchor>
-            </w:drawing>
-          </mc:Choice>
-          <mc:Fallback>
-            <w:pict>
-              <v:shape w14:anchorId="1CFD42C8" id="_x0000_s1027" type="#_x0000_t202" style="position:absolute;margin-left:306.4pt;margin-top:564.65pt;width:211.35pt;height:64.5pt;z-index:251719680;visibility:visible;mso-wrap-style:square;mso-width-percent:0;mso-height-percent:0;mso-wrap-distance-left:9pt;mso-wrap-distance-top:0;mso-wrap-distance-right:9pt;mso-wrap-distance-bottom:0;mso-position-horizontal:absolute;mso-position-horizontal-relative:text;mso-position-vertical:absolute;mso-position-vertical-relative:text;mso-width-percent:0;mso-height-percent:0;mso-width-relative:margin;mso-height-relative:margin;v-text-anchor:top" o:gfxdata="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" filled="f" stroked="f">
-                <v:textbox>
-                  <w:txbxContent>
-                    <w:p>
-                      <w:pPr>
-                        <w:spacing w:line="240" w:lineRule="auto"/>
-                        <w:rPr>
-                          <w:rFonts w:ascii="Roboto" w:hAnsi="Roboto" w:cs="Roboto"/>
-                          <w:color w:val="000000"/>
-                          <w:sz w:val="16"/>
-                          <w:szCs w:val="16"/>
-                        </w:rPr>
-                      </w:pPr>
-                      <w:r>
-                        <w:rPr>
-                          <w:rFonts w:ascii="Roboto" w:hAnsi="Roboto" w:cs="Roboto"/>
-                          <w:color w:val="000000"/>
-                          <w:sz w:val="16"/>
-                          <w:szCs w:val="16"/>
-                        </w:rPr>
-                        <w:t>Contributed to front-end development of Apogram web app using ReactJS and implementing responsive layouts.</w:t>
-                      </w:r>
-                      <w:r>
-                        <w:rPr>
-                          <w:rFonts w:ascii="Roboto" w:hAnsi="Roboto" w:cs="Roboto"/>
-                          <w:color w:val="000000"/>
-                          <w:sz w:val="16"/>
-                          <w:szCs w:val="16"/>
-                          <w:rtl/>
-                        </w:rPr>
-                        <w:br/>
-                      </w:r>
-                      <w:r>
-                        <w:rPr>
-                          <w:rFonts w:ascii="Roboto" w:hAnsi="Roboto" w:cs="Roboto"/>
-                          <w:color w:val="000000"/>
-                          <w:sz w:val="16"/>
-                          <w:szCs w:val="16"/>
-                        </w:rPr>
-                        <w:t>Designed clean and intuitive UI/UX for Aaniro mobile app using Figma, optimizing user experience.</w:t>
                       </w:r>
                     </w:p>
                   </w:txbxContent>
@@ -557,8 +529,13 @@
                               <w:t>Hub</w:t>
                             </w:r>
                             <w:r>
-                              <w:t>, Gitlab, Gitflow</w:t>
-                            </w:r>
+                              <w:t xml:space="preserve">, Gitlab, </w:t>
+                            </w:r>
+                            <w:proofErr w:type="spellStart"/>
+                            <w:r>
+                              <w:t>Gitflow</w:t>
+                            </w:r>
+                            <w:proofErr w:type="spellEnd"/>
                           </w:p>
                           <w:p>
                             <w:pPr>
@@ -657,8 +634,13 @@
                               <w:t xml:space="preserve">: </w:t>
                             </w:r>
                             <w:r>
-                              <w:t>Coroutine, Flow, LiveData</w:t>
-                            </w:r>
+                              <w:t xml:space="preserve">Coroutine, Flow, </w:t>
+                            </w:r>
+                            <w:proofErr w:type="spellStart"/>
+                            <w:r>
+                              <w:t>LiveData</w:t>
+                            </w:r>
+                            <w:proofErr w:type="spellEnd"/>
                             <w:r>
                               <w:br/>
                             </w:r>
@@ -696,8 +678,9 @@
                                 <w:sz w:val="16"/>
                                 <w:szCs w:val="16"/>
                               </w:rPr>
-                              <w:t>Retrofit, GoogleMap, Fire</w:t>
-                            </w:r>
+                              <w:t xml:space="preserve">Retrofit, </w:t>
+                            </w:r>
+                            <w:proofErr w:type="spellStart"/>
                             <w:r>
                               <w:rPr>
                                 <w:rFonts w:ascii="Roboto" w:eastAsiaTheme="minorHAnsi" w:hAnsi="Roboto" w:cs="Roboto"/>
@@ -705,8 +688,9 @@
                                 <w:sz w:val="16"/>
                                 <w:szCs w:val="16"/>
                               </w:rPr>
-                              <w:t>b</w:t>
-                            </w:r>
+                              <w:t>GoogleMap</w:t>
+                            </w:r>
+                            <w:proofErr w:type="spellEnd"/>
                             <w:r>
                               <w:rPr>
                                 <w:rFonts w:ascii="Roboto" w:eastAsiaTheme="minorHAnsi" w:hAnsi="Roboto" w:cs="Roboto"/>
@@ -714,7 +698,45 @@
                                 <w:sz w:val="16"/>
                                 <w:szCs w:val="16"/>
                               </w:rPr>
-                              <w:t>ase, GoogleAnalytics, Data Binding, View Binding</w:t>
+                              <w:t>, Fire</w:t>
+                            </w:r>
+                            <w:r>
+                              <w:rPr>
+                                <w:rFonts w:ascii="Roboto" w:eastAsiaTheme="minorHAnsi" w:hAnsi="Roboto" w:cs="Roboto"/>
+                                <w:color w:val="000000"/>
+                                <w:sz w:val="16"/>
+                                <w:szCs w:val="16"/>
+                              </w:rPr>
+                              <w:t>b</w:t>
+                            </w:r>
+                            <w:r>
+                              <w:rPr>
+                                <w:rFonts w:ascii="Roboto" w:eastAsiaTheme="minorHAnsi" w:hAnsi="Roboto" w:cs="Roboto"/>
+                                <w:color w:val="000000"/>
+                                <w:sz w:val="16"/>
+                                <w:szCs w:val="16"/>
+                              </w:rPr>
+                              <w:t xml:space="preserve">ase, </w:t>
+                            </w:r>
+                            <w:proofErr w:type="spellStart"/>
+                            <w:r>
+                              <w:rPr>
+                                <w:rFonts w:ascii="Roboto" w:eastAsiaTheme="minorHAnsi" w:hAnsi="Roboto" w:cs="Roboto"/>
+                                <w:color w:val="000000"/>
+                                <w:sz w:val="16"/>
+                                <w:szCs w:val="16"/>
+                              </w:rPr>
+                              <w:t>GoogleAnalytics</w:t>
+                            </w:r>
+                            <w:proofErr w:type="spellEnd"/>
+                            <w:r>
+                              <w:rPr>
+                                <w:rFonts w:ascii="Roboto" w:eastAsiaTheme="minorHAnsi" w:hAnsi="Roboto" w:cs="Roboto"/>
+                                <w:color w:val="000000"/>
+                                <w:sz w:val="16"/>
+                                <w:szCs w:val="16"/>
+                              </w:rPr>
+                              <w:t>, Data Binding, View Binding</w:t>
                             </w:r>
                           </w:p>
                           <w:p>
@@ -1464,8 +1486,20 @@
                                 <w:szCs w:val="16"/>
                                 <w:lang w:bidi="bn-BD"/>
                               </w:rPr>
-                              <w:t>Technical University of the Enghelab</w:t>
-                            </w:r>
+                              <w:t xml:space="preserve">Technical University of the </w:t>
+                            </w:r>
+                            <w:proofErr w:type="spellStart"/>
+                            <w:r>
+                              <w:rPr>
+                                <w:rFonts w:ascii="Roboto" w:hAnsi="Roboto" w:cs="Roboto"/>
+                                <w:color w:val="000000"/>
+                                <w:sz w:val="16"/>
+                                <w:szCs w:val="16"/>
+                                <w:lang w:bidi="bn-BD"/>
+                              </w:rPr>
+                              <w:t>Enghelab</w:t>
+                            </w:r>
+                            <w:proofErr w:type="spellEnd"/>
                             <w:r>
                               <w:rPr>
                                 <w:rFonts w:ascii="Roboto" w:hAnsi="Roboto" w:cs="Roboto"/>
@@ -1877,6 +1911,7 @@
                                 <w:lang w:val="fr-FR"/>
                               </w:rPr>
                             </w:pPr>
+                            <w:proofErr w:type="spellStart"/>
                             <w:r>
                               <w:rPr>
                                 <w:rFonts w:ascii="Inter" w:hAnsi="Inter" w:cs="Arial"/>
@@ -1888,6 +1923,7 @@
                               </w:rPr>
                               <w:t>Skills</w:t>
                             </w:r>
+                            <w:proofErr w:type="spellEnd"/>
                             <w:r>
                               <w:rPr>
                                 <w:rFonts w:ascii="Inter" w:hAnsi="Inter" w:cs="Arial" w:hint="cs"/>
@@ -1920,7 +1956,31 @@
                                 <w:szCs w:val="18"/>
                                 <w:lang w:val="fr-FR"/>
                               </w:rPr>
-                              <w:t>Git, Firebase, QR Scanner</w:t>
+                              <w:t xml:space="preserve">Git, </w:t>
+                            </w:r>
+                            <w:proofErr w:type="spellStart"/>
+                            <w:r>
+                              <w:rPr>
+                                <w:rFonts w:ascii="Inter" w:hAnsi="Inter" w:cs="Arial"/>
+                                <w:color w:val="767171"/>
+                                <w:kern w:val="24"/>
+                                <w:sz w:val="18"/>
+                                <w:szCs w:val="18"/>
+                                <w:lang w:val="fr-FR"/>
+                              </w:rPr>
+                              <w:t>Firebase</w:t>
+                            </w:r>
+                            <w:proofErr w:type="spellEnd"/>
+                            <w:r>
+                              <w:rPr>
+                                <w:rFonts w:ascii="Inter" w:hAnsi="Inter" w:cs="Arial"/>
+                                <w:color w:val="767171"/>
+                                <w:kern w:val="24"/>
+                                <w:sz w:val="18"/>
+                                <w:szCs w:val="18"/>
+                                <w:lang w:val="fr-FR"/>
+                              </w:rPr>
+                              <w:t>, QR Scanner</w:t>
                             </w:r>
                           </w:p>
                           <w:p>
@@ -2549,7 +2609,7 @@
                             <w:r>
                               <w:t xml:space="preserve">Developed </w:t>
                             </w:r>
-                            <w:hyperlink r:id="rId5" w:history="1">
+                            <w:hyperlink r:id="rId7" w:history="1">
                               <w:r>
                                 <w:rPr>
                                   <w:rStyle w:val="Hyperlink"/>
@@ -2637,7 +2697,7 @@
                       <w:r>
                         <w:t xml:space="preserve">Developed </w:t>
                       </w:r>
-                      <w:hyperlink r:id="rId6" w:history="1">
+                      <w:hyperlink r:id="rId8" w:history="1">
                         <w:r>
                           <w:rPr>
                             <w:rStyle w:val="Hyperlink"/>
@@ -2938,6 +2998,7 @@
                                 <w:lang w:val="fr-FR"/>
                               </w:rPr>
                             </w:pPr>
+                            <w:proofErr w:type="spellStart"/>
                             <w:r>
                               <w:rPr>
                                 <w:rFonts w:ascii="Inter" w:hAnsi="Inter" w:cs="Arial"/>
@@ -2949,6 +3010,7 @@
                               </w:rPr>
                               <w:t>Skills</w:t>
                             </w:r>
+                            <w:proofErr w:type="spellEnd"/>
                             <w:r>
                               <w:rPr>
                                 <w:rFonts w:ascii="Inter" w:hAnsi="Inter" w:cs="Arial" w:hint="cs"/>
@@ -2970,8 +3032,9 @@
                                 <w:szCs w:val="18"/>
                                 <w:lang w:val="fr-FR"/>
                               </w:rPr>
-                              <w:t>: Kotlin,</w:t>
-                            </w:r>
+                              <w:t xml:space="preserve">: </w:t>
+                            </w:r>
+                            <w:proofErr w:type="spellStart"/>
                             <w:r>
                               <w:rPr>
                                 <w:rFonts w:ascii="Inter" w:hAnsi="Inter" w:cs="Arial"/>
@@ -2981,8 +3044,9 @@
                                 <w:szCs w:val="18"/>
                                 <w:lang w:val="fr-FR"/>
                               </w:rPr>
-                              <w:t xml:space="preserve"> </w:t>
-                            </w:r>
+                              <w:t>Kotlin</w:t>
+                            </w:r>
+                            <w:proofErr w:type="spellEnd"/>
                             <w:r>
                               <w:rPr>
                                 <w:rFonts w:ascii="Inter" w:hAnsi="Inter" w:cs="Arial"/>
@@ -2992,8 +3056,44 @@
                                 <w:szCs w:val="18"/>
                                 <w:lang w:val="fr-FR"/>
                               </w:rPr>
-                              <w:t xml:space="preserve">MapBox, Design Pattern, Open </w:t>
-                            </w:r>
+                              <w:t>,</w:t>
+                            </w:r>
+                            <w:r>
+                              <w:rPr>
+                                <w:rFonts w:ascii="Inter" w:hAnsi="Inter" w:cs="Arial"/>
+                                <w:color w:val="767171"/>
+                                <w:kern w:val="24"/>
+                                <w:sz w:val="18"/>
+                                <w:szCs w:val="18"/>
+                                <w:lang w:val="fr-FR"/>
+                              </w:rPr>
+                              <w:t xml:space="preserve"> </w:t>
+                            </w:r>
+                            <w:proofErr w:type="spellStart"/>
+                            <w:r>
+                              <w:rPr>
+                                <w:rFonts w:ascii="Inter" w:hAnsi="Inter" w:cs="Arial"/>
+                                <w:color w:val="767171"/>
+                                <w:kern w:val="24"/>
+                                <w:sz w:val="18"/>
+                                <w:szCs w:val="18"/>
+                                <w:lang w:val="fr-FR"/>
+                              </w:rPr>
+                              <w:t>MapBox</w:t>
+                            </w:r>
+                            <w:proofErr w:type="spellEnd"/>
+                            <w:r>
+                              <w:rPr>
+                                <w:rFonts w:ascii="Inter" w:hAnsi="Inter" w:cs="Arial"/>
+                                <w:color w:val="767171"/>
+                                <w:kern w:val="24"/>
+                                <w:sz w:val="18"/>
+                                <w:szCs w:val="18"/>
+                                <w:lang w:val="fr-FR"/>
+                              </w:rPr>
+                              <w:t xml:space="preserve">, Design Pattern, Open </w:t>
+                            </w:r>
+                            <w:proofErr w:type="spellStart"/>
                             <w:r>
                               <w:rPr>
                                 <w:rFonts w:ascii="Inter" w:hAnsi="Inter" w:cs="Arial" w:hint="cs"/>
@@ -3006,6 +3106,7 @@
                               </w:rPr>
                               <w:t>Street</w:t>
                             </w:r>
+                            <w:proofErr w:type="spellEnd"/>
                             <w:r>
                               <w:rPr>
                                 <w:rFonts w:ascii="Inter" w:hAnsi="Inter" w:cs="Arial"/>
@@ -3435,7 +3536,7 @@
                             <w:r>
                               <w:t xml:space="preserve">Designed and developed </w:t>
                             </w:r>
-                            <w:hyperlink r:id="rId7" w:history="1">
+                            <w:hyperlink r:id="rId9" w:history="1">
                               <w:r>
                                 <w:rPr>
                                   <w:rStyle w:val="Hyperlink"/>
@@ -3529,7 +3630,7 @@
                       <w:r>
                         <w:t xml:space="preserve">Designed and developed </w:t>
                       </w:r>
-                      <w:hyperlink r:id="rId8" w:history="1">
+                      <w:hyperlink r:id="rId10" w:history="1">
                         <w:r>
                           <w:rPr>
                             <w:rStyle w:val="Hyperlink"/>
@@ -3777,6 +3878,7 @@
                                 <w:lang w:val="fr-FR"/>
                               </w:rPr>
                             </w:pPr>
+                            <w:proofErr w:type="spellStart"/>
                             <w:r>
                               <w:rPr>
                                 <w:rFonts w:ascii="Inter" w:hAnsi="Inter" w:cs="Arial"/>
@@ -3788,6 +3890,7 @@
                               </w:rPr>
                               <w:t>Skills</w:t>
                             </w:r>
+                            <w:proofErr w:type="spellEnd"/>
                             <w:r>
                               <w:rPr>
                                 <w:rFonts w:ascii="Inter" w:hAnsi="Inter" w:cs="Arial" w:hint="cs"/>
@@ -4253,7 +4356,7 @@
                               </w:rPr>
                               <w:t xml:space="preserve">Created </w:t>
                             </w:r>
-                            <w:hyperlink r:id="rId9" w:history="1">
+                            <w:hyperlink r:id="rId11" w:history="1">
                               <w:r>
                                 <w:rPr>
                                   <w:rStyle w:val="Hyperlink"/>
@@ -4377,7 +4480,7 @@
                         </w:rPr>
                         <w:t xml:space="preserve">Created </w:t>
                       </w:r>
-                      <w:hyperlink r:id="rId10" w:history="1">
+                      <w:hyperlink r:id="rId12" w:history="1">
                         <w:r>
                           <w:rPr>
                             <w:rStyle w:val="Hyperlink"/>
@@ -4549,7 +4652,7 @@
                               </w:rPr>
                               <w:t xml:space="preserve"> </w:t>
                             </w:r>
-                            <w:hyperlink r:id="rId11" w:history="1">
+                            <w:hyperlink r:id="rId13" w:history="1">
                               <w:r>
                                 <w:rPr>
                                   <w:rStyle w:val="Hyperlink"/>
@@ -4642,7 +4745,30 @@
                                 <w:szCs w:val="16"/>
                                 <w:lang w:bidi="bn-BD"/>
                               </w:rPr>
-                              <w:t>Developed Aaniro, a highway toll payment app using Compose and Material 3 libraries for a company with 1M+ active web users.</w:t>
+                              <w:t xml:space="preserve">Developed </w:t>
+                            </w:r>
+                            <w:hyperlink r:id="rId14" w:history="1">
+                              <w:r>
+                                <w:rPr>
+                                  <w:rStyle w:val="Hyperlink"/>
+                                  <w:rFonts w:ascii="Roboto" w:hAnsi="Roboto" w:cs="Roboto"/>
+                                  <w:color w:val="000000" w:themeColor="text1"/>
+                                  <w:sz w:val="16"/>
+                                  <w:szCs w:val="16"/>
+                                  <w:lang w:bidi="bn-BD"/>
+                                </w:rPr>
+                                <w:t>Aaniro</w:t>
+                              </w:r>
+                            </w:hyperlink>
+                            <w:r>
+                              <w:rPr>
+                                <w:rFonts w:ascii="Roboto" w:hAnsi="Roboto" w:cs="Roboto"/>
+                                <w:color w:val="000000"/>
+                                <w:sz w:val="16"/>
+                                <w:szCs w:val="16"/>
+                                <w:lang w:bidi="bn-BD"/>
+                              </w:rPr>
+                              <w:t>, a highway toll payment app using Compose and Material 3 libraries for a company with 1M+ active web users.</w:t>
                             </w:r>
                           </w:p>
                           <w:p>
@@ -4789,7 +4915,7 @@
                         </w:rPr>
                         <w:t xml:space="preserve"> </w:t>
                       </w:r>
-                      <w:hyperlink r:id="rId12" w:history="1">
+                      <w:hyperlink r:id="rId15" w:history="1">
                         <w:r>
                           <w:rPr>
                             <w:rStyle w:val="Hyperlink"/>
@@ -4882,7 +5008,30 @@
                           <w:szCs w:val="16"/>
                           <w:lang w:bidi="bn-BD"/>
                         </w:rPr>
-                        <w:t>Developed Aaniro, a highway toll payment app using Compose and Material 3 libraries for a company with 1M+ active web users.</w:t>
+                        <w:t xml:space="preserve">Developed </w:t>
+                      </w:r>
+                      <w:hyperlink r:id="rId16" w:history="1">
+                        <w:r>
+                          <w:rPr>
+                            <w:rStyle w:val="Hyperlink"/>
+                            <w:rFonts w:ascii="Roboto" w:hAnsi="Roboto" w:cs="Roboto"/>
+                            <w:color w:val="000000" w:themeColor="text1"/>
+                            <w:sz w:val="16"/>
+                            <w:szCs w:val="16"/>
+                            <w:lang w:bidi="bn-BD"/>
+                          </w:rPr>
+                          <w:t>Aaniro</w:t>
+                        </w:r>
+                      </w:hyperlink>
+                      <w:r>
+                        <w:rPr>
+                          <w:rFonts w:ascii="Roboto" w:hAnsi="Roboto" w:cs="Roboto"/>
+                          <w:color w:val="000000"/>
+                          <w:sz w:val="16"/>
+                          <w:szCs w:val="16"/>
+                          <w:lang w:bidi="bn-BD"/>
+                        </w:rPr>
+                        <w:t>, a highway toll payment app using Compose and Material 3 libraries for a company with 1M+ active web users.</w:t>
                       </w:r>
                     </w:p>
                     <w:p>
@@ -5032,7 +5181,7 @@
                                 <w:szCs w:val="22"/>
                               </w:rPr>
                             </w:pPr>
-                            <w:hyperlink r:id="rId13" w:history="1">
+                            <w:hyperlink r:id="rId17" w:history="1">
                               <w:r>
                                 <w:rPr>
                                   <w:rStyle w:val="Hyperlink"/>
@@ -5041,7 +5190,18 @@
                                   <w:sz w:val="22"/>
                                   <w:szCs w:val="22"/>
                                 </w:rPr>
-                                <w:t>linkedin.com/in/malihe</w:t>
+                                <w:t>linkedin.com/in/</w:t>
+                              </w:r>
+                              <w:proofErr w:type="spellStart"/>
+                              <w:r>
+                                <w:rPr>
+                                  <w:rStyle w:val="Hyperlink"/>
+                                  <w:rFonts w:ascii="Inter" w:hAnsi="Inter"/>
+                                  <w:color w:val="000000"/>
+                                  <w:sz w:val="22"/>
+                                  <w:szCs w:val="22"/>
+                                </w:rPr>
+                                <w:t>malihe</w:t>
                               </w:r>
                               <w:r>
                                 <w:rPr>
@@ -5063,6 +5223,7 @@
                                 </w:rPr>
                                 <w:t>moradi</w:t>
                               </w:r>
+                              <w:proofErr w:type="spellEnd"/>
                             </w:hyperlink>
                           </w:p>
                         </w:txbxContent>
@@ -5836,6 +5997,7 @@
                                 <w:lang w:val="fr-FR"/>
                               </w:rPr>
                             </w:pPr>
+                            <w:proofErr w:type="spellStart"/>
                             <w:r>
                               <w:rPr>
                                 <w:rFonts w:ascii="Inter" w:hAnsi="Inter" w:cs="Arial"/>
@@ -5847,6 +6009,7 @@
                               </w:rPr>
                               <w:t>Skills</w:t>
                             </w:r>
+                            <w:proofErr w:type="spellEnd"/>
                             <w:r>
                               <w:rPr>
                                 <w:rFonts w:ascii="Inter" w:hAnsi="Inter" w:cs="Arial" w:hint="cs"/>
@@ -7352,6 +7515,56 @@
     </w:sectPr>
   </w:body>
 </w:document>
+</file>
+
+<file path=word/endnotes.xml><?xml version="1.0" encoding="utf-8"?>
+<w:endnotes xmlns:wpc="http://schemas.microsoft.com/office/word/2010/wordprocessingCanvas" xmlns:cx="http://schemas.microsoft.com/office/drawing/2014/chartex" xmlns:cx1="http://schemas.microsoft.com/office/drawing/2015/9/8/chartex" xmlns:cx2="http://schemas.microsoft.com/office/drawing/2015/10/21/chartex" xmlns:cx3="http://schemas.microsoft.com/office/drawing/2016/5/9/chartex" xmlns:cx4="http://schemas.microsoft.com/office/drawing/2016/5/10/chartex" xmlns:cx5="http://schemas.microsoft.com/office/drawing/2016/5/11/chartex" xmlns:cx6="http://schemas.microsoft.com/office/drawing/2016/5/12/chartex" xmlns:cx7="http://schemas.microsoft.com/office/drawing/2016/5/13/chartex" xmlns:cx8="http://schemas.microsoft.com/office/drawing/2016/5/14/chartex" xmlns:mc="http://schemas.openxmlformats.org/markup-compatibility/2006" xmlns:aink="http://schemas.microsoft.com/office/drawing/2016/ink" xmlns:am3d="http://schemas.microsoft.com/office/drawing/2017/model3d" xmlns:o="urn:schemas-microsoft-com:office:office" xmlns:oel="http://schemas.microsoft.com/office/2019/extlst" xmlns:r="http://schemas.openxmlformats.org/officeDocument/2006/relationships" xmlns:m="http://schemas.openxmlformats.org/officeDocument/2006/math" xmlns:v="urn:schemas-microsoft-com:vml" xmlns:wp14="http://schemas.microsoft.com/office/word/2010/wordprocessingDrawing" xmlns:wp="http://schemas.openxmlformats.org/drawingml/2006/wordprocessingDrawing" xmlns:w10="urn:schemas-microsoft-com:office:word" xmlns:w="http://schemas.openxmlformats.org/wordprocessingml/2006/main" xmlns:w14="http://schemas.microsoft.com/office/word/2010/wordml" xmlns:w15="http://schemas.microsoft.com/office/word/2012/wordml" xmlns:w16cex="http://schemas.microsoft.com/office/word/2018/wordml/cex" xmlns:w16cid="http://schemas.microsoft.com/office/word/2016/wordml/cid" xmlns:w16="http://schemas.microsoft.com/office/word/2018/wordml" xmlns:w16sdtdh="http://schemas.microsoft.com/office/word/2020/wordml/sdtdatahash" xmlns:w16se="http://schemas.microsoft.com/office/word/2015/wordml/symex" xmlns:wpg="http://schemas.microsoft.com/office/word/2010/wordprocessingGroup" xmlns:wpi="http://schemas.microsoft.com/office/word/2010/wordprocessingInk" xmlns:wne="http://schemas.microsoft.com/office/word/2006/wordml" xmlns:wps="http://schemas.microsoft.com/office/word/2010/wordprocessingShape" mc:Ignorable="w14 w15 w16se w16cid w16 w16cex w16sdtdh wp14">
+  <w:endnote w:type="separator" w:id="-1">
+    <w:p>
+      <w:pPr>
+        <w:spacing w:after="0" w:line="240" w:lineRule="auto"/>
+      </w:pPr>
+      <w:r>
+        <w:separator/>
+      </w:r>
+    </w:p>
+  </w:endnote>
+  <w:endnote w:type="continuationSeparator" w:id="0">
+    <w:p>
+      <w:pPr>
+        <w:spacing w:after="0" w:line="240" w:lineRule="auto"/>
+      </w:pPr>
+      <w:r>
+        <w:continuationSeparator/>
+      </w:r>
+    </w:p>
+  </w:endnote>
+</w:endnotes>
+</file>
+
+<file path=word/footnotes.xml><?xml version="1.0" encoding="utf-8"?>
+<w:footnotes xmlns:wpc="http://schemas.microsoft.com/office/word/2010/wordprocessingCanvas" xmlns:cx="http://schemas.microsoft.com/office/drawing/2014/chartex" xmlns:cx1="http://schemas.microsoft.com/office/drawing/2015/9/8/chartex" xmlns:cx2="http://schemas.microsoft.com/office/drawing/2015/10/21/chartex" xmlns:cx3="http://schemas.microsoft.com/office/drawing/2016/5/9/chartex" xmlns:cx4="http://schemas.microsoft.com/office/drawing/2016/5/10/chartex" xmlns:cx5="http://schemas.microsoft.com/office/drawing/2016/5/11/chartex" xmlns:cx6="http://schemas.microsoft.com/office/drawing/2016/5/12/chartex" xmlns:cx7="http://schemas.microsoft.com/office/drawing/2016/5/13/chartex" xmlns:cx8="http://schemas.microsoft.com/office/drawing/2016/5/14/chartex" xmlns:mc="http://schemas.openxmlformats.org/markup-compatibility/2006" xmlns:aink="http://schemas.microsoft.com/office/drawing/2016/ink" xmlns:am3d="http://schemas.microsoft.com/office/drawing/2017/model3d" xmlns:o="urn:schemas-microsoft-com:office:office" xmlns:oel="http://schemas.microsoft.com/office/2019/extlst" xmlns:r="http://schemas.openxmlformats.org/officeDocument/2006/relationships" xmlns:m="http://schemas.openxmlformats.org/officeDocument/2006/math" xmlns:v="urn:schemas-microsoft-com:vml" xmlns:wp14="http://schemas.microsoft.com/office/word/2010/wordprocessingDrawing" xmlns:wp="http://schemas.openxmlformats.org/drawingml/2006/wordprocessingDrawing" xmlns:w10="urn:schemas-microsoft-com:office:word" xmlns:w="http://schemas.openxmlformats.org/wordprocessingml/2006/main" xmlns:w14="http://schemas.microsoft.com/office/word/2010/wordml" xmlns:w15="http://schemas.microsoft.com/office/word/2012/wordml" xmlns:w16cex="http://schemas.microsoft.com/office/word/2018/wordml/cex" xmlns:w16cid="http://schemas.microsoft.com/office/word/2016/wordml/cid" xmlns:w16="http://schemas.microsoft.com/office/word/2018/wordml" xmlns:w16sdtdh="http://schemas.microsoft.com/office/word/2020/wordml/sdtdatahash" xmlns:w16se="http://schemas.microsoft.com/office/word/2015/wordml/symex" xmlns:wpg="http://schemas.microsoft.com/office/word/2010/wordprocessingGroup" xmlns:wpi="http://schemas.microsoft.com/office/word/2010/wordprocessingInk" xmlns:wne="http://schemas.microsoft.com/office/word/2006/wordml" xmlns:wps="http://schemas.microsoft.com/office/word/2010/wordprocessingShape" mc:Ignorable="w14 w15 w16se w16cid w16 w16cex w16sdtdh wp14">
+  <w:footnote w:type="separator" w:id="-1">
+    <w:p>
+      <w:pPr>
+        <w:spacing w:after="0" w:line="240" w:lineRule="auto"/>
+      </w:pPr>
+      <w:r>
+        <w:separator/>
+      </w:r>
+    </w:p>
+  </w:footnote>
+  <w:footnote w:type="continuationSeparator" w:id="0">
+    <w:p>
+      <w:pPr>
+        <w:spacing w:after="0" w:line="240" w:lineRule="auto"/>
+      </w:pPr>
+      <w:r>
+        <w:continuationSeparator/>
+      </w:r>
+    </w:p>
+  </w:footnote>
+</w:footnotes>
 </file>
 
 <file path=word/numbering.xml><?xml version="1.0" encoding="utf-8"?>
@@ -9251,6 +9464,50 @@
       <w:lang w:val="en-TR"/>
     </w:rPr>
   </w:style>
+  <w:style w:type="paragraph" w:styleId="Header">
+    <w:name w:val="header"/>
+    <w:basedOn w:val="Normal"/>
+    <w:link w:val="HeaderChar"/>
+    <w:uiPriority w:val="99"/>
+    <w:unhideWhenUsed/>
+    <w:rsid w:val="003A59B1"/>
+    <w:pPr>
+      <w:tabs>
+        <w:tab w:val="center" w:pos="4680"/>
+        <w:tab w:val="right" w:pos="9360"/>
+      </w:tabs>
+      <w:spacing w:after="0" w:line="240" w:lineRule="auto"/>
+    </w:pPr>
+  </w:style>
+  <w:style w:type="character" w:customStyle="1" w:styleId="HeaderChar">
+    <w:name w:val="Header Char"/>
+    <w:basedOn w:val="DefaultParagraphFont"/>
+    <w:link w:val="Header"/>
+    <w:uiPriority w:val="99"/>
+    <w:rsid w:val="003A59B1"/>
+  </w:style>
+  <w:style w:type="paragraph" w:styleId="Footer">
+    <w:name w:val="footer"/>
+    <w:basedOn w:val="Normal"/>
+    <w:link w:val="FooterChar"/>
+    <w:uiPriority w:val="99"/>
+    <w:unhideWhenUsed/>
+    <w:rsid w:val="003A59B1"/>
+    <w:pPr>
+      <w:tabs>
+        <w:tab w:val="center" w:pos="4680"/>
+        <w:tab w:val="right" w:pos="9360"/>
+      </w:tabs>
+      <w:spacing w:after="0" w:line="240" w:lineRule="auto"/>
+    </w:pPr>
+  </w:style>
+  <w:style w:type="character" w:customStyle="1" w:styleId="FooterChar">
+    <w:name w:val="Footer Char"/>
+    <w:basedOn w:val="DefaultParagraphFont"/>
+    <w:link w:val="Footer"/>
+    <w:uiPriority w:val="99"/>
+    <w:rsid w:val="003A59B1"/>
+  </w:style>
 </w:styles>
 </file>
 

</xml_diff>